<commit_message>
docs: Concurrency & Performance document with diagrams; documentation tools
- docs/concurrency/CONCURRENCY.md + TA9-Concurrency-Performance.docx:
  requirement in numbers, chosen method (bounded producer/consumer, two-level
  parallelism, backpressure; optimistic concurrency, leases and bounded fan-out
  in the Job Service), advantages, alternatives considered, limitations,
  configuration, improvements and verification evidence
- draw.io: pages 7 (Concurrency - Processor) and 8 (Concurrency - Job Service)
- tools/docs: draw.io renderer and Markdown-to-Word converter with npm scripts
  for every document, so images and .docx files can be regenerated
- HLD links to the concurrency document; HLD.docx rebuilt

Co-Authored-By: Claude Opus 5.5 <noreply@anthropic.com>
</commit_message>
<xml_diff>
--- a/docs/hld/TA9-HLD.docx
+++ b/docs/hld/TA9-HLD.docx
@@ -45,8 +45,8 @@
         </w:tblBorders>
       </w:tblPr>
       <w:tblGrid>
-        <w:gridCol w:w="1927"/>
-        <w:gridCol w:w="7711"/>
+        <w:gridCol w:w="2628"/>
+        <w:gridCol w:w="7010"/>
       </w:tblGrid>
       <w:tr>
         <w:trPr>
@@ -54,7 +54,7 @@
         </w:trPr>
         <w:tc>
           <w:tcPr>
-            <w:tcW w:type="dxa" w:w="1927"/>
+            <w:tcW w:type="dxa" w:w="2628"/>
             <w:tcBorders>
               <w:top w:val="single" w:color="BFBFBF" w:sz="4"/>
               <w:left w:val="single" w:color="BFBFBF" w:sz="4"/>
@@ -84,7 +84,7 @@
         </w:tc>
         <w:tc>
           <w:tcPr>
-            <w:tcW w:type="dxa" w:w="7711"/>
+            <w:tcW w:type="dxa" w:w="7010"/>
             <w:tcBorders>
               <w:top w:val="single" w:color="BFBFBF" w:sz="4"/>
               <w:left w:val="single" w:color="BFBFBF" w:sz="4"/>
@@ -116,7 +116,7 @@
       <w:tr>
         <w:tc>
           <w:tcPr>
-            <w:tcW w:type="dxa" w:w="1927"/>
+            <w:tcW w:type="dxa" w:w="2628"/>
             <w:tcBorders>
               <w:top w:val="single" w:color="BFBFBF" w:sz="4"/>
               <w:left w:val="single" w:color="BFBFBF" w:sz="4"/>
@@ -145,7 +145,7 @@
         </w:tc>
         <w:tc>
           <w:tcPr>
-            <w:tcW w:type="dxa" w:w="7711"/>
+            <w:tcW w:type="dxa" w:w="7010"/>
             <w:tcBorders>
               <w:top w:val="single" w:color="BFBFBF" w:sz="4"/>
               <w:left w:val="single" w:color="BFBFBF" w:sz="4"/>
@@ -174,7 +174,7 @@
       <w:tr>
         <w:tc>
           <w:tcPr>
-            <w:tcW w:type="dxa" w:w="1927"/>
+            <w:tcW w:type="dxa" w:w="2628"/>
             <w:tcBorders>
               <w:top w:val="single" w:color="BFBFBF" w:sz="4"/>
               <w:left w:val="single" w:color="BFBFBF" w:sz="4"/>
@@ -203,7 +203,7 @@
         </w:tc>
         <w:tc>
           <w:tcPr>
-            <w:tcW w:type="dxa" w:w="7711"/>
+            <w:tcW w:type="dxa" w:w="7010"/>
             <w:tcBorders>
               <w:top w:val="single" w:color="BFBFBF" w:sz="4"/>
               <w:left w:val="single" w:color="BFBFBF" w:sz="4"/>
@@ -232,7 +232,7 @@
       <w:tr>
         <w:tc>
           <w:tcPr>
-            <w:tcW w:type="dxa" w:w="1927"/>
+            <w:tcW w:type="dxa" w:w="2628"/>
             <w:tcBorders>
               <w:top w:val="single" w:color="BFBFBF" w:sz="4"/>
               <w:left w:val="single" w:color="BFBFBF" w:sz="4"/>
@@ -261,7 +261,7 @@
         </w:tc>
         <w:tc>
           <w:tcPr>
-            <w:tcW w:type="dxa" w:w="7711"/>
+            <w:tcW w:type="dxa" w:w="7010"/>
             <w:tcBorders>
               <w:top w:val="single" w:color="BFBFBF" w:sz="4"/>
               <w:left w:val="single" w:color="BFBFBF" w:sz="4"/>
@@ -302,7 +302,7 @@
               </w:rPr>
               <w:t xml:space="preserve"> (one page per diagram). Open with </w:t>
             </w:r>
-            <w:hyperlink w:history="1" r:id="rIdbtmuykzucopot1aemifav">
+            <w:hyperlink w:history="1" r:id="rIdwq1bsw5cb62moxfqk2ur3">
               <w:r>
                 <w:rPr>
                   <w:rFonts w:ascii="Calibri" w:cs="Calibri" w:eastAsia="Calibri" w:hAnsi="Calibri"/>
@@ -356,7 +356,7 @@
       <w:tr>
         <w:tc>
           <w:tcPr>
-            <w:tcW w:type="dxa" w:w="1927"/>
+            <w:tcW w:type="dxa" w:w="2628"/>
             <w:tcBorders>
               <w:top w:val="single" w:color="BFBFBF" w:sz="4"/>
               <w:left w:val="single" w:color="BFBFBF" w:sz="4"/>
@@ -385,7 +385,7 @@
         </w:tc>
         <w:tc>
           <w:tcPr>
-            <w:tcW w:type="dxa" w:w="7711"/>
+            <w:tcW w:type="dxa" w:w="7010"/>
             <w:tcBorders>
               <w:top w:val="single" w:color="BFBFBF" w:sz="4"/>
               <w:left w:val="single" w:color="BFBFBF" w:sz="4"/>
@@ -1596,9 +1596,9 @@
         </w:tblBorders>
       </w:tblPr>
       <w:tblGrid>
-        <w:gridCol w:w="942"/>
-        <w:gridCol w:w="4347"/>
-        <w:gridCol w:w="4349"/>
+        <w:gridCol w:w="1347"/>
+        <w:gridCol w:w="4145"/>
+        <w:gridCol w:w="4146"/>
       </w:tblGrid>
       <w:tr>
         <w:trPr>
@@ -1606,7 +1606,7 @@
         </w:trPr>
         <w:tc>
           <w:tcPr>
-            <w:tcW w:type="dxa" w:w="942"/>
+            <w:tcW w:type="dxa" w:w="1347"/>
             <w:tcBorders>
               <w:top w:val="single" w:color="BFBFBF" w:sz="4"/>
               <w:left w:val="single" w:color="BFBFBF" w:sz="4"/>
@@ -1636,7 +1636,7 @@
         </w:tc>
         <w:tc>
           <w:tcPr>
-            <w:tcW w:type="dxa" w:w="4347"/>
+            <w:tcW w:type="dxa" w:w="4145"/>
             <w:tcBorders>
               <w:top w:val="single" w:color="BFBFBF" w:sz="4"/>
               <w:left w:val="single" w:color="BFBFBF" w:sz="4"/>
@@ -1666,7 +1666,7 @@
         </w:tc>
         <w:tc>
           <w:tcPr>
-            <w:tcW w:type="dxa" w:w="4349"/>
+            <w:tcW w:type="dxa" w:w="4146"/>
             <w:tcBorders>
               <w:top w:val="single" w:color="BFBFBF" w:sz="4"/>
               <w:left w:val="single" w:color="BFBFBF" w:sz="4"/>
@@ -1698,7 +1698,7 @@
       <w:tr>
         <w:tc>
           <w:tcPr>
-            <w:tcW w:type="dxa" w:w="942"/>
+            <w:tcW w:type="dxa" w:w="1347"/>
             <w:tcBorders>
               <w:top w:val="single" w:color="BFBFBF" w:sz="4"/>
               <w:left w:val="single" w:color="BFBFBF" w:sz="4"/>
@@ -1725,7 +1725,7 @@
         </w:tc>
         <w:tc>
           <w:tcPr>
-            <w:tcW w:type="dxa" w:w="4347"/>
+            <w:tcW w:type="dxa" w:w="4145"/>
             <w:tcBorders>
               <w:top w:val="single" w:color="BFBFBF" w:sz="4"/>
               <w:left w:val="single" w:color="BFBFBF" w:sz="4"/>
@@ -1752,7 +1752,7 @@
         </w:tc>
         <w:tc>
           <w:tcPr>
-            <w:tcW w:type="dxa" w:w="4349"/>
+            <w:tcW w:type="dxa" w:w="4146"/>
             <w:tcBorders>
               <w:top w:val="single" w:color="BFBFBF" w:sz="4"/>
               <w:left w:val="single" w:color="BFBFBF" w:sz="4"/>
@@ -1816,7 +1816,7 @@
       <w:tr>
         <w:tc>
           <w:tcPr>
-            <w:tcW w:type="dxa" w:w="942"/>
+            <w:tcW w:type="dxa" w:w="1347"/>
             <w:tcBorders>
               <w:top w:val="single" w:color="BFBFBF" w:sz="4"/>
               <w:left w:val="single" w:color="BFBFBF" w:sz="4"/>
@@ -1843,7 +1843,7 @@
         </w:tc>
         <w:tc>
           <w:tcPr>
-            <w:tcW w:type="dxa" w:w="4347"/>
+            <w:tcW w:type="dxa" w:w="4145"/>
             <w:tcBorders>
               <w:top w:val="single" w:color="BFBFBF" w:sz="4"/>
               <w:left w:val="single" w:color="BFBFBF" w:sz="4"/>
@@ -1888,7 +1888,7 @@
         </w:tc>
         <w:tc>
           <w:tcPr>
-            <w:tcW w:type="dxa" w:w="4349"/>
+            <w:tcW w:type="dxa" w:w="4146"/>
             <w:tcBorders>
               <w:top w:val="single" w:color="BFBFBF" w:sz="4"/>
               <w:left w:val="single" w:color="BFBFBF" w:sz="4"/>
@@ -1917,7 +1917,7 @@
       <w:tr>
         <w:tc>
           <w:tcPr>
-            <w:tcW w:type="dxa" w:w="942"/>
+            <w:tcW w:type="dxa" w:w="1347"/>
             <w:tcBorders>
               <w:top w:val="single" w:color="BFBFBF" w:sz="4"/>
               <w:left w:val="single" w:color="BFBFBF" w:sz="4"/>
@@ -1944,7 +1944,7 @@
         </w:tc>
         <w:tc>
           <w:tcPr>
-            <w:tcW w:type="dxa" w:w="4347"/>
+            <w:tcW w:type="dxa" w:w="4145"/>
             <w:tcBorders>
               <w:top w:val="single" w:color="BFBFBF" w:sz="4"/>
               <w:left w:val="single" w:color="BFBFBF" w:sz="4"/>
@@ -1971,7 +1971,7 @@
         </w:tc>
         <w:tc>
           <w:tcPr>
-            <w:tcW w:type="dxa" w:w="4349"/>
+            <w:tcW w:type="dxa" w:w="4146"/>
             <w:tcBorders>
               <w:top w:val="single" w:color="BFBFBF" w:sz="4"/>
               <w:left w:val="single" w:color="BFBFBF" w:sz="4"/>
@@ -2000,7 +2000,7 @@
       <w:tr>
         <w:tc>
           <w:tcPr>
-            <w:tcW w:type="dxa" w:w="942"/>
+            <w:tcW w:type="dxa" w:w="1347"/>
             <w:tcBorders>
               <w:top w:val="single" w:color="BFBFBF" w:sz="4"/>
               <w:left w:val="single" w:color="BFBFBF" w:sz="4"/>
@@ -2027,7 +2027,7 @@
         </w:tc>
         <w:tc>
           <w:tcPr>
-            <w:tcW w:type="dxa" w:w="4347"/>
+            <w:tcW w:type="dxa" w:w="4145"/>
             <w:tcBorders>
               <w:top w:val="single" w:color="BFBFBF" w:sz="4"/>
               <w:left w:val="single" w:color="BFBFBF" w:sz="4"/>
@@ -2054,7 +2054,7 @@
         </w:tc>
         <w:tc>
           <w:tcPr>
-            <w:tcW w:type="dxa" w:w="4349"/>
+            <w:tcW w:type="dxa" w:w="4146"/>
             <w:tcBorders>
               <w:top w:val="single" w:color="BFBFBF" w:sz="4"/>
               <w:left w:val="single" w:color="BFBFBF" w:sz="4"/>
@@ -2083,7 +2083,7 @@
       <w:tr>
         <w:tc>
           <w:tcPr>
-            <w:tcW w:type="dxa" w:w="942"/>
+            <w:tcW w:type="dxa" w:w="1347"/>
             <w:tcBorders>
               <w:top w:val="single" w:color="BFBFBF" w:sz="4"/>
               <w:left w:val="single" w:color="BFBFBF" w:sz="4"/>
@@ -2110,7 +2110,7 @@
         </w:tc>
         <w:tc>
           <w:tcPr>
-            <w:tcW w:type="dxa" w:w="4347"/>
+            <w:tcW w:type="dxa" w:w="4145"/>
             <w:tcBorders>
               <w:top w:val="single" w:color="BFBFBF" w:sz="4"/>
               <w:left w:val="single" w:color="BFBFBF" w:sz="4"/>
@@ -2137,7 +2137,7 @@
         </w:tc>
         <w:tc>
           <w:tcPr>
-            <w:tcW w:type="dxa" w:w="4349"/>
+            <w:tcW w:type="dxa" w:w="4146"/>
             <w:tcBorders>
               <w:top w:val="single" w:color="BFBFBF" w:sz="4"/>
               <w:left w:val="single" w:color="BFBFBF" w:sz="4"/>
@@ -2166,7 +2166,7 @@
       <w:tr>
         <w:tc>
           <w:tcPr>
-            <w:tcW w:type="dxa" w:w="942"/>
+            <w:tcW w:type="dxa" w:w="1347"/>
             <w:tcBorders>
               <w:top w:val="single" w:color="BFBFBF" w:sz="4"/>
               <w:left w:val="single" w:color="BFBFBF" w:sz="4"/>
@@ -2193,7 +2193,7 @@
         </w:tc>
         <w:tc>
           <w:tcPr>
-            <w:tcW w:type="dxa" w:w="4347"/>
+            <w:tcW w:type="dxa" w:w="4145"/>
             <w:tcBorders>
               <w:top w:val="single" w:color="BFBFBF" w:sz="4"/>
               <w:left w:val="single" w:color="BFBFBF" w:sz="4"/>
@@ -2220,7 +2220,7 @@
         </w:tc>
         <w:tc>
           <w:tcPr>
-            <w:tcW w:type="dxa" w:w="4349"/>
+            <w:tcW w:type="dxa" w:w="4146"/>
             <w:tcBorders>
               <w:top w:val="single" w:color="BFBFBF" w:sz="4"/>
               <w:left w:val="single" w:color="BFBFBF" w:sz="4"/>
@@ -2407,10 +2407,10 @@
         </w:tblBorders>
       </w:tblPr>
       <w:tblGrid>
-        <w:gridCol w:w="1363"/>
-        <w:gridCol w:w="2820"/>
-        <w:gridCol w:w="2632"/>
-        <w:gridCol w:w="2823"/>
+        <w:gridCol w:w="1875"/>
+        <w:gridCol w:w="2587"/>
+        <w:gridCol w:w="2587"/>
+        <w:gridCol w:w="2589"/>
       </w:tblGrid>
       <w:tr>
         <w:trPr>
@@ -2418,7 +2418,7 @@
         </w:trPr>
         <w:tc>
           <w:tcPr>
-            <w:tcW w:type="dxa" w:w="1363"/>
+            <w:tcW w:type="dxa" w:w="1875"/>
             <w:tcBorders>
               <w:top w:val="single" w:color="BFBFBF" w:sz="4"/>
               <w:left w:val="single" w:color="BFBFBF" w:sz="4"/>
@@ -2448,7 +2448,7 @@
         </w:tc>
         <w:tc>
           <w:tcPr>
-            <w:tcW w:type="dxa" w:w="2820"/>
+            <w:tcW w:type="dxa" w:w="2587"/>
             <w:tcBorders>
               <w:top w:val="single" w:color="BFBFBF" w:sz="4"/>
               <w:left w:val="single" w:color="BFBFBF" w:sz="4"/>
@@ -2478,7 +2478,7 @@
         </w:tc>
         <w:tc>
           <w:tcPr>
-            <w:tcW w:type="dxa" w:w="2632"/>
+            <w:tcW w:type="dxa" w:w="2587"/>
             <w:tcBorders>
               <w:top w:val="single" w:color="BFBFBF" w:sz="4"/>
               <w:left w:val="single" w:color="BFBFBF" w:sz="4"/>
@@ -2508,7 +2508,7 @@
         </w:tc>
         <w:tc>
           <w:tcPr>
-            <w:tcW w:type="dxa" w:w="2823"/>
+            <w:tcW w:type="dxa" w:w="2589"/>
             <w:tcBorders>
               <w:top w:val="single" w:color="BFBFBF" w:sz="4"/>
               <w:left w:val="single" w:color="BFBFBF" w:sz="4"/>
@@ -2540,7 +2540,7 @@
       <w:tr>
         <w:tc>
           <w:tcPr>
-            <w:tcW w:type="dxa" w:w="1363"/>
+            <w:tcW w:type="dxa" w:w="1875"/>
             <w:tcBorders>
               <w:top w:val="single" w:color="BFBFBF" w:sz="4"/>
               <w:left w:val="single" w:color="BFBFBF" w:sz="4"/>
@@ -2569,7 +2569,7 @@
         </w:tc>
         <w:tc>
           <w:tcPr>
-            <w:tcW w:type="dxa" w:w="2820"/>
+            <w:tcW w:type="dxa" w:w="2587"/>
             <w:tcBorders>
               <w:top w:val="single" w:color="BFBFBF" w:sz="4"/>
               <w:left w:val="single" w:color="BFBFBF" w:sz="4"/>
@@ -2614,7 +2614,7 @@
         </w:tc>
         <w:tc>
           <w:tcPr>
-            <w:tcW w:type="dxa" w:w="2632"/>
+            <w:tcW w:type="dxa" w:w="2587"/>
             <w:tcBorders>
               <w:top w:val="single" w:color="BFBFBF" w:sz="4"/>
               <w:left w:val="single" w:color="BFBFBF" w:sz="4"/>
@@ -2692,7 +2692,7 @@
         </w:tc>
         <w:tc>
           <w:tcPr>
-            <w:tcW w:type="dxa" w:w="2823"/>
+            <w:tcW w:type="dxa" w:w="2589"/>
             <w:tcBorders>
               <w:top w:val="single" w:color="BFBFBF" w:sz="4"/>
               <w:left w:val="single" w:color="BFBFBF" w:sz="4"/>
@@ -2721,7 +2721,7 @@
       <w:tr>
         <w:tc>
           <w:tcPr>
-            <w:tcW w:type="dxa" w:w="1363"/>
+            <w:tcW w:type="dxa" w:w="1875"/>
             <w:tcBorders>
               <w:top w:val="single" w:color="BFBFBF" w:sz="4"/>
               <w:left w:val="single" w:color="BFBFBF" w:sz="4"/>
@@ -2750,7 +2750,7 @@
         </w:tc>
         <w:tc>
           <w:tcPr>
-            <w:tcW w:type="dxa" w:w="2820"/>
+            <w:tcW w:type="dxa" w:w="2587"/>
             <w:tcBorders>
               <w:top w:val="single" w:color="BFBFBF" w:sz="4"/>
               <w:left w:val="single" w:color="BFBFBF" w:sz="4"/>
@@ -2777,7 +2777,7 @@
         </w:tc>
         <w:tc>
           <w:tcPr>
-            <w:tcW w:type="dxa" w:w="2632"/>
+            <w:tcW w:type="dxa" w:w="2587"/>
             <w:tcBorders>
               <w:top w:val="single" w:color="BFBFBF" w:sz="4"/>
               <w:left w:val="single" w:color="BFBFBF" w:sz="4"/>
@@ -2804,7 +2804,7 @@
         </w:tc>
         <w:tc>
           <w:tcPr>
-            <w:tcW w:type="dxa" w:w="2823"/>
+            <w:tcW w:type="dxa" w:w="2589"/>
             <w:tcBorders>
               <w:top w:val="single" w:color="BFBFBF" w:sz="4"/>
               <w:left w:val="single" w:color="BFBFBF" w:sz="4"/>
@@ -2833,7 +2833,7 @@
       <w:tr>
         <w:tc>
           <w:tcPr>
-            <w:tcW w:type="dxa" w:w="1363"/>
+            <w:tcW w:type="dxa" w:w="1875"/>
             <w:tcBorders>
               <w:top w:val="single" w:color="BFBFBF" w:sz="4"/>
               <w:left w:val="single" w:color="BFBFBF" w:sz="4"/>
@@ -2862,7 +2862,7 @@
         </w:tc>
         <w:tc>
           <w:tcPr>
-            <w:tcW w:type="dxa" w:w="2820"/>
+            <w:tcW w:type="dxa" w:w="2587"/>
             <w:tcBorders>
               <w:top w:val="single" w:color="BFBFBF" w:sz="4"/>
               <w:left w:val="single" w:color="BFBFBF" w:sz="4"/>
@@ -2889,7 +2889,7 @@
         </w:tc>
         <w:tc>
           <w:tcPr>
-            <w:tcW w:type="dxa" w:w="2632"/>
+            <w:tcW w:type="dxa" w:w="2587"/>
             <w:tcBorders>
               <w:top w:val="single" w:color="BFBFBF" w:sz="4"/>
               <w:left w:val="single" w:color="BFBFBF" w:sz="4"/>
@@ -2950,7 +2950,7 @@
         </w:tc>
         <w:tc>
           <w:tcPr>
-            <w:tcW w:type="dxa" w:w="2823"/>
+            <w:tcW w:type="dxa" w:w="2589"/>
             <w:tcBorders>
               <w:top w:val="single" w:color="BFBFBF" w:sz="4"/>
               <w:left w:val="single" w:color="BFBFBF" w:sz="4"/>
@@ -2979,7 +2979,7 @@
       <w:tr>
         <w:tc>
           <w:tcPr>
-            <w:tcW w:type="dxa" w:w="1363"/>
+            <w:tcW w:type="dxa" w:w="1875"/>
             <w:tcBorders>
               <w:top w:val="single" w:color="BFBFBF" w:sz="4"/>
               <w:left w:val="single" w:color="BFBFBF" w:sz="4"/>
@@ -3016,7 +3016,7 @@
         </w:tc>
         <w:tc>
           <w:tcPr>
-            <w:tcW w:type="dxa" w:w="2820"/>
+            <w:tcW w:type="dxa" w:w="2587"/>
             <w:tcBorders>
               <w:top w:val="single" w:color="BFBFBF" w:sz="4"/>
               <w:left w:val="single" w:color="BFBFBF" w:sz="4"/>
@@ -3043,7 +3043,7 @@
         </w:tc>
         <w:tc>
           <w:tcPr>
-            <w:tcW w:type="dxa" w:w="2632"/>
+            <w:tcW w:type="dxa" w:w="2587"/>
             <w:tcBorders>
               <w:top w:val="single" w:color="BFBFBF" w:sz="4"/>
               <w:left w:val="single" w:color="BFBFBF" w:sz="4"/>
@@ -3070,7 +3070,7 @@
         </w:tc>
         <w:tc>
           <w:tcPr>
-            <w:tcW w:type="dxa" w:w="2823"/>
+            <w:tcW w:type="dxa" w:w="2589"/>
             <w:tcBorders>
               <w:top w:val="single" w:color="BFBFBF" w:sz="4"/>
               <w:left w:val="single" w:color="BFBFBF" w:sz="4"/>
@@ -3099,7 +3099,7 @@
       <w:tr>
         <w:tc>
           <w:tcPr>
-            <w:tcW w:type="dxa" w:w="1363"/>
+            <w:tcW w:type="dxa" w:w="1875"/>
             <w:tcBorders>
               <w:top w:val="single" w:color="BFBFBF" w:sz="4"/>
               <w:left w:val="single" w:color="BFBFBF" w:sz="4"/>
@@ -3136,7 +3136,7 @@
         </w:tc>
         <w:tc>
           <w:tcPr>
-            <w:tcW w:type="dxa" w:w="2820"/>
+            <w:tcW w:type="dxa" w:w="2587"/>
             <w:tcBorders>
               <w:top w:val="single" w:color="BFBFBF" w:sz="4"/>
               <w:left w:val="single" w:color="BFBFBF" w:sz="4"/>
@@ -3163,7 +3163,7 @@
         </w:tc>
         <w:tc>
           <w:tcPr>
-            <w:tcW w:type="dxa" w:w="2632"/>
+            <w:tcW w:type="dxa" w:w="2587"/>
             <w:tcBorders>
               <w:top w:val="single" w:color="BFBFBF" w:sz="4"/>
               <w:left w:val="single" w:color="BFBFBF" w:sz="4"/>
@@ -3190,7 +3190,7 @@
         </w:tc>
         <w:tc>
           <w:tcPr>
-            <w:tcW w:type="dxa" w:w="2823"/>
+            <w:tcW w:type="dxa" w:w="2589"/>
             <w:tcBorders>
               <w:top w:val="single" w:color="BFBFBF" w:sz="4"/>
               <w:left w:val="single" w:color="BFBFBF" w:sz="4"/>
@@ -3248,10 +3248,10 @@
         </w:tblBorders>
       </w:tblPr>
       <w:tblGrid>
-        <w:gridCol w:w="1458"/>
-        <w:gridCol w:w="570"/>
-        <w:gridCol w:w="3804"/>
-        <w:gridCol w:w="3806"/>
+        <w:gridCol w:w="1961"/>
+        <w:gridCol w:w="852"/>
+        <w:gridCol w:w="3411"/>
+        <w:gridCol w:w="3414"/>
       </w:tblGrid>
       <w:tr>
         <w:trPr>
@@ -3259,7 +3259,7 @@
         </w:trPr>
         <w:tc>
           <w:tcPr>
-            <w:tcW w:type="dxa" w:w="1458"/>
+            <w:tcW w:type="dxa" w:w="1961"/>
             <w:tcBorders>
               <w:top w:val="single" w:color="BFBFBF" w:sz="4"/>
               <w:left w:val="single" w:color="BFBFBF" w:sz="4"/>
@@ -3289,7 +3289,7 @@
         </w:tc>
         <w:tc>
           <w:tcPr>
-            <w:tcW w:type="dxa" w:w="570"/>
+            <w:tcW w:type="dxa" w:w="852"/>
             <w:tcBorders>
               <w:top w:val="single" w:color="BFBFBF" w:sz="4"/>
               <w:left w:val="single" w:color="BFBFBF" w:sz="4"/>
@@ -3319,7 +3319,7 @@
         </w:tc>
         <w:tc>
           <w:tcPr>
-            <w:tcW w:type="dxa" w:w="3804"/>
+            <w:tcW w:type="dxa" w:w="3411"/>
             <w:tcBorders>
               <w:top w:val="single" w:color="BFBFBF" w:sz="4"/>
               <w:left w:val="single" w:color="BFBFBF" w:sz="4"/>
@@ -3349,7 +3349,7 @@
         </w:tc>
         <w:tc>
           <w:tcPr>
-            <w:tcW w:type="dxa" w:w="3806"/>
+            <w:tcW w:type="dxa" w:w="3414"/>
             <w:tcBorders>
               <w:top w:val="single" w:color="BFBFBF" w:sz="4"/>
               <w:left w:val="single" w:color="BFBFBF" w:sz="4"/>
@@ -3381,7 +3381,7 @@
       <w:tr>
         <w:tc>
           <w:tcPr>
-            <w:tcW w:type="dxa" w:w="1458"/>
+            <w:tcW w:type="dxa" w:w="1961"/>
             <w:tcBorders>
               <w:top w:val="single" w:color="BFBFBF" w:sz="4"/>
               <w:left w:val="single" w:color="BFBFBF" w:sz="4"/>
@@ -3408,7 +3408,7 @@
         </w:tc>
         <w:tc>
           <w:tcPr>
-            <w:tcW w:type="dxa" w:w="570"/>
+            <w:tcW w:type="dxa" w:w="852"/>
             <w:tcBorders>
               <w:top w:val="single" w:color="BFBFBF" w:sz="4"/>
               <w:left w:val="single" w:color="BFBFBF" w:sz="4"/>
@@ -3435,7 +3435,7 @@
         </w:tc>
         <w:tc>
           <w:tcPr>
-            <w:tcW w:type="dxa" w:w="3804"/>
+            <w:tcW w:type="dxa" w:w="3411"/>
             <w:tcBorders>
               <w:top w:val="single" w:color="BFBFBF" w:sz="4"/>
               <w:left w:val="single" w:color="BFBFBF" w:sz="4"/>
@@ -3462,7 +3462,7 @@
         </w:tc>
         <w:tc>
           <w:tcPr>
-            <w:tcW w:type="dxa" w:w="3806"/>
+            <w:tcW w:type="dxa" w:w="3414"/>
             <w:tcBorders>
               <w:top w:val="single" w:color="BFBFBF" w:sz="4"/>
               <w:left w:val="single" w:color="BFBFBF" w:sz="4"/>
@@ -3491,7 +3491,7 @@
       <w:tr>
         <w:tc>
           <w:tcPr>
-            <w:tcW w:type="dxa" w:w="1458"/>
+            <w:tcW w:type="dxa" w:w="1961"/>
             <w:tcBorders>
               <w:top w:val="single" w:color="BFBFBF" w:sz="4"/>
               <w:left w:val="single" w:color="BFBFBF" w:sz="4"/>
@@ -3518,7 +3518,7 @@
         </w:tc>
         <w:tc>
           <w:tcPr>
-            <w:tcW w:type="dxa" w:w="570"/>
+            <w:tcW w:type="dxa" w:w="852"/>
             <w:tcBorders>
               <w:top w:val="single" w:color="BFBFBF" w:sz="4"/>
               <w:left w:val="single" w:color="BFBFBF" w:sz="4"/>
@@ -3547,7 +3547,7 @@
         </w:tc>
         <w:tc>
           <w:tcPr>
-            <w:tcW w:type="dxa" w:w="3804"/>
+            <w:tcW w:type="dxa" w:w="3411"/>
             <w:tcBorders>
               <w:top w:val="single" w:color="BFBFBF" w:sz="4"/>
               <w:left w:val="single" w:color="BFBFBF" w:sz="4"/>
@@ -3574,7 +3574,7 @@
         </w:tc>
         <w:tc>
           <w:tcPr>
-            <w:tcW w:type="dxa" w:w="3806"/>
+            <w:tcW w:type="dxa" w:w="3414"/>
             <w:tcBorders>
               <w:top w:val="single" w:color="BFBFBF" w:sz="4"/>
               <w:left w:val="single" w:color="BFBFBF" w:sz="4"/>
@@ -3603,7 +3603,7 @@
       <w:tr>
         <w:tc>
           <w:tcPr>
-            <w:tcW w:type="dxa" w:w="1458"/>
+            <w:tcW w:type="dxa" w:w="1961"/>
             <w:tcBorders>
               <w:top w:val="single" w:color="BFBFBF" w:sz="4"/>
               <w:left w:val="single" w:color="BFBFBF" w:sz="4"/>
@@ -3630,7 +3630,7 @@
         </w:tc>
         <w:tc>
           <w:tcPr>
-            <w:tcW w:type="dxa" w:w="570"/>
+            <w:tcW w:type="dxa" w:w="852"/>
             <w:tcBorders>
               <w:top w:val="single" w:color="BFBFBF" w:sz="4"/>
               <w:left w:val="single" w:color="BFBFBF" w:sz="4"/>
@@ -3657,7 +3657,7 @@
         </w:tc>
         <w:tc>
           <w:tcPr>
-            <w:tcW w:type="dxa" w:w="3804"/>
+            <w:tcW w:type="dxa" w:w="3411"/>
             <w:tcBorders>
               <w:top w:val="single" w:color="BFBFBF" w:sz="4"/>
               <w:left w:val="single" w:color="BFBFBF" w:sz="4"/>
@@ -3701,7 +3701,7 @@
         </w:tc>
         <w:tc>
           <w:tcPr>
-            <w:tcW w:type="dxa" w:w="3806"/>
+            <w:tcW w:type="dxa" w:w="3414"/>
             <w:tcBorders>
               <w:top w:val="single" w:color="BFBFBF" w:sz="4"/>
               <w:left w:val="single" w:color="BFBFBF" w:sz="4"/>
@@ -3730,7 +3730,7 @@
       <w:tr>
         <w:tc>
           <w:tcPr>
-            <w:tcW w:type="dxa" w:w="1458"/>
+            <w:tcW w:type="dxa" w:w="1961"/>
             <w:tcBorders>
               <w:top w:val="single" w:color="BFBFBF" w:sz="4"/>
               <w:left w:val="single" w:color="BFBFBF" w:sz="4"/>
@@ -3757,7 +3757,7 @@
         </w:tc>
         <w:tc>
           <w:tcPr>
-            <w:tcW w:type="dxa" w:w="570"/>
+            <w:tcW w:type="dxa" w:w="852"/>
             <w:tcBorders>
               <w:top w:val="single" w:color="BFBFBF" w:sz="4"/>
               <w:left w:val="single" w:color="BFBFBF" w:sz="4"/>
@@ -3786,7 +3786,7 @@
         </w:tc>
         <w:tc>
           <w:tcPr>
-            <w:tcW w:type="dxa" w:w="3804"/>
+            <w:tcW w:type="dxa" w:w="3411"/>
             <w:tcBorders>
               <w:top w:val="single" w:color="BFBFBF" w:sz="4"/>
               <w:left w:val="single" w:color="BFBFBF" w:sz="4"/>
@@ -3890,7 +3890,7 @@
         </w:tc>
         <w:tc>
           <w:tcPr>
-            <w:tcW w:type="dxa" w:w="3806"/>
+            <w:tcW w:type="dxa" w:w="3414"/>
             <w:tcBorders>
               <w:top w:val="single" w:color="BFBFBF" w:sz="4"/>
               <w:left w:val="single" w:color="BFBFBF" w:sz="4"/>
@@ -3937,7 +3937,7 @@
       <w:tr>
         <w:tc>
           <w:tcPr>
-            <w:tcW w:type="dxa" w:w="1458"/>
+            <w:tcW w:type="dxa" w:w="1961"/>
             <w:tcBorders>
               <w:top w:val="single" w:color="BFBFBF" w:sz="4"/>
               <w:left w:val="single" w:color="BFBFBF" w:sz="4"/>
@@ -3964,7 +3964,7 @@
         </w:tc>
         <w:tc>
           <w:tcPr>
-            <w:tcW w:type="dxa" w:w="570"/>
+            <w:tcW w:type="dxa" w:w="852"/>
             <w:tcBorders>
               <w:top w:val="single" w:color="BFBFBF" w:sz="4"/>
               <w:left w:val="single" w:color="BFBFBF" w:sz="4"/>
@@ -3991,7 +3991,7 @@
         </w:tc>
         <w:tc>
           <w:tcPr>
-            <w:tcW w:type="dxa" w:w="3804"/>
+            <w:tcW w:type="dxa" w:w="3411"/>
             <w:tcBorders>
               <w:top w:val="single" w:color="BFBFBF" w:sz="4"/>
               <w:left w:val="single" w:color="BFBFBF" w:sz="4"/>
@@ -4018,7 +4018,7 @@
         </w:tc>
         <w:tc>
           <w:tcPr>
-            <w:tcW w:type="dxa" w:w="3806"/>
+            <w:tcW w:type="dxa" w:w="3414"/>
             <w:tcBorders>
               <w:top w:val="single" w:color="BFBFBF" w:sz="4"/>
               <w:left w:val="single" w:color="BFBFBF" w:sz="4"/>
@@ -4089,8 +4089,8 @@
         </w:tblBorders>
       </w:tblPr>
       <w:tblGrid>
-        <w:gridCol w:w="4609"/>
-        <w:gridCol w:w="5029"/>
+        <w:gridCol w:w="4819"/>
+        <w:gridCol w:w="4819"/>
       </w:tblGrid>
       <w:tr>
         <w:trPr>
@@ -4098,7 +4098,7 @@
         </w:trPr>
         <w:tc>
           <w:tcPr>
-            <w:tcW w:type="dxa" w:w="4609"/>
+            <w:tcW w:type="dxa" w:w="4819"/>
             <w:tcBorders>
               <w:top w:val="single" w:color="BFBFBF" w:sz="4"/>
               <w:left w:val="single" w:color="BFBFBF" w:sz="4"/>
@@ -4128,7 +4128,7 @@
         </w:tc>
         <w:tc>
           <w:tcPr>
-            <w:tcW w:type="dxa" w:w="5029"/>
+            <w:tcW w:type="dxa" w:w="4819"/>
             <w:tcBorders>
               <w:top w:val="single" w:color="BFBFBF" w:sz="4"/>
               <w:left w:val="single" w:color="BFBFBF" w:sz="4"/>
@@ -4160,7 +4160,7 @@
       <w:tr>
         <w:tc>
           <w:tcPr>
-            <w:tcW w:type="dxa" w:w="4609"/>
+            <w:tcW w:type="dxa" w:w="4819"/>
             <w:tcBorders>
               <w:top w:val="single" w:color="BFBFBF" w:sz="4"/>
               <w:left w:val="single" w:color="BFBFBF" w:sz="4"/>
@@ -4222,7 +4222,7 @@
         </w:tc>
         <w:tc>
           <w:tcPr>
-            <w:tcW w:type="dxa" w:w="5029"/>
+            <w:tcW w:type="dxa" w:w="4819"/>
             <w:tcBorders>
               <w:top w:val="single" w:color="BFBFBF" w:sz="4"/>
               <w:left w:val="single" w:color="BFBFBF" w:sz="4"/>
@@ -4251,7 +4251,7 @@
       <w:tr>
         <w:tc>
           <w:tcPr>
-            <w:tcW w:type="dxa" w:w="4609"/>
+            <w:tcW w:type="dxa" w:w="4819"/>
             <w:tcBorders>
               <w:top w:val="single" w:color="BFBFBF" w:sz="4"/>
               <w:left w:val="single" w:color="BFBFBF" w:sz="4"/>
@@ -4279,7 +4279,7 @@
         </w:tc>
         <w:tc>
           <w:tcPr>
-            <w:tcW w:type="dxa" w:w="5029"/>
+            <w:tcW w:type="dxa" w:w="4819"/>
             <w:tcBorders>
               <w:top w:val="single" w:color="BFBFBF" w:sz="4"/>
               <w:left w:val="single" w:color="BFBFBF" w:sz="4"/>
@@ -4308,7 +4308,7 @@
       <w:tr>
         <w:tc>
           <w:tcPr>
-            <w:tcW w:type="dxa" w:w="4609"/>
+            <w:tcW w:type="dxa" w:w="4819"/>
             <w:tcBorders>
               <w:top w:val="single" w:color="BFBFBF" w:sz="4"/>
               <w:left w:val="single" w:color="BFBFBF" w:sz="4"/>
@@ -4344,7 +4344,7 @@
         </w:tc>
         <w:tc>
           <w:tcPr>
-            <w:tcW w:type="dxa" w:w="5029"/>
+            <w:tcW w:type="dxa" w:w="4819"/>
             <w:tcBorders>
               <w:top w:val="single" w:color="BFBFBF" w:sz="4"/>
               <w:left w:val="single" w:color="BFBFBF" w:sz="4"/>
@@ -4408,7 +4408,7 @@
       <w:tr>
         <w:tc>
           <w:tcPr>
-            <w:tcW w:type="dxa" w:w="4609"/>
+            <w:tcW w:type="dxa" w:w="4819"/>
             <w:tcBorders>
               <w:top w:val="single" w:color="BFBFBF" w:sz="4"/>
               <w:left w:val="single" w:color="BFBFBF" w:sz="4"/>
@@ -4436,7 +4436,7 @@
         </w:tc>
         <w:tc>
           <w:tcPr>
-            <w:tcW w:type="dxa" w:w="5029"/>
+            <w:tcW w:type="dxa" w:w="4819"/>
             <w:tcBorders>
               <w:top w:val="single" w:color="BFBFBF" w:sz="4"/>
               <w:left w:val="single" w:color="BFBFBF" w:sz="4"/>
@@ -4465,7 +4465,7 @@
       <w:tr>
         <w:tc>
           <w:tcPr>
-            <w:tcW w:type="dxa" w:w="4609"/>
+            <w:tcW w:type="dxa" w:w="4819"/>
             <w:tcBorders>
               <w:top w:val="single" w:color="BFBFBF" w:sz="4"/>
               <w:left w:val="single" w:color="BFBFBF" w:sz="4"/>
@@ -4501,7 +4501,7 @@
         </w:tc>
         <w:tc>
           <w:tcPr>
-            <w:tcW w:type="dxa" w:w="5029"/>
+            <w:tcW w:type="dxa" w:w="4819"/>
             <w:tcBorders>
               <w:top w:val="single" w:color="BFBFBF" w:sz="4"/>
               <w:left w:val="single" w:color="BFBFBF" w:sz="4"/>
@@ -4530,7 +4530,7 @@
       <w:tr>
         <w:tc>
           <w:tcPr>
-            <w:tcW w:type="dxa" w:w="4609"/>
+            <w:tcW w:type="dxa" w:w="4819"/>
             <w:tcBorders>
               <w:top w:val="single" w:color="BFBFBF" w:sz="4"/>
               <w:left w:val="single" w:color="BFBFBF" w:sz="4"/>
@@ -4566,7 +4566,7 @@
         </w:tc>
         <w:tc>
           <w:tcPr>
-            <w:tcW w:type="dxa" w:w="5029"/>
+            <w:tcW w:type="dxa" w:w="4819"/>
             <w:tcBorders>
               <w:top w:val="single" w:color="BFBFBF" w:sz="4"/>
               <w:left w:val="single" w:color="BFBFBF" w:sz="4"/>
@@ -4612,7 +4612,7 @@
       <w:tr>
         <w:tc>
           <w:tcPr>
-            <w:tcW w:type="dxa" w:w="4609"/>
+            <w:tcW w:type="dxa" w:w="4819"/>
             <w:tcBorders>
               <w:top w:val="single" w:color="BFBFBF" w:sz="4"/>
               <w:left w:val="single" w:color="BFBFBF" w:sz="4"/>
@@ -4657,7 +4657,7 @@
         </w:tc>
         <w:tc>
           <w:tcPr>
-            <w:tcW w:type="dxa" w:w="5029"/>
+            <w:tcW w:type="dxa" w:w="4819"/>
             <w:tcBorders>
               <w:top w:val="single" w:color="BFBFBF" w:sz="4"/>
               <w:left w:val="single" w:color="BFBFBF" w:sz="4"/>
@@ -4703,7 +4703,7 @@
       <w:tr>
         <w:tc>
           <w:tcPr>
-            <w:tcW w:type="dxa" w:w="4609"/>
+            <w:tcW w:type="dxa" w:w="4819"/>
             <w:tcBorders>
               <w:top w:val="single" w:color="BFBFBF" w:sz="4"/>
               <w:left w:val="single" w:color="BFBFBF" w:sz="4"/>
@@ -4748,7 +4748,7 @@
         </w:tc>
         <w:tc>
           <w:tcPr>
-            <w:tcW w:type="dxa" w:w="5029"/>
+            <w:tcW w:type="dxa" w:w="4819"/>
             <w:tcBorders>
               <w:top w:val="single" w:color="BFBFBF" w:sz="4"/>
               <w:left w:val="single" w:color="BFBFBF" w:sz="4"/>
@@ -4841,8 +4841,8 @@
         </w:tblBorders>
       </w:tblPr>
       <w:tblGrid>
-        <w:gridCol w:w="3676"/>
-        <w:gridCol w:w="5962"/>
+        <w:gridCol w:w="4631"/>
+        <w:gridCol w:w="5007"/>
       </w:tblGrid>
       <w:tr>
         <w:trPr>
@@ -4850,7 +4850,7 @@
         </w:trPr>
         <w:tc>
           <w:tcPr>
-            <w:tcW w:type="dxa" w:w="3676"/>
+            <w:tcW w:type="dxa" w:w="4631"/>
             <w:tcBorders>
               <w:top w:val="single" w:color="BFBFBF" w:sz="4"/>
               <w:left w:val="single" w:color="BFBFBF" w:sz="4"/>
@@ -4880,7 +4880,7 @@
         </w:tc>
         <w:tc>
           <w:tcPr>
-            <w:tcW w:type="dxa" w:w="5962"/>
+            <w:tcW w:type="dxa" w:w="5007"/>
             <w:tcBorders>
               <w:top w:val="single" w:color="BFBFBF" w:sz="4"/>
               <w:left w:val="single" w:color="BFBFBF" w:sz="4"/>
@@ -4912,7 +4912,7 @@
       <w:tr>
         <w:tc>
           <w:tcPr>
-            <w:tcW w:type="dxa" w:w="3676"/>
+            <w:tcW w:type="dxa" w:w="4631"/>
             <w:tcBorders>
               <w:top w:val="single" w:color="BFBFBF" w:sz="4"/>
               <w:left w:val="single" w:color="BFBFBF" w:sz="4"/>
@@ -4957,7 +4957,7 @@
         </w:tc>
         <w:tc>
           <w:tcPr>
-            <w:tcW w:type="dxa" w:w="5962"/>
+            <w:tcW w:type="dxa" w:w="5007"/>
             <w:tcBorders>
               <w:top w:val="single" w:color="BFBFBF" w:sz="4"/>
               <w:left w:val="single" w:color="BFBFBF" w:sz="4"/>
@@ -5021,7 +5021,7 @@
       <w:tr>
         <w:tc>
           <w:tcPr>
-            <w:tcW w:type="dxa" w:w="3676"/>
+            <w:tcW w:type="dxa" w:w="4631"/>
             <w:tcBorders>
               <w:top w:val="single" w:color="BFBFBF" w:sz="4"/>
               <w:left w:val="single" w:color="BFBFBF" w:sz="4"/>
@@ -5049,7 +5049,7 @@
         </w:tc>
         <w:tc>
           <w:tcPr>
-            <w:tcW w:type="dxa" w:w="5962"/>
+            <w:tcW w:type="dxa" w:w="5007"/>
             <w:tcBorders>
               <w:top w:val="single" w:color="BFBFBF" w:sz="4"/>
               <w:left w:val="single" w:color="BFBFBF" w:sz="4"/>
@@ -5095,7 +5095,7 @@
       <w:tr>
         <w:tc>
           <w:tcPr>
-            <w:tcW w:type="dxa" w:w="3676"/>
+            <w:tcW w:type="dxa" w:w="4631"/>
             <w:tcBorders>
               <w:top w:val="single" w:color="BFBFBF" w:sz="4"/>
               <w:left w:val="single" w:color="BFBFBF" w:sz="4"/>
@@ -5131,7 +5131,7 @@
         </w:tc>
         <w:tc>
           <w:tcPr>
-            <w:tcW w:type="dxa" w:w="5962"/>
+            <w:tcW w:type="dxa" w:w="5007"/>
             <w:tcBorders>
               <w:top w:val="single" w:color="BFBFBF" w:sz="4"/>
               <w:left w:val="single" w:color="BFBFBF" w:sz="4"/>
@@ -5160,7 +5160,7 @@
       <w:tr>
         <w:tc>
           <w:tcPr>
-            <w:tcW w:type="dxa" w:w="3676"/>
+            <w:tcW w:type="dxa" w:w="4631"/>
             <w:tcBorders>
               <w:top w:val="single" w:color="BFBFBF" w:sz="4"/>
               <w:left w:val="single" w:color="BFBFBF" w:sz="4"/>
@@ -5188,7 +5188,7 @@
         </w:tc>
         <w:tc>
           <w:tcPr>
-            <w:tcW w:type="dxa" w:w="5962"/>
+            <w:tcW w:type="dxa" w:w="5007"/>
             <w:tcBorders>
               <w:top w:val="single" w:color="BFBFBF" w:sz="4"/>
               <w:left w:val="single" w:color="BFBFBF" w:sz="4"/>
@@ -5226,7 +5226,7 @@
       <w:tr>
         <w:tc>
           <w:tcPr>
-            <w:tcW w:type="dxa" w:w="3676"/>
+            <w:tcW w:type="dxa" w:w="4631"/>
             <w:tcBorders>
               <w:top w:val="single" w:color="BFBFBF" w:sz="4"/>
               <w:left w:val="single" w:color="BFBFBF" w:sz="4"/>
@@ -5271,7 +5271,7 @@
         </w:tc>
         <w:tc>
           <w:tcPr>
-            <w:tcW w:type="dxa" w:w="5962"/>
+            <w:tcW w:type="dxa" w:w="5007"/>
             <w:tcBorders>
               <w:top w:val="single" w:color="BFBFBF" w:sz="4"/>
               <w:left w:val="single" w:color="BFBFBF" w:sz="4"/>
@@ -5300,7 +5300,7 @@
       <w:tr>
         <w:tc>
           <w:tcPr>
-            <w:tcW w:type="dxa" w:w="3676"/>
+            <w:tcW w:type="dxa" w:w="4631"/>
             <w:tcBorders>
               <w:top w:val="single" w:color="BFBFBF" w:sz="4"/>
               <w:left w:val="single" w:color="BFBFBF" w:sz="4"/>
@@ -5345,7 +5345,7 @@
         </w:tc>
         <w:tc>
           <w:tcPr>
-            <w:tcW w:type="dxa" w:w="5962"/>
+            <w:tcW w:type="dxa" w:w="5007"/>
             <w:tcBorders>
               <w:top w:val="single" w:color="BFBFBF" w:sz="4"/>
               <w:left w:val="single" w:color="BFBFBF" w:sz="4"/>
@@ -5641,10 +5641,10 @@
         </w:tblBorders>
       </w:tblPr>
       <w:tblGrid>
-        <w:gridCol w:w="788"/>
-        <w:gridCol w:w="1576"/>
-        <w:gridCol w:w="3636"/>
-        <w:gridCol w:w="3638"/>
+        <w:gridCol w:w="1052"/>
+        <w:gridCol w:w="2105"/>
+        <w:gridCol w:w="3239"/>
+        <w:gridCol w:w="3242"/>
       </w:tblGrid>
       <w:tr>
         <w:trPr>
@@ -5652,7 +5652,7 @@
         </w:trPr>
         <w:tc>
           <w:tcPr>
-            <w:tcW w:type="dxa" w:w="788"/>
+            <w:tcW w:type="dxa" w:w="1052"/>
             <w:tcBorders>
               <w:top w:val="single" w:color="BFBFBF" w:sz="4"/>
               <w:left w:val="single" w:color="BFBFBF" w:sz="4"/>
@@ -5682,7 +5682,7 @@
         </w:tc>
         <w:tc>
           <w:tcPr>
-            <w:tcW w:type="dxa" w:w="1576"/>
+            <w:tcW w:type="dxa" w:w="2105"/>
             <w:tcBorders>
               <w:top w:val="single" w:color="BFBFBF" w:sz="4"/>
               <w:left w:val="single" w:color="BFBFBF" w:sz="4"/>
@@ -5712,7 +5712,7 @@
         </w:tc>
         <w:tc>
           <w:tcPr>
-            <w:tcW w:type="dxa" w:w="3636"/>
+            <w:tcW w:type="dxa" w:w="3239"/>
             <w:tcBorders>
               <w:top w:val="single" w:color="BFBFBF" w:sz="4"/>
               <w:left w:val="single" w:color="BFBFBF" w:sz="4"/>
@@ -5742,7 +5742,7 @@
         </w:tc>
         <w:tc>
           <w:tcPr>
-            <w:tcW w:type="dxa" w:w="3638"/>
+            <w:tcW w:type="dxa" w:w="3242"/>
             <w:tcBorders>
               <w:top w:val="single" w:color="BFBFBF" w:sz="4"/>
               <w:left w:val="single" w:color="BFBFBF" w:sz="4"/>
@@ -5774,7 +5774,7 @@
       <w:tr>
         <w:tc>
           <w:tcPr>
-            <w:tcW w:type="dxa" w:w="788"/>
+            <w:tcW w:type="dxa" w:w="1052"/>
             <w:tcBorders>
               <w:top w:val="single" w:color="BFBFBF" w:sz="4"/>
               <w:left w:val="single" w:color="BFBFBF" w:sz="4"/>
@@ -5802,7 +5802,7 @@
         </w:tc>
         <w:tc>
           <w:tcPr>
-            <w:tcW w:type="dxa" w:w="1576"/>
+            <w:tcW w:type="dxa" w:w="2105"/>
             <w:tcBorders>
               <w:top w:val="single" w:color="BFBFBF" w:sz="4"/>
               <w:left w:val="single" w:color="BFBFBF" w:sz="4"/>
@@ -5838,7 +5838,7 @@
         </w:tc>
         <w:tc>
           <w:tcPr>
-            <w:tcW w:type="dxa" w:w="3636"/>
+            <w:tcW w:type="dxa" w:w="3239"/>
             <w:tcBorders>
               <w:top w:val="single" w:color="BFBFBF" w:sz="4"/>
               <w:left w:val="single" w:color="BFBFBF" w:sz="4"/>
@@ -5959,7 +5959,7 @@
         </w:tc>
         <w:tc>
           <w:tcPr>
-            <w:tcW w:type="dxa" w:w="3638"/>
+            <w:tcW w:type="dxa" w:w="3242"/>
             <w:tcBorders>
               <w:top w:val="single" w:color="BFBFBF" w:sz="4"/>
               <w:left w:val="single" w:color="BFBFBF" w:sz="4"/>
@@ -6048,7 +6048,7 @@
       <w:tr>
         <w:tc>
           <w:tcPr>
-            <w:tcW w:type="dxa" w:w="788"/>
+            <w:tcW w:type="dxa" w:w="1052"/>
             <w:tcBorders>
               <w:top w:val="single" w:color="BFBFBF" w:sz="4"/>
               <w:left w:val="single" w:color="BFBFBF" w:sz="4"/>
@@ -6076,7 +6076,7 @@
         </w:tc>
         <w:tc>
           <w:tcPr>
-            <w:tcW w:type="dxa" w:w="1576"/>
+            <w:tcW w:type="dxa" w:w="2105"/>
             <w:tcBorders>
               <w:top w:val="single" w:color="BFBFBF" w:sz="4"/>
               <w:left w:val="single" w:color="BFBFBF" w:sz="4"/>
@@ -6121,7 +6121,7 @@
         </w:tc>
         <w:tc>
           <w:tcPr>
-            <w:tcW w:type="dxa" w:w="3636"/>
+            <w:tcW w:type="dxa" w:w="3239"/>
             <w:tcBorders>
               <w:top w:val="single" w:color="BFBFBF" w:sz="4"/>
               <w:left w:val="single" w:color="BFBFBF" w:sz="4"/>
@@ -6148,7 +6148,7 @@
         </w:tc>
         <w:tc>
           <w:tcPr>
-            <w:tcW w:type="dxa" w:w="3638"/>
+            <w:tcW w:type="dxa" w:w="3242"/>
             <w:tcBorders>
               <w:top w:val="single" w:color="BFBFBF" w:sz="4"/>
               <w:left w:val="single" w:color="BFBFBF" w:sz="4"/>
@@ -6186,7 +6186,7 @@
       <w:tr>
         <w:tc>
           <w:tcPr>
-            <w:tcW w:type="dxa" w:w="788"/>
+            <w:tcW w:type="dxa" w:w="1052"/>
             <w:tcBorders>
               <w:top w:val="single" w:color="BFBFBF" w:sz="4"/>
               <w:left w:val="single" w:color="BFBFBF" w:sz="4"/>
@@ -6214,7 +6214,7 @@
         </w:tc>
         <w:tc>
           <w:tcPr>
-            <w:tcW w:type="dxa" w:w="1576"/>
+            <w:tcW w:type="dxa" w:w="2105"/>
             <w:tcBorders>
               <w:top w:val="single" w:color="BFBFBF" w:sz="4"/>
               <w:left w:val="single" w:color="BFBFBF" w:sz="4"/>
@@ -6250,7 +6250,7 @@
         </w:tc>
         <w:tc>
           <w:tcPr>
-            <w:tcW w:type="dxa" w:w="3636"/>
+            <w:tcW w:type="dxa" w:w="3239"/>
             <w:tcBorders>
               <w:top w:val="single" w:color="BFBFBF" w:sz="4"/>
               <w:left w:val="single" w:color="BFBFBF" w:sz="4"/>
@@ -6286,7 +6286,7 @@
         </w:tc>
         <w:tc>
           <w:tcPr>
-            <w:tcW w:type="dxa" w:w="3638"/>
+            <w:tcW w:type="dxa" w:w="3242"/>
             <w:tcBorders>
               <w:top w:val="single" w:color="BFBFBF" w:sz="4"/>
               <w:left w:val="single" w:color="BFBFBF" w:sz="4"/>
@@ -7149,6 +7149,33 @@
     </w:p>
     <w:p>
       <w:pPr>
+        <w:spacing w:after="120"/>
+      </w:pPr>
+      <w:r>
+        <w:rPr>
+          <w:rFonts w:ascii="Calibri" w:cs="Calibri" w:eastAsia="Calibri" w:hAnsi="Calibri"/>
+        </w:rPr>
+        <w:t xml:space="preserve">Full analysis with diagrams, advantages, limitations and alternatives: </w:t>
+      </w:r>
+      <w:r>
+        <w:rPr>
+          <w:rFonts w:ascii="Consolas" w:cs="Consolas" w:eastAsia="Consolas" w:hAnsi="Consolas"/>
+          <w:color w:val="5B2C6F"/>
+          <w:sz w:val="19"/>
+          <w:szCs w:val="19"/>
+          <w:u w:val="single"/>
+        </w:rPr>
+        <w:t xml:space="preserve">../concurrency/CONCURRENCY.md</w:t>
+      </w:r>
+      <w:r>
+        <w:rPr>
+          <w:rFonts w:ascii="Calibri" w:cs="Calibri" w:eastAsia="Calibri" w:hAnsi="Calibri"/>
+        </w:rPr>
+        <w:t xml:space="preserve">.</w:t>
+      </w:r>
+    </w:p>
+    <w:p>
+      <w:pPr>
         <w:pStyle w:val="ListParagraph"/>
         <w:numPr>
           <w:ilvl w:val="0"/>
@@ -7309,8 +7336,8 @@
         </w:tblBorders>
       </w:tblPr>
       <w:tblGrid>
-        <w:gridCol w:w="3486"/>
-        <w:gridCol w:w="6152"/>
+        <w:gridCol w:w="4428"/>
+        <w:gridCol w:w="5210"/>
       </w:tblGrid>
       <w:tr>
         <w:trPr>
@@ -7318,7 +7345,7 @@
         </w:trPr>
         <w:tc>
           <w:tcPr>
-            <w:tcW w:type="dxa" w:w="3486"/>
+            <w:tcW w:type="dxa" w:w="4428"/>
             <w:tcBorders>
               <w:top w:val="single" w:color="BFBFBF" w:sz="4"/>
               <w:left w:val="single" w:color="BFBFBF" w:sz="4"/>
@@ -7348,7 +7375,7 @@
         </w:tc>
         <w:tc>
           <w:tcPr>
-            <w:tcW w:type="dxa" w:w="6152"/>
+            <w:tcW w:type="dxa" w:w="5210"/>
             <w:tcBorders>
               <w:top w:val="single" w:color="BFBFBF" w:sz="4"/>
               <w:left w:val="single" w:color="BFBFBF" w:sz="4"/>
@@ -7380,7 +7407,7 @@
       <w:tr>
         <w:tc>
           <w:tcPr>
-            <w:tcW w:type="dxa" w:w="3486"/>
+            <w:tcW w:type="dxa" w:w="4428"/>
             <w:tcBorders>
               <w:top w:val="single" w:color="BFBFBF" w:sz="4"/>
               <w:left w:val="single" w:color="BFBFBF" w:sz="4"/>
@@ -7407,7 +7434,7 @@
         </w:tc>
         <w:tc>
           <w:tcPr>
-            <w:tcW w:type="dxa" w:w="6152"/>
+            <w:tcW w:type="dxa" w:w="5210"/>
             <w:tcBorders>
               <w:top w:val="single" w:color="BFBFBF" w:sz="4"/>
               <w:left w:val="single" w:color="BFBFBF" w:sz="4"/>
@@ -7436,7 +7463,7 @@
       <w:tr>
         <w:tc>
           <w:tcPr>
-            <w:tcW w:type="dxa" w:w="3486"/>
+            <w:tcW w:type="dxa" w:w="4428"/>
             <w:tcBorders>
               <w:top w:val="single" w:color="BFBFBF" w:sz="4"/>
               <w:left w:val="single" w:color="BFBFBF" w:sz="4"/>
@@ -7463,7 +7490,7 @@
         </w:tc>
         <w:tc>
           <w:tcPr>
-            <w:tcW w:type="dxa" w:w="6152"/>
+            <w:tcW w:type="dxa" w:w="5210"/>
             <w:tcBorders>
               <w:top w:val="single" w:color="BFBFBF" w:sz="4"/>
               <w:left w:val="single" w:color="BFBFBF" w:sz="4"/>
@@ -7492,7 +7519,7 @@
       <w:tr>
         <w:tc>
           <w:tcPr>
-            <w:tcW w:type="dxa" w:w="3486"/>
+            <w:tcW w:type="dxa" w:w="4428"/>
             <w:tcBorders>
               <w:top w:val="single" w:color="BFBFBF" w:sz="4"/>
               <w:left w:val="single" w:color="BFBFBF" w:sz="4"/>
@@ -7519,7 +7546,7 @@
         </w:tc>
         <w:tc>
           <w:tcPr>
-            <w:tcW w:type="dxa" w:w="6152"/>
+            <w:tcW w:type="dxa" w:w="5210"/>
             <w:tcBorders>
               <w:top w:val="single" w:color="BFBFBF" w:sz="4"/>
               <w:left w:val="single" w:color="BFBFBF" w:sz="4"/>
@@ -7548,7 +7575,7 @@
       <w:tr>
         <w:tc>
           <w:tcPr>
-            <w:tcW w:type="dxa" w:w="3486"/>
+            <w:tcW w:type="dxa" w:w="4428"/>
             <w:tcBorders>
               <w:top w:val="single" w:color="BFBFBF" w:sz="4"/>
               <w:left w:val="single" w:color="BFBFBF" w:sz="4"/>
@@ -7575,7 +7602,7 @@
         </w:tc>
         <w:tc>
           <w:tcPr>
-            <w:tcW w:type="dxa" w:w="6152"/>
+            <w:tcW w:type="dxa" w:w="5210"/>
             <w:tcBorders>
               <w:top w:val="single" w:color="BFBFBF" w:sz="4"/>
               <w:left w:val="single" w:color="BFBFBF" w:sz="4"/>
@@ -7604,7 +7631,7 @@
       <w:tr>
         <w:tc>
           <w:tcPr>
-            <w:tcW w:type="dxa" w:w="3486"/>
+            <w:tcW w:type="dxa" w:w="4428"/>
             <w:tcBorders>
               <w:top w:val="single" w:color="BFBFBF" w:sz="4"/>
               <w:left w:val="single" w:color="BFBFBF" w:sz="4"/>
@@ -7631,7 +7658,7 @@
         </w:tc>
         <w:tc>
           <w:tcPr>
-            <w:tcW w:type="dxa" w:w="6152"/>
+            <w:tcW w:type="dxa" w:w="5210"/>
             <w:tcBorders>
               <w:top w:val="single" w:color="BFBFBF" w:sz="4"/>
               <w:left w:val="single" w:color="BFBFBF" w:sz="4"/>
@@ -7660,7 +7687,7 @@
       <w:tr>
         <w:tc>
           <w:tcPr>
-            <w:tcW w:type="dxa" w:w="3486"/>
+            <w:tcW w:type="dxa" w:w="4428"/>
             <w:tcBorders>
               <w:top w:val="single" w:color="BFBFBF" w:sz="4"/>
               <w:left w:val="single" w:color="BFBFBF" w:sz="4"/>
@@ -7687,7 +7714,7 @@
         </w:tc>
         <w:tc>
           <w:tcPr>
-            <w:tcW w:type="dxa" w:w="6152"/>
+            <w:tcW w:type="dxa" w:w="5210"/>
             <w:tcBorders>
               <w:top w:val="single" w:color="BFBFBF" w:sz="4"/>
               <w:left w:val="single" w:color="BFBFBF" w:sz="4"/>
@@ -7716,7 +7743,7 @@
       <w:tr>
         <w:tc>
           <w:tcPr>
-            <w:tcW w:type="dxa" w:w="3486"/>
+            <w:tcW w:type="dxa" w:w="4428"/>
             <w:tcBorders>
               <w:top w:val="single" w:color="BFBFBF" w:sz="4"/>
               <w:left w:val="single" w:color="BFBFBF" w:sz="4"/>
@@ -7743,7 +7770,7 @@
         </w:tc>
         <w:tc>
           <w:tcPr>
-            <w:tcW w:type="dxa" w:w="6152"/>
+            <w:tcW w:type="dxa" w:w="5210"/>
             <w:tcBorders>
               <w:top w:val="single" w:color="BFBFBF" w:sz="4"/>
               <w:left w:val="single" w:color="BFBFBF" w:sz="4"/>
@@ -7772,7 +7799,7 @@
       <w:tr>
         <w:tc>
           <w:tcPr>
-            <w:tcW w:type="dxa" w:w="3486"/>
+            <w:tcW w:type="dxa" w:w="4428"/>
             <w:tcBorders>
               <w:top w:val="single" w:color="BFBFBF" w:sz="4"/>
               <w:left w:val="single" w:color="BFBFBF" w:sz="4"/>
@@ -7799,7 +7826,7 @@
         </w:tc>
         <w:tc>
           <w:tcPr>
-            <w:tcW w:type="dxa" w:w="6152"/>
+            <w:tcW w:type="dxa" w:w="5210"/>
             <w:tcBorders>
               <w:top w:val="single" w:color="BFBFBF" w:sz="4"/>
               <w:left w:val="single" w:color="BFBFBF" w:sz="4"/>
@@ -8500,9 +8527,9 @@
         </w:tblBorders>
       </w:tblPr>
       <w:tblGrid>
-        <w:gridCol w:w="3870"/>
-        <w:gridCol w:w="3035"/>
-        <w:gridCol w:w="2733"/>
+        <w:gridCol w:w="3323"/>
+        <w:gridCol w:w="3323"/>
+        <w:gridCol w:w="2992"/>
       </w:tblGrid>
       <w:tr>
         <w:trPr>
@@ -8510,7 +8537,7 @@
         </w:trPr>
         <w:tc>
           <w:tcPr>
-            <w:tcW w:type="dxa" w:w="3870"/>
+            <w:tcW w:type="dxa" w:w="3323"/>
             <w:tcBorders>
               <w:top w:val="single" w:color="BFBFBF" w:sz="4"/>
               <w:left w:val="single" w:color="BFBFBF" w:sz="4"/>
@@ -8540,7 +8567,7 @@
         </w:tc>
         <w:tc>
           <w:tcPr>
-            <w:tcW w:type="dxa" w:w="3035"/>
+            <w:tcW w:type="dxa" w:w="3323"/>
             <w:tcBorders>
               <w:top w:val="single" w:color="BFBFBF" w:sz="4"/>
               <w:left w:val="single" w:color="BFBFBF" w:sz="4"/>
@@ -8570,7 +8597,7 @@
         </w:tc>
         <w:tc>
           <w:tcPr>
-            <w:tcW w:type="dxa" w:w="2733"/>
+            <w:tcW w:type="dxa" w:w="2992"/>
             <w:tcBorders>
               <w:top w:val="single" w:color="BFBFBF" w:sz="4"/>
               <w:left w:val="single" w:color="BFBFBF" w:sz="4"/>
@@ -8602,7 +8629,7 @@
       <w:tr>
         <w:tc>
           <w:tcPr>
-            <w:tcW w:type="dxa" w:w="3870"/>
+            <w:tcW w:type="dxa" w:w="3323"/>
             <w:tcBorders>
               <w:top w:val="single" w:color="BFBFBF" w:sz="4"/>
               <w:left w:val="single" w:color="BFBFBF" w:sz="4"/>
@@ -8629,7 +8656,7 @@
         </w:tc>
         <w:tc>
           <w:tcPr>
-            <w:tcW w:type="dxa" w:w="3035"/>
+            <w:tcW w:type="dxa" w:w="3323"/>
             <w:tcBorders>
               <w:top w:val="single" w:color="BFBFBF" w:sz="4"/>
               <w:left w:val="single" w:color="BFBFBF" w:sz="4"/>
@@ -8656,7 +8683,7 @@
         </w:tc>
         <w:tc>
           <w:tcPr>
-            <w:tcW w:type="dxa" w:w="2733"/>
+            <w:tcW w:type="dxa" w:w="2992"/>
             <w:tcBorders>
               <w:top w:val="single" w:color="BFBFBF" w:sz="4"/>
               <w:left w:val="single" w:color="BFBFBF" w:sz="4"/>
@@ -8685,7 +8712,7 @@
       <w:tr>
         <w:tc>
           <w:tcPr>
-            <w:tcW w:type="dxa" w:w="3870"/>
+            <w:tcW w:type="dxa" w:w="3323"/>
             <w:tcBorders>
               <w:top w:val="single" w:color="BFBFBF" w:sz="4"/>
               <w:left w:val="single" w:color="BFBFBF" w:sz="4"/>
@@ -8712,7 +8739,7 @@
         </w:tc>
         <w:tc>
           <w:tcPr>
-            <w:tcW w:type="dxa" w:w="3035"/>
+            <w:tcW w:type="dxa" w:w="3323"/>
             <w:tcBorders>
               <w:top w:val="single" w:color="BFBFBF" w:sz="4"/>
               <w:left w:val="single" w:color="BFBFBF" w:sz="4"/>
@@ -8739,7 +8766,7 @@
         </w:tc>
         <w:tc>
           <w:tcPr>
-            <w:tcW w:type="dxa" w:w="2733"/>
+            <w:tcW w:type="dxa" w:w="2992"/>
             <w:tcBorders>
               <w:top w:val="single" w:color="BFBFBF" w:sz="4"/>
               <w:left w:val="single" w:color="BFBFBF" w:sz="4"/>
@@ -8768,7 +8795,7 @@
       <w:tr>
         <w:tc>
           <w:tcPr>
-            <w:tcW w:type="dxa" w:w="3870"/>
+            <w:tcW w:type="dxa" w:w="3323"/>
             <w:tcBorders>
               <w:top w:val="single" w:color="BFBFBF" w:sz="4"/>
               <w:left w:val="single" w:color="BFBFBF" w:sz="4"/>
@@ -8812,7 +8839,7 @@
         </w:tc>
         <w:tc>
           <w:tcPr>
-            <w:tcW w:type="dxa" w:w="3035"/>
+            <w:tcW w:type="dxa" w:w="3323"/>
             <w:tcBorders>
               <w:top w:val="single" w:color="BFBFBF" w:sz="4"/>
               <w:left w:val="single" w:color="BFBFBF" w:sz="4"/>
@@ -8839,7 +8866,7 @@
         </w:tc>
         <w:tc>
           <w:tcPr>
-            <w:tcW w:type="dxa" w:w="2733"/>
+            <w:tcW w:type="dxa" w:w="2992"/>
             <w:tcBorders>
               <w:top w:val="single" w:color="BFBFBF" w:sz="4"/>
               <w:left w:val="single" w:color="BFBFBF" w:sz="4"/>
@@ -8868,7 +8895,7 @@
       <w:tr>
         <w:tc>
           <w:tcPr>
-            <w:tcW w:type="dxa" w:w="3870"/>
+            <w:tcW w:type="dxa" w:w="3323"/>
             <w:tcBorders>
               <w:top w:val="single" w:color="BFBFBF" w:sz="4"/>
               <w:left w:val="single" w:color="BFBFBF" w:sz="4"/>
@@ -8895,7 +8922,7 @@
         </w:tc>
         <w:tc>
           <w:tcPr>
-            <w:tcW w:type="dxa" w:w="3035"/>
+            <w:tcW w:type="dxa" w:w="3323"/>
             <w:tcBorders>
               <w:top w:val="single" w:color="BFBFBF" w:sz="4"/>
               <w:left w:val="single" w:color="BFBFBF" w:sz="4"/>
@@ -8922,7 +8949,7 @@
         </w:tc>
         <w:tc>
           <w:tcPr>
-            <w:tcW w:type="dxa" w:w="2733"/>
+            <w:tcW w:type="dxa" w:w="2992"/>
             <w:tcBorders>
               <w:top w:val="single" w:color="BFBFBF" w:sz="4"/>
               <w:left w:val="single" w:color="BFBFBF" w:sz="4"/>
@@ -8951,7 +8978,7 @@
       <w:tr>
         <w:tc>
           <w:tcPr>
-            <w:tcW w:type="dxa" w:w="3870"/>
+            <w:tcW w:type="dxa" w:w="3323"/>
             <w:tcBorders>
               <w:top w:val="single" w:color="BFBFBF" w:sz="4"/>
               <w:left w:val="single" w:color="BFBFBF" w:sz="4"/>
@@ -8978,7 +9005,7 @@
         </w:tc>
         <w:tc>
           <w:tcPr>
-            <w:tcW w:type="dxa" w:w="3035"/>
+            <w:tcW w:type="dxa" w:w="3323"/>
             <w:tcBorders>
               <w:top w:val="single" w:color="BFBFBF" w:sz="4"/>
               <w:left w:val="single" w:color="BFBFBF" w:sz="4"/>
@@ -9005,7 +9032,7 @@
         </w:tc>
         <w:tc>
           <w:tcPr>
-            <w:tcW w:type="dxa" w:w="2733"/>
+            <w:tcW w:type="dxa" w:w="2992"/>
             <w:tcBorders>
               <w:top w:val="single" w:color="BFBFBF" w:sz="4"/>
               <w:left w:val="single" w:color="BFBFBF" w:sz="4"/>
@@ -9034,7 +9061,7 @@
       <w:tr>
         <w:tc>
           <w:tcPr>
-            <w:tcW w:type="dxa" w:w="3870"/>
+            <w:tcW w:type="dxa" w:w="3323"/>
             <w:tcBorders>
               <w:top w:val="single" w:color="BFBFBF" w:sz="4"/>
               <w:left w:val="single" w:color="BFBFBF" w:sz="4"/>
@@ -9061,7 +9088,7 @@
         </w:tc>
         <w:tc>
           <w:tcPr>
-            <w:tcW w:type="dxa" w:w="3035"/>
+            <w:tcW w:type="dxa" w:w="3323"/>
             <w:tcBorders>
               <w:top w:val="single" w:color="BFBFBF" w:sz="4"/>
               <w:left w:val="single" w:color="BFBFBF" w:sz="4"/>
@@ -9088,7 +9115,7 @@
         </w:tc>
         <w:tc>
           <w:tcPr>
-            <w:tcW w:type="dxa" w:w="2733"/>
+            <w:tcW w:type="dxa" w:w="2992"/>
             <w:tcBorders>
               <w:top w:val="single" w:color="BFBFBF" w:sz="4"/>
               <w:left w:val="single" w:color="BFBFBF" w:sz="4"/>

</xml_diff>

<commit_message>
feat(logging): console + MongoDB log pipeline with Debug/Information/Error levels
- Ta9.ServiceDefaults: BatchingLogSink (bounded, non-blocking, batched, drops counted and
  reported, flushed on stop/crash) + MongoLogBatchWriter (ta9_logs.logs, 7-day TTL, indexes)
- Console >= Information, MongoDB >= Debug (configurable); lifecycle and crash logging
- Debug/Information/Error logs across the three services; job correlation id restored in
  background work (audit publisher, worker, WS send loop)
- 33 tests (unit, host pipeline, MongoDB writer, E2E logs of all services)
- Docs: Logging & Observability document + draw.io page 11, HLD 9.4, Installation Guide
  troubleshooting chapter, STD (311 cases), README, decisions D26-D27

Co-Authored-By: Claude Opus 5.5 <noreply@anthropic.com>
</commit_message>
<xml_diff>
--- a/docs/hld/TA9-HLD.docx
+++ b/docs/hld/TA9-HLD.docx
@@ -302,7 +302,7 @@
               </w:rPr>
               <w:t xml:space="preserve"> (one page per diagram). Open with </w:t>
             </w:r>
-            <w:hyperlink w:history="1" r:id="rIdwq1bsw5cb62moxfqk2ur3">
+            <w:hyperlink w:history="1" r:id="rIdvw7v24jx5eq9xsu0hnya9">
               <w:r>
                 <w:rPr>
                   <w:rFonts w:ascii="Calibri" w:cs="Calibri" w:eastAsia="Calibri" w:hAnsi="Calibri"/>
@@ -416,7 +416,151 @@
                 <w:sz w:val="18"/>
                 <w:szCs w:val="18"/>
               </w:rPr>
-              <w:t xml:space="preserve"> — architecture, API contracts, reliability, decision log (D1–D24)</w:t>
+              <w:t xml:space="preserve"> — architecture, API contracts, reliability, decision log (D1–D26)</w:t>
+            </w:r>
+          </w:p>
+        </w:tc>
+      </w:tr>
+      <w:tr>
+        <w:tc>
+          <w:tcPr>
+            <w:tcW w:type="dxa" w:w="2628"/>
+            <w:tcBorders>
+              <w:top w:val="single" w:color="BFBFBF" w:sz="4"/>
+              <w:left w:val="single" w:color="BFBFBF" w:sz="4"/>
+              <w:bottom w:val="single" w:color="BFBFBF" w:sz="4"/>
+              <w:right w:val="single" w:color="BFBFBF" w:sz="4"/>
+            </w:tcBorders>
+            <w:tcMar>
+              <w:top w:type="dxa" w:w="60"/>
+              <w:left w:type="dxa" w:w="100"/>
+              <w:bottom w:type="dxa" w:w="60"/>
+              <w:right w:type="dxa" w:w="100"/>
+            </w:tcMar>
+          </w:tcPr>
+          <w:p>
+            <w:r>
+              <w:rPr>
+                <w:rFonts w:ascii="Calibri" w:cs="Calibri" w:eastAsia="Calibri" w:hAnsi="Calibri"/>
+                <w:b/>
+                <w:bCs/>
+                <w:sz w:val="18"/>
+                <w:szCs w:val="18"/>
+              </w:rPr>
+              <w:t xml:space="preserve">Topic documents</w:t>
+            </w:r>
+          </w:p>
+        </w:tc>
+        <w:tc>
+          <w:tcPr>
+            <w:tcW w:type="dxa" w:w="7010"/>
+            <w:tcBorders>
+              <w:top w:val="single" w:color="BFBFBF" w:sz="4"/>
+              <w:left w:val="single" w:color="BFBFBF" w:sz="4"/>
+              <w:bottom w:val="single" w:color="BFBFBF" w:sz="4"/>
+              <w:right w:val="single" w:color="BFBFBF" w:sz="4"/>
+            </w:tcBorders>
+            <w:tcMar>
+              <w:top w:type="dxa" w:w="60"/>
+              <w:left w:type="dxa" w:w="100"/>
+              <w:bottom w:type="dxa" w:w="60"/>
+              <w:right w:type="dxa" w:w="100"/>
+            </w:tcMar>
+          </w:tcPr>
+          <w:p>
+            <w:r>
+              <w:rPr>
+                <w:rFonts w:ascii="Calibri" w:cs="Calibri" w:eastAsia="Calibri" w:hAnsi="Calibri"/>
+                <w:sz w:val="18"/>
+                <w:szCs w:val="18"/>
+              </w:rPr>
+              <w:t xml:space="preserve">Concurrency (</w:t>
+            </w:r>
+            <w:r>
+              <w:rPr>
+                <w:rFonts w:ascii="Consolas" w:cs="Consolas" w:eastAsia="Consolas" w:hAnsi="Consolas"/>
+                <w:color w:val="5B2C6F"/>
+                <w:sz w:val="16"/>
+                <w:szCs w:val="16"/>
+              </w:rPr>
+              <w:t xml:space="preserve">../concurrency</w:t>
+            </w:r>
+            <w:r>
+              <w:rPr>
+                <w:rFonts w:ascii="Calibri" w:cs="Calibri" w:eastAsia="Calibri" w:hAnsi="Calibri"/>
+                <w:sz w:val="18"/>
+                <w:szCs w:val="18"/>
+              </w:rPr>
+              <w:t xml:space="preserve">), WebSocket behavior (</w:t>
+            </w:r>
+            <w:r>
+              <w:rPr>
+                <w:rFonts w:ascii="Consolas" w:cs="Consolas" w:eastAsia="Consolas" w:hAnsi="Consolas"/>
+                <w:color w:val="5B2C6F"/>
+                <w:sz w:val="16"/>
+                <w:szCs w:val="16"/>
+              </w:rPr>
+              <w:t xml:space="preserve">../websocket</w:t>
+            </w:r>
+            <w:r>
+              <w:rPr>
+                <w:rFonts w:ascii="Calibri" w:cs="Calibri" w:eastAsia="Calibri" w:hAnsi="Calibri"/>
+                <w:sz w:val="18"/>
+                <w:szCs w:val="18"/>
+              </w:rPr>
+              <w:t xml:space="preserve">), Storage (</w:t>
+            </w:r>
+            <w:r>
+              <w:rPr>
+                <w:rFonts w:ascii="Consolas" w:cs="Consolas" w:eastAsia="Consolas" w:hAnsi="Consolas"/>
+                <w:color w:val="5B2C6F"/>
+                <w:sz w:val="16"/>
+                <w:szCs w:val="16"/>
+              </w:rPr>
+              <w:t xml:space="preserve">../storage</w:t>
+            </w:r>
+            <w:r>
+              <w:rPr>
+                <w:rFonts w:ascii="Calibri" w:cs="Calibri" w:eastAsia="Calibri" w:hAnsi="Calibri"/>
+                <w:sz w:val="18"/>
+                <w:szCs w:val="18"/>
+              </w:rPr>
+              <w:t xml:space="preserve">), </w:t>
+            </w:r>
+            <w:r>
+              <w:rPr>
+                <w:rFonts w:ascii="Calibri" w:cs="Calibri" w:eastAsia="Calibri" w:hAnsi="Calibri"/>
+                <w:b/>
+                <w:bCs/>
+                <w:sz w:val="18"/>
+                <w:szCs w:val="18"/>
+              </w:rPr>
+              <w:t xml:space="preserve">Logging &amp; Observability</w:t>
+            </w:r>
+            <w:r>
+              <w:rPr>
+                <w:rFonts w:ascii="Calibri" w:cs="Calibri" w:eastAsia="Calibri" w:hAnsi="Calibri"/>
+                <w:sz w:val="18"/>
+                <w:szCs w:val="18"/>
+              </w:rPr>
+              <w:t xml:space="preserve"> (</w:t>
+            </w:r>
+            <w:r>
+              <w:rPr>
+                <w:rFonts w:ascii="Consolas" w:cs="Consolas" w:eastAsia="Consolas" w:hAnsi="Consolas"/>
+                <w:color w:val="5B2C6F"/>
+                <w:sz w:val="16"/>
+                <w:szCs w:val="16"/>
+              </w:rPr>
+              <w:t xml:space="preserve">../logging</w:t>
+            </w:r>
+            <w:r>
+              <w:rPr>
+                <w:rFonts w:ascii="Calibri" w:cs="Calibri" w:eastAsia="Calibri" w:hAnsi="Calibri"/>
+                <w:sz w:val="18"/>
+                <w:szCs w:val="18"/>
+              </w:rPr>
+              <w:t xml:space="preserve">)</w:t>
             </w:r>
           </w:p>
         </w:tc>
@@ -440,8 +584,8 @@
         </w:tblBorders>
       </w:tblPr>
       <w:tblGrid>
-        <w:gridCol w:w="4711"/>
-        <w:gridCol w:w="4927"/>
+        <w:gridCol w:w="4965"/>
+        <w:gridCol w:w="4673"/>
       </w:tblGrid>
       <w:tr>
         <w:trPr>
@@ -449,7 +593,7 @@
         </w:trPr>
         <w:tc>
           <w:tcPr>
-            <w:tcW w:type="dxa" w:w="4711"/>
+            <w:tcW w:type="dxa" w:w="4965"/>
             <w:tcBorders>
               <w:top w:val="single" w:color="BFBFBF" w:sz="4"/>
               <w:left w:val="single" w:color="BFBFBF" w:sz="4"/>
@@ -479,7 +623,7 @@
         </w:tc>
         <w:tc>
           <w:tcPr>
-            <w:tcW w:type="dxa" w:w="4927"/>
+            <w:tcW w:type="dxa" w:w="4673"/>
             <w:tcBorders>
               <w:top w:val="single" w:color="BFBFBF" w:sz="4"/>
               <w:left w:val="single" w:color="BFBFBF" w:sz="4"/>
@@ -511,7 +655,7 @@
       <w:tr>
         <w:tc>
           <w:tcPr>
-            <w:tcW w:type="dxa" w:w="4711"/>
+            <w:tcW w:type="dxa" w:w="4965"/>
             <w:tcBorders>
               <w:top w:val="single" w:color="BFBFBF" w:sz="4"/>
               <w:left w:val="single" w:color="BFBFBF" w:sz="4"/>
@@ -538,7 +682,7 @@
         </w:tc>
         <w:tc>
           <w:tcPr>
-            <w:tcW w:type="dxa" w:w="4927"/>
+            <w:tcW w:type="dxa" w:w="4673"/>
             <w:tcBorders>
               <w:top w:val="single" w:color="BFBFBF" w:sz="4"/>
               <w:left w:val="single" w:color="BFBFBF" w:sz="4"/>
@@ -569,7 +713,7 @@
       <w:tr>
         <w:tc>
           <w:tcPr>
-            <w:tcW w:type="dxa" w:w="4711"/>
+            <w:tcW w:type="dxa" w:w="4965"/>
             <w:tcBorders>
               <w:top w:val="single" w:color="BFBFBF" w:sz="4"/>
               <w:left w:val="single" w:color="BFBFBF" w:sz="4"/>
@@ -596,7 +740,7 @@
         </w:tc>
         <w:tc>
           <w:tcPr>
-            <w:tcW w:type="dxa" w:w="4927"/>
+            <w:tcW w:type="dxa" w:w="4673"/>
             <w:tcBorders>
               <w:top w:val="single" w:color="BFBFBF" w:sz="4"/>
               <w:left w:val="single" w:color="BFBFBF" w:sz="4"/>
@@ -627,7 +771,7 @@
       <w:tr>
         <w:tc>
           <w:tcPr>
-            <w:tcW w:type="dxa" w:w="4711"/>
+            <w:tcW w:type="dxa" w:w="4965"/>
             <w:tcBorders>
               <w:top w:val="single" w:color="BFBFBF" w:sz="4"/>
               <w:left w:val="single" w:color="BFBFBF" w:sz="4"/>
@@ -654,7 +798,7 @@
         </w:tc>
         <w:tc>
           <w:tcPr>
-            <w:tcW w:type="dxa" w:w="4927"/>
+            <w:tcW w:type="dxa" w:w="4673"/>
             <w:tcBorders>
               <w:top w:val="single" w:color="BFBFBF" w:sz="4"/>
               <w:left w:val="single" w:color="BFBFBF" w:sz="4"/>
@@ -685,7 +829,7 @@
       <w:tr>
         <w:tc>
           <w:tcPr>
-            <w:tcW w:type="dxa" w:w="4711"/>
+            <w:tcW w:type="dxa" w:w="4965"/>
             <w:tcBorders>
               <w:top w:val="single" w:color="BFBFBF" w:sz="4"/>
               <w:left w:val="single" w:color="BFBFBF" w:sz="4"/>
@@ -712,7 +856,7 @@
         </w:tc>
         <w:tc>
           <w:tcPr>
-            <w:tcW w:type="dxa" w:w="4927"/>
+            <w:tcW w:type="dxa" w:w="4673"/>
             <w:tcBorders>
               <w:top w:val="single" w:color="BFBFBF" w:sz="4"/>
               <w:left w:val="single" w:color="BFBFBF" w:sz="4"/>
@@ -743,7 +887,7 @@
       <w:tr>
         <w:tc>
           <w:tcPr>
-            <w:tcW w:type="dxa" w:w="4711"/>
+            <w:tcW w:type="dxa" w:w="4965"/>
             <w:tcBorders>
               <w:top w:val="single" w:color="BFBFBF" w:sz="4"/>
               <w:left w:val="single" w:color="BFBFBF" w:sz="4"/>
@@ -770,7 +914,7 @@
         </w:tc>
         <w:tc>
           <w:tcPr>
-            <w:tcW w:type="dxa" w:w="4927"/>
+            <w:tcW w:type="dxa" w:w="4673"/>
             <w:tcBorders>
               <w:top w:val="single" w:color="BFBFBF" w:sz="4"/>
               <w:left w:val="single" w:color="BFBFBF" w:sz="4"/>
@@ -801,7 +945,7 @@
       <w:tr>
         <w:tc>
           <w:tcPr>
-            <w:tcW w:type="dxa" w:w="4711"/>
+            <w:tcW w:type="dxa" w:w="4965"/>
             <w:tcBorders>
               <w:top w:val="single" w:color="BFBFBF" w:sz="4"/>
               <w:left w:val="single" w:color="BFBFBF" w:sz="4"/>
@@ -828,7 +972,7 @@
         </w:tc>
         <w:tc>
           <w:tcPr>
-            <w:tcW w:type="dxa" w:w="4927"/>
+            <w:tcW w:type="dxa" w:w="4673"/>
             <w:tcBorders>
               <w:top w:val="single" w:color="BFBFBF" w:sz="4"/>
               <w:left w:val="single" w:color="BFBFBF" w:sz="4"/>
@@ -852,6 +996,238 @@
                 <w:u w:val="single"/>
               </w:rPr>
               <w:t xml:space="preserve">§10 Deployment</w:t>
+            </w:r>
+          </w:p>
+        </w:tc>
+      </w:tr>
+      <w:tr>
+        <w:tc>
+          <w:tcPr>
+            <w:tcW w:type="dxa" w:w="4965"/>
+            <w:tcBorders>
+              <w:top w:val="single" w:color="BFBFBF" w:sz="4"/>
+              <w:left w:val="single" w:color="BFBFBF" w:sz="4"/>
+              <w:bottom w:val="single" w:color="BFBFBF" w:sz="4"/>
+              <w:right w:val="single" w:color="BFBFBF" w:sz="4"/>
+            </w:tcBorders>
+            <w:tcMar>
+              <w:top w:type="dxa" w:w="60"/>
+              <w:left w:type="dxa" w:w="100"/>
+              <w:bottom w:type="dxa" w:w="60"/>
+              <w:right w:type="dxa" w:w="100"/>
+            </w:tcMar>
+          </w:tcPr>
+          <w:p>
+            <w:r>
+              <w:rPr>
+                <w:rFonts w:ascii="Calibri" w:cs="Calibri" w:eastAsia="Calibri" w:hAnsi="Calibri"/>
+                <w:sz w:val="18"/>
+                <w:szCs w:val="18"/>
+              </w:rPr>
+              <w:t xml:space="preserve">7 / 8. Concurrency</w:t>
+            </w:r>
+          </w:p>
+        </w:tc>
+        <w:tc>
+          <w:tcPr>
+            <w:tcW w:type="dxa" w:w="4673"/>
+            <w:tcBorders>
+              <w:top w:val="single" w:color="BFBFBF" w:sz="4"/>
+              <w:left w:val="single" w:color="BFBFBF" w:sz="4"/>
+              <w:bottom w:val="single" w:color="BFBFBF" w:sz="4"/>
+              <w:right w:val="single" w:color="BFBFBF" w:sz="4"/>
+            </w:tcBorders>
+            <w:tcMar>
+              <w:top w:type="dxa" w:w="60"/>
+              <w:left w:type="dxa" w:w="100"/>
+              <w:bottom w:type="dxa" w:w="60"/>
+              <w:right w:type="dxa" w:w="100"/>
+            </w:tcMar>
+          </w:tcPr>
+          <w:p>
+            <w:r>
+              <w:rPr>
+                <w:rFonts w:ascii="Calibri" w:cs="Calibri" w:eastAsia="Calibri" w:hAnsi="Calibri"/>
+                <w:color w:val="0563C1"/>
+                <w:sz w:val="18"/>
+                <w:szCs w:val="18"/>
+                <w:u w:val="single"/>
+              </w:rPr>
+              <w:t xml:space="preserve">§9.1 Concurrency and performance</w:t>
+            </w:r>
+          </w:p>
+        </w:tc>
+      </w:tr>
+      <w:tr>
+        <w:tc>
+          <w:tcPr>
+            <w:tcW w:type="dxa" w:w="4965"/>
+            <w:tcBorders>
+              <w:top w:val="single" w:color="BFBFBF" w:sz="4"/>
+              <w:left w:val="single" w:color="BFBFBF" w:sz="4"/>
+              <w:bottom w:val="single" w:color="BFBFBF" w:sz="4"/>
+              <w:right w:val="single" w:color="BFBFBF" w:sz="4"/>
+            </w:tcBorders>
+            <w:tcMar>
+              <w:top w:type="dxa" w:w="60"/>
+              <w:left w:type="dxa" w:w="100"/>
+              <w:bottom w:type="dxa" w:w="60"/>
+              <w:right w:type="dxa" w:w="100"/>
+            </w:tcMar>
+          </w:tcPr>
+          <w:p>
+            <w:r>
+              <w:rPr>
+                <w:rFonts w:ascii="Calibri" w:cs="Calibri" w:eastAsia="Calibri" w:hAnsi="Calibri"/>
+                <w:sz w:val="18"/>
+                <w:szCs w:val="18"/>
+              </w:rPr>
+              <w:t xml:space="preserve">9. WebSocket — Connection &amp; Outbox</w:t>
+            </w:r>
+          </w:p>
+        </w:tc>
+        <w:tc>
+          <w:tcPr>
+            <w:tcW w:type="dxa" w:w="4673"/>
+            <w:tcBorders>
+              <w:top w:val="single" w:color="BFBFBF" w:sz="4"/>
+              <w:left w:val="single" w:color="BFBFBF" w:sz="4"/>
+              <w:bottom w:val="single" w:color="BFBFBF" w:sz="4"/>
+              <w:right w:val="single" w:color="BFBFBF" w:sz="4"/>
+            </w:tcBorders>
+            <w:tcMar>
+              <w:top w:type="dxa" w:w="60"/>
+              <w:left w:type="dxa" w:w="100"/>
+              <w:bottom w:type="dxa" w:w="60"/>
+              <w:right w:type="dxa" w:w="100"/>
+            </w:tcMar>
+          </w:tcPr>
+          <w:p>
+            <w:r>
+              <w:rPr>
+                <w:rFonts w:ascii="Calibri" w:cs="Calibri" w:eastAsia="Calibri" w:hAnsi="Calibri"/>
+                <w:color w:val="0563C1"/>
+                <w:sz w:val="18"/>
+                <w:szCs w:val="18"/>
+                <w:u w:val="single"/>
+              </w:rPr>
+              <w:t xml:space="preserve">§9.2 Reliability</w:t>
+            </w:r>
+          </w:p>
+        </w:tc>
+      </w:tr>
+      <w:tr>
+        <w:tc>
+          <w:tcPr>
+            <w:tcW w:type="dxa" w:w="4965"/>
+            <w:tcBorders>
+              <w:top w:val="single" w:color="BFBFBF" w:sz="4"/>
+              <w:left w:val="single" w:color="BFBFBF" w:sz="4"/>
+              <w:bottom w:val="single" w:color="BFBFBF" w:sz="4"/>
+              <w:right w:val="single" w:color="BFBFBF" w:sz="4"/>
+            </w:tcBorders>
+            <w:tcMar>
+              <w:top w:type="dxa" w:w="60"/>
+              <w:left w:type="dxa" w:w="100"/>
+              <w:bottom w:type="dxa" w:w="60"/>
+              <w:right w:type="dxa" w:w="100"/>
+            </w:tcMar>
+          </w:tcPr>
+          <w:p>
+            <w:r>
+              <w:rPr>
+                <w:rFonts w:ascii="Calibri" w:cs="Calibri" w:eastAsia="Calibri" w:hAnsi="Calibri"/>
+                <w:sz w:val="18"/>
+                <w:szCs w:val="18"/>
+              </w:rPr>
+              <w:t xml:space="preserve">10. Storage</w:t>
+            </w:r>
+          </w:p>
+        </w:tc>
+        <w:tc>
+          <w:tcPr>
+            <w:tcW w:type="dxa" w:w="4673"/>
+            <w:tcBorders>
+              <w:top w:val="single" w:color="BFBFBF" w:sz="4"/>
+              <w:left w:val="single" w:color="BFBFBF" w:sz="4"/>
+              <w:bottom w:val="single" w:color="BFBFBF" w:sz="4"/>
+              <w:right w:val="single" w:color="BFBFBF" w:sz="4"/>
+            </w:tcBorders>
+            <w:tcMar>
+              <w:top w:type="dxa" w:w="60"/>
+              <w:left w:type="dxa" w:w="100"/>
+              <w:bottom w:type="dxa" w:w="60"/>
+              <w:right w:type="dxa" w:w="100"/>
+            </w:tcMar>
+          </w:tcPr>
+          <w:p>
+            <w:r>
+              <w:rPr>
+                <w:rFonts w:ascii="Calibri" w:cs="Calibri" w:eastAsia="Calibri" w:hAnsi="Calibri"/>
+                <w:color w:val="0563C1"/>
+                <w:sz w:val="18"/>
+                <w:szCs w:val="18"/>
+                <w:u w:val="single"/>
+              </w:rPr>
+              <w:t xml:space="preserve">§5.1 Data model</w:t>
+            </w:r>
+          </w:p>
+        </w:tc>
+      </w:tr>
+      <w:tr>
+        <w:tc>
+          <w:tcPr>
+            <w:tcW w:type="dxa" w:w="4965"/>
+            <w:tcBorders>
+              <w:top w:val="single" w:color="BFBFBF" w:sz="4"/>
+              <w:left w:val="single" w:color="BFBFBF" w:sz="4"/>
+              <w:bottom w:val="single" w:color="BFBFBF" w:sz="4"/>
+              <w:right w:val="single" w:color="BFBFBF" w:sz="4"/>
+            </w:tcBorders>
+            <w:tcMar>
+              <w:top w:type="dxa" w:w="60"/>
+              <w:left w:type="dxa" w:w="100"/>
+              <w:bottom w:type="dxa" w:w="60"/>
+              <w:right w:type="dxa" w:w="100"/>
+            </w:tcMar>
+          </w:tcPr>
+          <w:p>
+            <w:r>
+              <w:rPr>
+                <w:rFonts w:ascii="Calibri" w:cs="Calibri" w:eastAsia="Calibri" w:hAnsi="Calibri"/>
+                <w:sz w:val="18"/>
+                <w:szCs w:val="18"/>
+              </w:rPr>
+              <w:t xml:space="preserve">11. Logging</w:t>
+            </w:r>
+          </w:p>
+        </w:tc>
+        <w:tc>
+          <w:tcPr>
+            <w:tcW w:type="dxa" w:w="4673"/>
+            <w:tcBorders>
+              <w:top w:val="single" w:color="BFBFBF" w:sz="4"/>
+              <w:left w:val="single" w:color="BFBFBF" w:sz="4"/>
+              <w:bottom w:val="single" w:color="BFBFBF" w:sz="4"/>
+              <w:right w:val="single" w:color="BFBFBF" w:sz="4"/>
+            </w:tcBorders>
+            <w:tcMar>
+              <w:top w:type="dxa" w:w="60"/>
+              <w:left w:type="dxa" w:w="100"/>
+              <w:bottom w:type="dxa" w:w="60"/>
+              <w:right w:type="dxa" w:w="100"/>
+            </w:tcMar>
+          </w:tcPr>
+          <w:p>
+            <w:r>
+              <w:rPr>
+                <w:rFonts w:ascii="Calibri" w:cs="Calibri" w:eastAsia="Calibri" w:hAnsi="Calibri"/>
+                <w:color w:val="0563C1"/>
+                <w:sz w:val="18"/>
+                <w:szCs w:val="18"/>
+                <w:u w:val="single"/>
+              </w:rPr>
+              <w:t xml:space="preserve">§9.4 Observability</w:t>
             </w:r>
           </w:p>
         </w:tc>
@@ -2214,7 +2590,43 @@
                 <w:sz w:val="18"/>
                 <w:szCs w:val="18"/>
               </w:rPr>
-              <w:t xml:space="preserve">—</w:t>
+              <w:t xml:space="preserve">Meaningful logs for lifecycle, failures and retries (plus: logs in </w:t>
+            </w:r>
+            <w:r>
+              <w:rPr>
+                <w:rFonts w:ascii="Calibri" w:cs="Calibri" w:eastAsia="Calibri" w:hAnsi="Calibri"/>
+                <w:b/>
+                <w:bCs/>
+                <w:sz w:val="18"/>
+                <w:szCs w:val="18"/>
+              </w:rPr>
+              <w:t xml:space="preserve">MongoDB</w:t>
+            </w:r>
+            <w:r>
+              <w:rPr>
+                <w:rFonts w:ascii="Calibri" w:cs="Calibri" w:eastAsia="Calibri" w:hAnsi="Calibri"/>
+                <w:sz w:val="18"/>
+                <w:szCs w:val="18"/>
+              </w:rPr>
+              <w:t xml:space="preserve"> and on the </w:t>
+            </w:r>
+            <w:r>
+              <w:rPr>
+                <w:rFonts w:ascii="Calibri" w:cs="Calibri" w:eastAsia="Calibri" w:hAnsi="Calibri"/>
+                <w:b/>
+                <w:bCs/>
+                <w:sz w:val="18"/>
+                <w:szCs w:val="18"/>
+              </w:rPr>
+              <w:t xml:space="preserve">console</w:t>
+            </w:r>
+            <w:r>
+              <w:rPr>
+                <w:rFonts w:ascii="Calibri" w:cs="Calibri" w:eastAsia="Calibri" w:hAnsi="Calibri"/>
+                <w:sz w:val="18"/>
+                <w:szCs w:val="18"/>
+              </w:rPr>
+              <w:t xml:space="preserve">, Debug / Information / Error levels)</w:t>
             </w:r>
           </w:p>
         </w:tc>
@@ -2241,7 +2653,75 @@
                 <w:sz w:val="18"/>
                 <w:szCs w:val="18"/>
               </w:rPr>
-              <w:t xml:space="preserve">Structured logs (Serilog), end-to-end correlation id, liveness and readiness health checks</w:t>
+              <w:t xml:space="preserve">One Serilog pipeline: console ≥ Information, MongoDB </w:t>
+            </w:r>
+            <w:r>
+              <w:rPr>
+                <w:rFonts w:ascii="Consolas" w:cs="Consolas" w:eastAsia="Consolas" w:hAnsi="Consolas"/>
+                <w:color w:val="5B2C6F"/>
+                <w:sz w:val="16"/>
+                <w:szCs w:val="16"/>
+              </w:rPr>
+              <w:t xml:space="preserve">ta9_logs.logs</w:t>
+            </w:r>
+            <w:r>
+              <w:rPr>
+                <w:rFonts w:ascii="Calibri" w:cs="Calibri" w:eastAsia="Calibri" w:hAnsi="Calibri"/>
+                <w:sz w:val="18"/>
+                <w:szCs w:val="18"/>
+              </w:rPr>
+              <w:t xml:space="preserve"> ≥ Debug (batched, non-blocking, 7-day TTL); </w:t>
+            </w:r>
+            <w:r>
+              <w:rPr>
+                <w:rFonts w:ascii="Consolas" w:cs="Consolas" w:eastAsia="Consolas" w:hAnsi="Consolas"/>
+                <w:color w:val="5B2C6F"/>
+                <w:sz w:val="16"/>
+                <w:szCs w:val="16"/>
+              </w:rPr>
+              <w:t xml:space="preserve">Service</w:t>
+            </w:r>
+            <w:r>
+              <w:rPr>
+                <w:rFonts w:ascii="Calibri" w:cs="Calibri" w:eastAsia="Calibri" w:hAnsi="Calibri"/>
+                <w:sz w:val="18"/>
+                <w:szCs w:val="18"/>
+              </w:rPr>
+              <w:t xml:space="preserve"> / </w:t>
+            </w:r>
+            <w:r>
+              <w:rPr>
+                <w:rFonts w:ascii="Consolas" w:cs="Consolas" w:eastAsia="Consolas" w:hAnsi="Consolas"/>
+                <w:color w:val="5B2C6F"/>
+                <w:sz w:val="16"/>
+                <w:szCs w:val="16"/>
+              </w:rPr>
+              <w:t xml:space="preserve">CorrelationId</w:t>
+            </w:r>
+            <w:r>
+              <w:rPr>
+                <w:rFonts w:ascii="Calibri" w:cs="Calibri" w:eastAsia="Calibri" w:hAnsi="Calibri"/>
+                <w:sz w:val="18"/>
+                <w:szCs w:val="18"/>
+              </w:rPr>
+              <w:t xml:space="preserve"> / </w:t>
+            </w:r>
+            <w:r>
+              <w:rPr>
+                <w:rFonts w:ascii="Consolas" w:cs="Consolas" w:eastAsia="Consolas" w:hAnsi="Consolas"/>
+                <w:color w:val="5B2C6F"/>
+                <w:sz w:val="16"/>
+                <w:szCs w:val="16"/>
+              </w:rPr>
+              <w:t xml:space="preserve">JobId</w:t>
+            </w:r>
+            <w:r>
+              <w:rPr>
+                <w:rFonts w:ascii="Calibri" w:cs="Calibri" w:eastAsia="Calibri" w:hAnsi="Calibri"/>
+                <w:sz w:val="18"/>
+                <w:szCs w:val="18"/>
+              </w:rPr>
+              <w:t xml:space="preserve"> on every record; health checks</w:t>
             </w:r>
           </w:p>
         </w:tc>
@@ -2311,7 +2791,7 @@
                     </pic:cNvPicPr>
                   </pic:nvPicPr>
                   <pic:blipFill>
-                    <a:blip r:embed="rId26" cstate="none"/>
+                    <a:blip r:embed="rId28" cstate="none"/>
                     <a:srcRect/>
                     <a:stretch>
                       <a:fillRect/>
@@ -3157,7 +3637,7 @@
                 <w:sz w:val="18"/>
                 <w:szCs w:val="18"/>
               </w:rPr>
-              <w:t xml:space="preserve">Serilog, correlation id, ProblemDetails, health endpoints, exponential backoff</w:t>
+              <w:t xml:space="preserve">Logging pipeline (Serilog → console + batched MongoDB sink), lifecycle / crash logging, correlation id, ProblemDetails, health endpoints, exponential backoff</w:t>
             </w:r>
           </w:p>
         </w:tc>
@@ -3184,7 +3664,41 @@
                 <w:sz w:val="18"/>
                 <w:szCs w:val="18"/>
               </w:rPr>
-              <w:t xml:space="preserve">—</w:t>
+              <w:t xml:space="preserve">MongoDB </w:t>
+            </w:r>
+            <w:r>
+              <w:rPr>
+                <w:rFonts w:ascii="Consolas" w:cs="Consolas" w:eastAsia="Consolas" w:hAnsi="Consolas"/>
+                <w:color w:val="5B2C6F"/>
+                <w:sz w:val="16"/>
+                <w:szCs w:val="16"/>
+              </w:rPr>
+              <w:t xml:space="preserve">ta9_logs</w:t>
+            </w:r>
+            <w:r>
+              <w:rPr>
+                <w:rFonts w:ascii="Calibri" w:cs="Calibri" w:eastAsia="Calibri" w:hAnsi="Calibri"/>
+                <w:sz w:val="18"/>
+                <w:szCs w:val="18"/>
+              </w:rPr>
+              <w:t xml:space="preserve"> (</w:t>
+            </w:r>
+            <w:r>
+              <w:rPr>
+                <w:rFonts w:ascii="Consolas" w:cs="Consolas" w:eastAsia="Consolas" w:hAnsi="Consolas"/>
+                <w:color w:val="5B2C6F"/>
+                <w:sz w:val="16"/>
+                <w:szCs w:val="16"/>
+              </w:rPr>
+              <w:t xml:space="preserve">logs</w:t>
+            </w:r>
+            <w:r>
+              <w:rPr>
+                <w:rFonts w:ascii="Calibri" w:cs="Calibri" w:eastAsia="Calibri" w:hAnsi="Calibri"/>
+                <w:sz w:val="18"/>
+                <w:szCs w:val="18"/>
+              </w:rPr>
+              <w:t xml:space="preserve">, shared by all services)</w:t>
             </w:r>
           </w:p>
         </w:tc>
@@ -3211,7 +3725,7 @@
                 <w:sz w:val="18"/>
                 <w:szCs w:val="18"/>
               </w:rPr>
-              <w:t xml:space="preserve">—</w:t>
+              <w:t xml:space="preserve">MongoDB (logs)</w:t>
             </w:r>
           </w:p>
         </w:tc>
@@ -5436,7 +5950,7 @@
                     </pic:cNvPicPr>
                   </pic:nvPicPr>
                   <pic:blipFill>
-                    <a:blip r:embed="rId27" cstate="none"/>
+                    <a:blip r:embed="rId29" cstate="none"/>
                     <a:srcRect/>
                     <a:stretch>
                       <a:fillRect/>
@@ -5569,7 +6083,7 @@
                     </pic:cNvPicPr>
                   </pic:nvPicPr>
                   <pic:blipFill>
-                    <a:blip r:embed="rId28" cstate="none"/>
+                    <a:blip r:embed="rId30" cstate="none"/>
                     <a:srcRect/>
                     <a:stretch>
                       <a:fillRect/>
@@ -6312,6 +6826,238 @@
           </w:p>
         </w:tc>
       </w:tr>
+      <w:tr>
+        <w:tc>
+          <w:tcPr>
+            <w:tcW w:type="dxa" w:w="1052"/>
+            <w:tcBorders>
+              <w:top w:val="single" w:color="BFBFBF" w:sz="4"/>
+              <w:left w:val="single" w:color="BFBFBF" w:sz="4"/>
+              <w:bottom w:val="single" w:color="BFBFBF" w:sz="4"/>
+              <w:right w:val="single" w:color="BFBFBF" w:sz="4"/>
+            </w:tcBorders>
+            <w:tcMar>
+              <w:top w:type="dxa" w:w="60"/>
+              <w:left w:type="dxa" w:w="100"/>
+              <w:bottom w:type="dxa" w:w="60"/>
+              <w:right w:type="dxa" w:w="100"/>
+            </w:tcMar>
+          </w:tcPr>
+          <w:p>
+            <w:r>
+              <w:rPr>
+                <w:rFonts w:ascii="Consolas" w:cs="Consolas" w:eastAsia="Consolas" w:hAnsi="Consolas"/>
+                <w:color w:val="5B2C6F"/>
+                <w:sz w:val="16"/>
+                <w:szCs w:val="16"/>
+              </w:rPr>
+              <w:t xml:space="preserve">ta9_logs.logs</w:t>
+            </w:r>
+          </w:p>
+        </w:tc>
+        <w:tc>
+          <w:tcPr>
+            <w:tcW w:type="dxa" w:w="2105"/>
+            <w:tcBorders>
+              <w:top w:val="single" w:color="BFBFBF" w:sz="4"/>
+              <w:left w:val="single" w:color="BFBFBF" w:sz="4"/>
+              <w:bottom w:val="single" w:color="BFBFBF" w:sz="4"/>
+              <w:right w:val="single" w:color="BFBFBF" w:sz="4"/>
+            </w:tcBorders>
+            <w:tcMar>
+              <w:top w:type="dxa" w:w="60"/>
+              <w:left w:type="dxa" w:w="100"/>
+              <w:bottom w:type="dxa" w:w="60"/>
+              <w:right w:type="dxa" w:w="100"/>
+            </w:tcMar>
+          </w:tcPr>
+          <w:p>
+            <w:r>
+              <w:rPr>
+                <w:rFonts w:ascii="Calibri" w:cs="Calibri" w:eastAsia="Calibri" w:hAnsi="Calibri"/>
+                <w:sz w:val="18"/>
+                <w:szCs w:val="18"/>
+              </w:rPr>
+              <w:t xml:space="preserve">ObjectId</w:t>
+            </w:r>
+          </w:p>
+        </w:tc>
+        <w:tc>
+          <w:tcPr>
+            <w:tcW w:type="dxa" w:w="3239"/>
+            <w:tcBorders>
+              <w:top w:val="single" w:color="BFBFBF" w:sz="4"/>
+              <w:left w:val="single" w:color="BFBFBF" w:sz="4"/>
+              <w:bottom w:val="single" w:color="BFBFBF" w:sz="4"/>
+              <w:right w:val="single" w:color="BFBFBF" w:sz="4"/>
+            </w:tcBorders>
+            <w:tcMar>
+              <w:top w:type="dxa" w:w="60"/>
+              <w:left w:type="dxa" w:w="100"/>
+              <w:bottom w:type="dxa" w:w="60"/>
+              <w:right w:type="dxa" w:w="100"/>
+            </w:tcMar>
+          </w:tcPr>
+          <w:p>
+            <w:r>
+              <w:rPr>
+                <w:rFonts w:ascii="Calibri" w:cs="Calibri" w:eastAsia="Calibri" w:hAnsi="Calibri"/>
+                <w:sz w:val="18"/>
+                <w:szCs w:val="18"/>
+              </w:rPr>
+              <w:t xml:space="preserve">timestamp, level, service, host, message, messageTemplate, sourceContext, </w:t>
+            </w:r>
+            <w:r>
+              <w:rPr>
+                <w:rFonts w:ascii="Consolas" w:cs="Consolas" w:eastAsia="Consolas" w:hAnsi="Consolas"/>
+                <w:color w:val="5B2C6F"/>
+                <w:sz w:val="16"/>
+                <w:szCs w:val="16"/>
+              </w:rPr>
+              <w:t xml:space="preserve">correlationId</w:t>
+            </w:r>
+            <w:r>
+              <w:rPr>
+                <w:rFonts w:ascii="Calibri" w:cs="Calibri" w:eastAsia="Calibri" w:hAnsi="Calibri"/>
+                <w:sz w:val="18"/>
+                <w:szCs w:val="18"/>
+              </w:rPr>
+              <w:t xml:space="preserve">, </w:t>
+            </w:r>
+            <w:r>
+              <w:rPr>
+                <w:rFonts w:ascii="Consolas" w:cs="Consolas" w:eastAsia="Consolas" w:hAnsi="Consolas"/>
+                <w:color w:val="5B2C6F"/>
+                <w:sz w:val="16"/>
+                <w:szCs w:val="16"/>
+              </w:rPr>
+              <w:t xml:space="preserve">jobId</w:t>
+            </w:r>
+            <w:r>
+              <w:rPr>
+                <w:rFonts w:ascii="Calibri" w:cs="Calibri" w:eastAsia="Calibri" w:hAnsi="Calibri"/>
+                <w:sz w:val="18"/>
+                <w:szCs w:val="18"/>
+              </w:rPr>
+              <w:t xml:space="preserve">, exception, properties</w:t>
+            </w:r>
+          </w:p>
+        </w:tc>
+        <w:tc>
+          <w:tcPr>
+            <w:tcW w:type="dxa" w:w="3242"/>
+            <w:tcBorders>
+              <w:top w:val="single" w:color="BFBFBF" w:sz="4"/>
+              <w:left w:val="single" w:color="BFBFBF" w:sz="4"/>
+              <w:bottom w:val="single" w:color="BFBFBF" w:sz="4"/>
+              <w:right w:val="single" w:color="BFBFBF" w:sz="4"/>
+            </w:tcBorders>
+            <w:tcMar>
+              <w:top w:type="dxa" w:w="60"/>
+              <w:left w:type="dxa" w:w="100"/>
+              <w:bottom w:type="dxa" w:w="60"/>
+              <w:right w:type="dxa" w:w="100"/>
+            </w:tcMar>
+          </w:tcPr>
+          <w:p>
+            <w:r>
+              <w:rPr>
+                <w:rFonts w:ascii="Calibri" w:cs="Calibri" w:eastAsia="Calibri" w:hAnsi="Calibri"/>
+                <w:b/>
+                <w:bCs/>
+                <w:sz w:val="18"/>
+                <w:szCs w:val="18"/>
+              </w:rPr>
+              <w:t xml:space="preserve">TTL</w:t>
+            </w:r>
+            <w:r>
+              <w:rPr>
+                <w:rFonts w:ascii="Calibri" w:cs="Calibri" w:eastAsia="Calibri" w:hAnsi="Calibri"/>
+                <w:sz w:val="18"/>
+                <w:szCs w:val="18"/>
+              </w:rPr>
+              <w:t xml:space="preserve"> </w:t>
+            </w:r>
+            <w:r>
+              <w:rPr>
+                <w:rFonts w:ascii="Consolas" w:cs="Consolas" w:eastAsia="Consolas" w:hAnsi="Consolas"/>
+                <w:color w:val="5B2C6F"/>
+                <w:sz w:val="16"/>
+                <w:szCs w:val="16"/>
+              </w:rPr>
+              <w:t xml:space="preserve">{timestamp}</w:t>
+            </w:r>
+            <w:r>
+              <w:rPr>
+                <w:rFonts w:ascii="Calibri" w:cs="Calibri" w:eastAsia="Calibri" w:hAnsi="Calibri"/>
+                <w:sz w:val="18"/>
+                <w:szCs w:val="18"/>
+              </w:rPr>
+              <w:t xml:space="preserve"> 7 days · </w:t>
+            </w:r>
+            <w:r>
+              <w:rPr>
+                <w:rFonts w:ascii="Consolas" w:cs="Consolas" w:eastAsia="Consolas" w:hAnsi="Consolas"/>
+                <w:color w:val="5B2C6F"/>
+                <w:sz w:val="16"/>
+                <w:szCs w:val="16"/>
+              </w:rPr>
+              <w:t xml:space="preserve">{jobId, timestamp}</w:t>
+            </w:r>
+            <w:r>
+              <w:rPr>
+                <w:rFonts w:ascii="Calibri" w:cs="Calibri" w:eastAsia="Calibri" w:hAnsi="Calibri"/>
+                <w:sz w:val="18"/>
+                <w:szCs w:val="18"/>
+              </w:rPr>
+              <w:t xml:space="preserve"> · </w:t>
+            </w:r>
+            <w:r>
+              <w:rPr>
+                <w:rFonts w:ascii="Consolas" w:cs="Consolas" w:eastAsia="Consolas" w:hAnsi="Consolas"/>
+                <w:color w:val="5B2C6F"/>
+                <w:sz w:val="16"/>
+                <w:szCs w:val="16"/>
+              </w:rPr>
+              <w:t xml:space="preserve">{correlationId, timestamp}</w:t>
+            </w:r>
+            <w:r>
+              <w:rPr>
+                <w:rFonts w:ascii="Calibri" w:cs="Calibri" w:eastAsia="Calibri" w:hAnsi="Calibri"/>
+                <w:sz w:val="18"/>
+                <w:szCs w:val="18"/>
+              </w:rPr>
+              <w:t xml:space="preserve"> · </w:t>
+            </w:r>
+            <w:r>
+              <w:rPr>
+                <w:rFonts w:ascii="Consolas" w:cs="Consolas" w:eastAsia="Consolas" w:hAnsi="Consolas"/>
+                <w:color w:val="5B2C6F"/>
+                <w:sz w:val="16"/>
+                <w:szCs w:val="16"/>
+              </w:rPr>
+              <w:t xml:space="preserve">{level, timestamp}</w:t>
+            </w:r>
+            <w:r>
+              <w:rPr>
+                <w:rFonts w:ascii="Calibri" w:cs="Calibri" w:eastAsia="Calibri" w:hAnsi="Calibri"/>
+                <w:sz w:val="18"/>
+                <w:szCs w:val="18"/>
+              </w:rPr>
+              <w:t xml:space="preserve"> · </w:t>
+            </w:r>
+            <w:r>
+              <w:rPr>
+                <w:rFonts w:ascii="Consolas" w:cs="Consolas" w:eastAsia="Consolas" w:hAnsi="Consolas"/>
+                <w:color w:val="5B2C6F"/>
+                <w:sz w:val="16"/>
+                <w:szCs w:val="16"/>
+              </w:rPr>
+              <w:t xml:space="preserve">{service, timestamp}</w:t>
+            </w:r>
+          </w:p>
+        </w:tc>
+      </w:tr>
     </w:tbl>
     <w:p>
       <w:pPr>
@@ -6375,411 +7121,6 @@
             <wp:extent cx="6124575" cy="7115175"/>
             <wp:effectExtent t="0" r="0" b="0" l="0"/>
             <wp:docPr id="4" name="Flow diagram" descr="Flow diagram" title="Flow diagram"/>
-            <wp:cNvGraphicFramePr>
-              <a:graphicFrameLocks xmlns:a="http://schemas.openxmlformats.org/drawingml/2006/main" noChangeAspect="1"/>
-            </wp:cNvGraphicFramePr>
-            <a:graphic xmlns:a="http://schemas.openxmlformats.org/drawingml/2006/main">
-              <a:graphicData uri="http://schemas.openxmlformats.org/drawingml/2006/picture">
-                <pic:pic xmlns:pic="http://schemas.openxmlformats.org/drawingml/2006/picture">
-                  <pic:nvPicPr>
-                    <pic:cNvPr id="0" name="" descr=""/>
-                    <pic:cNvPicPr>
-                      <a:picLocks noChangeAspect="1" noChangeArrowheads="1"/>
-                    </pic:cNvPicPr>
-                  </pic:nvPicPr>
-                  <pic:blipFill>
-                    <a:blip r:embed="rId29" cstate="none"/>
-                    <a:srcRect/>
-                    <a:stretch>
-                      <a:fillRect/>
-                    </a:stretch>
-                  </pic:blipFill>
-                  <pic:spPr bwMode="auto">
-                    <a:xfrm>
-                      <a:off x="0" y="0"/>
-                      <a:ext cx="6124575" cy="7115175"/>
-                    </a:xfrm>
-                    <a:prstGeom prst="rect">
-                      <a:avLst/>
-                    </a:prstGeom>
-                  </pic:spPr>
-                </pic:pic>
-              </a:graphicData>
-            </a:graphic>
-          </wp:inline>
-        </w:drawing>
-      </w:r>
-    </w:p>
-    <w:p>
-      <w:pPr>
-        <w:spacing w:before="80"/>
-        <w:jc w:val="center"/>
-        <w:sectPr>
-          <w:footerReference w:type="default" r:id="rId12"/>
-          <w:pgSz w:w="11906" w:h="16838" w:orient="portrait"/>
-          <w:pgMar w:top="1134" w:right="1134" w:bottom="1134" w:left="1134" w:header="708" w:footer="708" w:gutter="0"/>
-          <w:pgNumType/>
-          <w:docGrid w:linePitch="360"/>
-        </w:sectPr>
-      </w:pPr>
-      <w:r>
-        <w:rPr>
-          <w:rFonts w:ascii="Calibri" w:cs="Calibri" w:eastAsia="Calibri" w:hAnsi="Calibri"/>
-          <w:i/>
-          <w:iCs/>
-          <w:color w:val="808080"/>
-          <w:sz w:val="16"/>
-          <w:szCs w:val="16"/>
-        </w:rPr>
-        <w:t xml:space="preserve">draw.io page </w:t>
-      </w:r>
-      <w:r>
-        <w:rPr>
-          <w:rFonts w:ascii="Calibri" w:cs="Calibri" w:eastAsia="Calibri" w:hAnsi="Calibri"/>
-          <w:b/>
-          <w:bCs/>
-          <w:i/>
-          <w:iCs/>
-          <w:color w:val="808080"/>
-          <w:sz w:val="16"/>
-          <w:szCs w:val="16"/>
-        </w:rPr>
-        <w:t xml:space="preserve">3. Flow Diagram</w:t>
-      </w:r>
-      <w:r>
-        <w:rPr>
-          <w:rFonts w:ascii="Calibri" w:cs="Calibri" w:eastAsia="Calibri" w:hAnsi="Calibri"/>
-          <w:i/>
-          <w:iCs/>
-          <w:color w:val="808080"/>
-          <w:sz w:val="16"/>
-          <w:szCs w:val="16"/>
-        </w:rPr>
-        <w:t xml:space="preserve"> (swim lanes per service) · editable source: docs/hld/diagrams/ta9-hld.drawio</w:t>
-      </w:r>
-    </w:p>
-    <w:p>
-      <w:pPr>
-        <w:spacing w:after="120"/>
-      </w:pPr>
-      <w:r>
-        <w:rPr>
-          <w:rFonts w:ascii="Calibri" w:cs="Calibri" w:eastAsia="Calibri" w:hAnsi="Calibri"/>
-          <w:b/>
-          <w:bCs/>
-        </w:rPr>
-        <w:t xml:space="preserve">Safety net (reconciler, every 30 s):</w:t>
-      </w:r>
-      <w:r>
-        <w:rPr>
-          <w:rFonts w:ascii="Calibri" w:cs="Calibri" w:eastAsia="Calibri" w:hAnsi="Calibri"/>
-        </w:rPr>
-        <w:t xml:space="preserve"> for </w:t>
-      </w:r>
-      <w:r>
-        <w:rPr>
-          <w:rFonts w:ascii="Consolas" w:cs="Consolas" w:eastAsia="Consolas" w:hAnsi="Consolas"/>
-          <w:color w:val="5B2C6F"/>
-          <w:sz w:val="19"/>
-          <w:szCs w:val="19"/>
-        </w:rPr>
-        <w:t xml:space="preserve">Queued</w:t>
-      </w:r>
-      <w:r>
-        <w:rPr>
-          <w:rFonts w:ascii="Calibri" w:cs="Calibri" w:eastAsia="Calibri" w:hAnsi="Calibri"/>
-        </w:rPr>
-        <w:t xml:space="preserve">/</w:t>
-      </w:r>
-      <w:r>
-        <w:rPr>
-          <w:rFonts w:ascii="Consolas" w:cs="Consolas" w:eastAsia="Consolas" w:hAnsi="Consolas"/>
-          <w:color w:val="5B2C6F"/>
-          <w:sz w:val="19"/>
-          <w:szCs w:val="19"/>
-        </w:rPr>
-        <w:t xml:space="preserve">Processing</w:t>
-      </w:r>
-      <w:r>
-        <w:rPr>
-          <w:rFonts w:ascii="Calibri" w:cs="Calibri" w:eastAsia="Calibri" w:hAnsi="Calibri"/>
-        </w:rPr>
-        <w:t xml:space="preserve"> jobs silent for more than 60 s it calls </w:t>
-      </w:r>
-      <w:r>
-        <w:rPr>
-          <w:rFonts w:ascii="Consolas" w:cs="Consolas" w:eastAsia="Consolas" w:hAnsi="Consolas"/>
-          <w:color w:val="5B2C6F"/>
-          <w:sz w:val="19"/>
-          <w:szCs w:val="19"/>
-        </w:rPr>
-        <w:t xml:space="preserve">GET /api/process/{id}</w:t>
-      </w:r>
-      <w:r>
-        <w:rPr>
-          <w:rFonts w:ascii="Calibri" w:cs="Calibri" w:eastAsia="Calibri" w:hAnsi="Calibri"/>
-        </w:rPr>
-        <w:t xml:space="preserve">. Running → refresh progress. Finished → apply the result. </w:t>
-      </w:r>
-      <w:r>
-        <w:rPr>
-          <w:rFonts w:ascii="Calibri" w:cs="Calibri" w:eastAsia="Calibri" w:hAnsi="Calibri"/>
-          <w:b/>
-          <w:bCs/>
-        </w:rPr>
-        <w:t xml:space="preserve">404</w:t>
-      </w:r>
-      <w:r>
-        <w:rPr>
-          <w:rFonts w:ascii="Calibri" w:cs="Calibri" w:eastAsia="Calibri" w:hAnsi="Calibri"/>
-        </w:rPr>
-        <w:t xml:space="preserve"> (processor restarted) → back to </w:t>
-      </w:r>
-      <w:r>
-        <w:rPr>
-          <w:rFonts w:ascii="Consolas" w:cs="Consolas" w:eastAsia="Consolas" w:hAnsi="Consolas"/>
-          <w:color w:val="5B2C6F"/>
-          <w:sz w:val="19"/>
-          <w:szCs w:val="19"/>
-        </w:rPr>
-        <w:t xml:space="preserve">Pending</w:t>
-      </w:r>
-      <w:r>
-        <w:rPr>
-          <w:rFonts w:ascii="Calibri" w:cs="Calibri" w:eastAsia="Calibri" w:hAnsi="Calibri"/>
-        </w:rPr>
-        <w:t xml:space="preserve"> and redispatch (max 3, then </w:t>
-      </w:r>
-      <w:r>
-        <w:rPr>
-          <w:rFonts w:ascii="Consolas" w:cs="Consolas" w:eastAsia="Consolas" w:hAnsi="Consolas"/>
-          <w:color w:val="5B2C6F"/>
-          <w:sz w:val="19"/>
-          <w:szCs w:val="19"/>
-        </w:rPr>
-        <w:t xml:space="preserve">Failed</w:t>
-      </w:r>
-      <w:r>
-        <w:rPr>
-          <w:rFonts w:ascii="Calibri" w:cs="Calibri" w:eastAsia="Calibri" w:hAnsi="Calibri"/>
-        </w:rPr>
-        <w:t xml:space="preserve">). Processor unreachable → leave the job alone.</w:t>
-      </w:r>
-    </w:p>
-    <w:p>
-      <w:pPr>
-        <w:pStyle w:val="Heading1"/>
-        <w:sectPr>
-          <w:footerReference w:type="default" r:id="rId13"/>
-          <w:pgSz w:w="11906" w:h="16838" w:orient="portrait"/>
-          <w:pgMar w:top="1134" w:right="1134" w:bottom="1134" w:left="1134" w:header="708" w:footer="708" w:gutter="0"/>
-          <w:pgNumType/>
-          <w:docGrid w:linePitch="360"/>
-        </w:sectPr>
-      </w:pPr>
-      <w:bookmarkStart w:name="_Toc12" w:id="12"/>
-      <w:r>
-        <w:rPr>
-          <w:rFonts w:ascii="Calibri" w:cs="Calibri" w:eastAsia="Calibri" w:hAnsi="Calibri"/>
-        </w:rPr>
-        <w:t xml:space="preserve">7. Job lifecycle (state machine)</w:t>
-      </w:r>
-      <w:bookmarkEnd w:id="12"/>
-    </w:p>
-    <w:p>
-      <w:pPr>
-        <w:spacing w:after="120"/>
-      </w:pPr>
-      <w:r>
-        <w:rPr>
-          <w:rFonts w:ascii="Calibri" w:cs="Calibri" w:eastAsia="Calibri" w:hAnsi="Calibri"/>
-          <w:b/>
-          <w:bCs/>
-          <w:color w:val="1F4E79"/>
-          <w:sz w:val="26"/>
-          <w:szCs w:val="26"/>
-        </w:rPr>
-        <w:t xml:space="preserve">Job state machine</w:t>
-      </w:r>
-    </w:p>
-    <w:p>
-      <w:pPr>
-        <w:jc w:val="center"/>
-      </w:pPr>
-      <w:r>
-        <w:drawing>
-          <wp:inline distT="0" distB="0" distL="0" distR="0">
-            <wp:extent cx="8486775" cy="5229225"/>
-            <wp:effectExtent t="0" r="0" b="0" l="0"/>
-            <wp:docPr id="5" name="Job state machine" descr="Job state machine" title="Job state machine"/>
-            <wp:cNvGraphicFramePr>
-              <a:graphicFrameLocks xmlns:a="http://schemas.openxmlformats.org/drawingml/2006/main" noChangeAspect="1"/>
-            </wp:cNvGraphicFramePr>
-            <a:graphic xmlns:a="http://schemas.openxmlformats.org/drawingml/2006/main">
-              <a:graphicData uri="http://schemas.openxmlformats.org/drawingml/2006/picture">
-                <pic:pic xmlns:pic="http://schemas.openxmlformats.org/drawingml/2006/picture">
-                  <pic:nvPicPr>
-                    <pic:cNvPr id="0" name="" descr=""/>
-                    <pic:cNvPicPr>
-                      <a:picLocks noChangeAspect="1" noChangeArrowheads="1"/>
-                    </pic:cNvPicPr>
-                  </pic:nvPicPr>
-                  <pic:blipFill>
-                    <a:blip r:embed="rId30" cstate="none"/>
-                    <a:srcRect/>
-                    <a:stretch>
-                      <a:fillRect/>
-                    </a:stretch>
-                  </pic:blipFill>
-                  <pic:spPr bwMode="auto">
-                    <a:xfrm>
-                      <a:off x="0" y="0"/>
-                      <a:ext cx="8486775" cy="5229225"/>
-                    </a:xfrm>
-                    <a:prstGeom prst="rect">
-                      <a:avLst/>
-                    </a:prstGeom>
-                  </pic:spPr>
-                </pic:pic>
-              </a:graphicData>
-            </a:graphic>
-          </wp:inline>
-        </w:drawing>
-      </w:r>
-    </w:p>
-    <w:p>
-      <w:pPr>
-        <w:spacing w:before="80"/>
-        <w:jc w:val="center"/>
-        <w:sectPr>
-          <w:footerReference w:type="default" r:id="rId14"/>
-          <w:pgSz w:w="16838" w:h="11906" w:orient="landscape"/>
-          <w:pgMar w:top="1134" w:right="1134" w:bottom="1134" w:left="1134" w:header="708" w:footer="708" w:gutter="0"/>
-          <w:pgNumType/>
-          <w:docGrid w:linePitch="360"/>
-        </w:sectPr>
-      </w:pPr>
-      <w:r>
-        <w:rPr>
-          <w:rFonts w:ascii="Calibri" w:cs="Calibri" w:eastAsia="Calibri" w:hAnsi="Calibri"/>
-          <w:i/>
-          <w:iCs/>
-          <w:color w:val="808080"/>
-          <w:sz w:val="16"/>
-          <w:szCs w:val="16"/>
-        </w:rPr>
-        <w:t xml:space="preserve">draw.io page </w:t>
-      </w:r>
-      <w:r>
-        <w:rPr>
-          <w:rFonts w:ascii="Calibri" w:cs="Calibri" w:eastAsia="Calibri" w:hAnsi="Calibri"/>
-          <w:b/>
-          <w:bCs/>
-          <w:i/>
-          <w:iCs/>
-          <w:color w:val="808080"/>
-          <w:sz w:val="16"/>
-          <w:szCs w:val="16"/>
-        </w:rPr>
-        <w:t xml:space="preserve">4. Job State Machine</w:t>
-      </w:r>
-      <w:r>
-        <w:rPr>
-          <w:rFonts w:ascii="Calibri" w:cs="Calibri" w:eastAsia="Calibri" w:hAnsi="Calibri"/>
-          <w:i/>
-          <w:iCs/>
-          <w:color w:val="808080"/>
-          <w:sz w:val="16"/>
-          <w:szCs w:val="16"/>
-        </w:rPr>
-        <w:t xml:space="preserve"> · editable source: docs/hld/diagrams/ta9-hld.drawio</w:t>
-      </w:r>
-    </w:p>
-    <w:p>
-      <w:pPr>
-        <w:spacing w:after="120"/>
-      </w:pPr>
-      <w:r>
-        <w:rPr>
-          <w:rFonts w:ascii="Calibri" w:cs="Calibri" w:eastAsia="Calibri" w:hAnsi="Calibri"/>
-        </w:rPr>
-        <w:t xml:space="preserve">Terminal states accept nothing, so duplicates, replays and late events are no-ops. Every write goes through optimistic concurrency (load → mutate → replace if </w:t>
-      </w:r>
-      <w:r>
-        <w:rPr>
-          <w:rFonts w:ascii="Consolas" w:cs="Consolas" w:eastAsia="Consolas" w:hAnsi="Consolas"/>
-          <w:color w:val="5B2C6F"/>
-          <w:sz w:val="19"/>
-          <w:szCs w:val="19"/>
-        </w:rPr>
-        <w:t xml:space="preserve">version</w:t>
-      </w:r>
-      <w:r>
-        <w:rPr>
-          <w:rFonts w:ascii="Calibri" w:cs="Calibri" w:eastAsia="Calibri" w:hAnsi="Calibri"/>
-        </w:rPr>
-        <w:t xml:space="preserve"> is unchanged → retry), so the WS handler, dispatcher, reconciler and cancel requests never overwrite each other.</w:t>
-      </w:r>
-    </w:p>
-    <w:p>
-      <w:pPr>
-        <w:pStyle w:val="Heading1"/>
-      </w:pPr>
-      <w:bookmarkStart w:name="_Toc13" w:id="13"/>
-      <w:r>
-        <w:rPr>
-          <w:rFonts w:ascii="Calibri" w:cs="Calibri" w:eastAsia="Calibri" w:hAnsi="Calibri"/>
-        </w:rPr>
-        <w:t xml:space="preserve">8. Sequence diagrams</w:t>
-      </w:r>
-      <w:bookmarkEnd w:id="13"/>
-    </w:p>
-    <w:p>
-      <w:pPr>
-        <w:pStyle w:val="Heading2"/>
-        <w:sectPr>
-          <w:footerReference w:type="default" r:id="rId15"/>
-          <w:pgSz w:w="11906" w:h="16838" w:orient="portrait"/>
-          <w:pgMar w:top="1134" w:right="1134" w:bottom="1134" w:left="1134" w:header="708" w:footer="708" w:gutter="0"/>
-          <w:pgNumType/>
-          <w:docGrid w:linePitch="360"/>
-        </w:sectPr>
-      </w:pPr>
-      <w:bookmarkStart w:name="_Toc14" w:id="14"/>
-      <w:r>
-        <w:rPr>
-          <w:rFonts w:ascii="Calibri" w:cs="Calibri" w:eastAsia="Calibri" w:hAnsi="Calibri"/>
-        </w:rPr>
-        <w:t xml:space="preserve">8.1 Happy path</w:t>
-      </w:r>
-      <w:bookmarkEnd w:id="14"/>
-    </w:p>
-    <w:p>
-      <w:pPr>
-        <w:spacing w:after="120"/>
-      </w:pPr>
-      <w:r>
-        <w:rPr>
-          <w:rFonts w:ascii="Calibri" w:cs="Calibri" w:eastAsia="Calibri" w:hAnsi="Calibri"/>
-          <w:b/>
-          <w:bCs/>
-          <w:color w:val="1F4E79"/>
-          <w:sz w:val="26"/>
-          <w:szCs w:val="26"/>
-        </w:rPr>
-        <w:t xml:space="preserve">Sequence — happy path</w:t>
-      </w:r>
-    </w:p>
-    <w:p>
-      <w:pPr>
-        <w:jc w:val="center"/>
-      </w:pPr>
-      <w:r>
-        <w:drawing>
-          <wp:inline distT="0" distB="0" distL="0" distR="0">
-            <wp:extent cx="6438900" cy="5229225"/>
-            <wp:effectExtent t="0" r="0" b="0" l="0"/>
-            <wp:docPr id="6" name="Sequence — happy path" descr="Sequence — happy path" title="Sequence — happy path"/>
             <wp:cNvGraphicFramePr>
               <a:graphicFrameLocks xmlns:a="http://schemas.openxmlformats.org/drawingml/2006/main" noChangeAspect="1"/>
             </wp:cNvGraphicFramePr>
@@ -6802,7 +7143,7 @@
                   <pic:spPr bwMode="auto">
                     <a:xfrm>
                       <a:off x="0" y="0"/>
-                      <a:ext cx="6438900" cy="5229225"/>
+                      <a:ext cx="6124575" cy="7115175"/>
                     </a:xfrm>
                     <a:prstGeom prst="rect">
                       <a:avLst/>
@@ -6820,8 +7161,8 @@
         <w:spacing w:before="80"/>
         <w:jc w:val="center"/>
         <w:sectPr>
-          <w:footerReference w:type="default" r:id="rId16"/>
-          <w:pgSz w:w="16838" w:h="11906" w:orient="landscape"/>
+          <w:footerReference w:type="default" r:id="rId12"/>
+          <w:pgSz w:w="11906" w:h="16838" w:orient="portrait"/>
           <w:pgMar w:top="1134" w:right="1134" w:bottom="1134" w:left="1134" w:header="708" w:footer="708" w:gutter="0"/>
           <w:pgNumType/>
           <w:docGrid w:linePitch="360"/>
@@ -6849,7 +7190,7 @@
           <w:sz w:val="16"/>
           <w:szCs w:val="16"/>
         </w:rPr>
-        <w:t xml:space="preserve">5a. Sequence — Happy Path</w:t>
+        <w:t xml:space="preserve">3. Flow Diagram</w:t>
       </w:r>
       <w:r>
         <w:rPr>
@@ -6860,28 +7201,136 @@
           <w:sz w:val="16"/>
           <w:szCs w:val="16"/>
         </w:rPr>
-        <w:t xml:space="preserve"> (30 numbered messages, including SSE and audit) · editable source: docs/hld/diagrams/ta9-hld.drawio</w:t>
+        <w:t xml:space="preserve"> (swim lanes per service) · editable source: docs/hld/diagrams/ta9-hld.drawio</w:t>
       </w:r>
     </w:p>
     <w:p>
       <w:pPr>
-        <w:pStyle w:val="Heading2"/>
+        <w:spacing w:after="120"/>
+      </w:pPr>
+      <w:r>
+        <w:rPr>
+          <w:rFonts w:ascii="Calibri" w:cs="Calibri" w:eastAsia="Calibri" w:hAnsi="Calibri"/>
+          <w:b/>
+          <w:bCs/>
+        </w:rPr>
+        <w:t xml:space="preserve">Safety net (reconciler, every 30 s):</w:t>
+      </w:r>
+      <w:r>
+        <w:rPr>
+          <w:rFonts w:ascii="Calibri" w:cs="Calibri" w:eastAsia="Calibri" w:hAnsi="Calibri"/>
+        </w:rPr>
+        <w:t xml:space="preserve"> for </w:t>
+      </w:r>
+      <w:r>
+        <w:rPr>
+          <w:rFonts w:ascii="Consolas" w:cs="Consolas" w:eastAsia="Consolas" w:hAnsi="Consolas"/>
+          <w:color w:val="5B2C6F"/>
+          <w:sz w:val="19"/>
+          <w:szCs w:val="19"/>
+        </w:rPr>
+        <w:t xml:space="preserve">Queued</w:t>
+      </w:r>
+      <w:r>
+        <w:rPr>
+          <w:rFonts w:ascii="Calibri" w:cs="Calibri" w:eastAsia="Calibri" w:hAnsi="Calibri"/>
+        </w:rPr>
+        <w:t xml:space="preserve">/</w:t>
+      </w:r>
+      <w:r>
+        <w:rPr>
+          <w:rFonts w:ascii="Consolas" w:cs="Consolas" w:eastAsia="Consolas" w:hAnsi="Consolas"/>
+          <w:color w:val="5B2C6F"/>
+          <w:sz w:val="19"/>
+          <w:szCs w:val="19"/>
+        </w:rPr>
+        <w:t xml:space="preserve">Processing</w:t>
+      </w:r>
+      <w:r>
+        <w:rPr>
+          <w:rFonts w:ascii="Calibri" w:cs="Calibri" w:eastAsia="Calibri" w:hAnsi="Calibri"/>
+        </w:rPr>
+        <w:t xml:space="preserve"> jobs silent for more than 60 s it calls </w:t>
+      </w:r>
+      <w:r>
+        <w:rPr>
+          <w:rFonts w:ascii="Consolas" w:cs="Consolas" w:eastAsia="Consolas" w:hAnsi="Consolas"/>
+          <w:color w:val="5B2C6F"/>
+          <w:sz w:val="19"/>
+          <w:szCs w:val="19"/>
+        </w:rPr>
+        <w:t xml:space="preserve">GET /api/process/{id}</w:t>
+      </w:r>
+      <w:r>
+        <w:rPr>
+          <w:rFonts w:ascii="Calibri" w:cs="Calibri" w:eastAsia="Calibri" w:hAnsi="Calibri"/>
+        </w:rPr>
+        <w:t xml:space="preserve">. Running → refresh progress. Finished → apply the result. </w:t>
+      </w:r>
+      <w:r>
+        <w:rPr>
+          <w:rFonts w:ascii="Calibri" w:cs="Calibri" w:eastAsia="Calibri" w:hAnsi="Calibri"/>
+          <w:b/>
+          <w:bCs/>
+        </w:rPr>
+        <w:t xml:space="preserve">404</w:t>
+      </w:r>
+      <w:r>
+        <w:rPr>
+          <w:rFonts w:ascii="Calibri" w:cs="Calibri" w:eastAsia="Calibri" w:hAnsi="Calibri"/>
+        </w:rPr>
+        <w:t xml:space="preserve"> (processor restarted) → back to </w:t>
+      </w:r>
+      <w:r>
+        <w:rPr>
+          <w:rFonts w:ascii="Consolas" w:cs="Consolas" w:eastAsia="Consolas" w:hAnsi="Consolas"/>
+          <w:color w:val="5B2C6F"/>
+          <w:sz w:val="19"/>
+          <w:szCs w:val="19"/>
+        </w:rPr>
+        <w:t xml:space="preserve">Pending</w:t>
+      </w:r>
+      <w:r>
+        <w:rPr>
+          <w:rFonts w:ascii="Calibri" w:cs="Calibri" w:eastAsia="Calibri" w:hAnsi="Calibri"/>
+        </w:rPr>
+        <w:t xml:space="preserve"> and redispatch (max 3, then </w:t>
+      </w:r>
+      <w:r>
+        <w:rPr>
+          <w:rFonts w:ascii="Consolas" w:cs="Consolas" w:eastAsia="Consolas" w:hAnsi="Consolas"/>
+          <w:color w:val="5B2C6F"/>
+          <w:sz w:val="19"/>
+          <w:szCs w:val="19"/>
+        </w:rPr>
+        <w:t xml:space="preserve">Failed</w:t>
+      </w:r>
+      <w:r>
+        <w:rPr>
+          <w:rFonts w:ascii="Calibri" w:cs="Calibri" w:eastAsia="Calibri" w:hAnsi="Calibri"/>
+        </w:rPr>
+        <w:t xml:space="preserve">). Processor unreachable → leave the job alone.</w:t>
+      </w:r>
+    </w:p>
+    <w:p>
+      <w:pPr>
+        <w:pStyle w:val="Heading1"/>
         <w:sectPr>
-          <w:footerReference w:type="default" r:id="rId17"/>
+          <w:footerReference w:type="default" r:id="rId13"/>
           <w:pgSz w:w="11906" w:h="16838" w:orient="portrait"/>
           <w:pgMar w:top="1134" w:right="1134" w:bottom="1134" w:left="1134" w:header="708" w:footer="708" w:gutter="0"/>
           <w:pgNumType/>
           <w:docGrid w:linePitch="360"/>
         </w:sectPr>
       </w:pPr>
-      <w:bookmarkStart w:name="_Toc15" w:id="15"/>
-      <w:r>
-        <w:rPr>
-          <w:rFonts w:ascii="Calibri" w:cs="Calibri" w:eastAsia="Calibri" w:hAnsi="Calibri"/>
-        </w:rPr>
-        <w:t xml:space="preserve">8.2 Processor restart mid-job</w:t>
-      </w:r>
-      <w:bookmarkEnd w:id="15"/>
+      <w:bookmarkStart w:name="_Toc12" w:id="12"/>
+      <w:r>
+        <w:rPr>
+          <w:rFonts w:ascii="Calibri" w:cs="Calibri" w:eastAsia="Calibri" w:hAnsi="Calibri"/>
+        </w:rPr>
+        <w:t xml:space="preserve">7. Job lifecycle (state machine)</w:t>
+      </w:r>
+      <w:bookmarkEnd w:id="12"/>
     </w:p>
     <w:p>
       <w:pPr>
@@ -6896,7 +7345,7 @@
           <w:sz w:val="26"/>
           <w:szCs w:val="26"/>
         </w:rPr>
-        <w:t xml:space="preserve">Sequence — processor restart</w:t>
+        <w:t xml:space="preserve">Job state machine</w:t>
       </w:r>
     </w:p>
     <w:p>
@@ -6906,9 +7355,9 @@
       <w:r>
         <w:drawing>
           <wp:inline distT="0" distB="0" distL="0" distR="0">
-            <wp:extent cx="7867650" cy="5229225"/>
+            <wp:extent cx="8486775" cy="5229225"/>
             <wp:effectExtent t="0" r="0" b="0" l="0"/>
-            <wp:docPr id="7" name="Sequence — processor restart" descr="Sequence — processor restart" title="Sequence — processor restart"/>
+            <wp:docPr id="5" name="Job state machine" descr="Job state machine" title="Job state machine"/>
             <wp:cNvGraphicFramePr>
               <a:graphicFrameLocks xmlns:a="http://schemas.openxmlformats.org/drawingml/2006/main" noChangeAspect="1"/>
             </wp:cNvGraphicFramePr>
@@ -6931,7 +7380,7 @@
                   <pic:spPr bwMode="auto">
                     <a:xfrm>
                       <a:off x="0" y="0"/>
-                      <a:ext cx="7867650" cy="5229225"/>
+                      <a:ext cx="8486775" cy="5229225"/>
                     </a:xfrm>
                     <a:prstGeom prst="rect">
                       <a:avLst/>
@@ -6949,7 +7398,7 @@
         <w:spacing w:before="80"/>
         <w:jc w:val="center"/>
         <w:sectPr>
-          <w:footerReference w:type="default" r:id="rId18"/>
+          <w:footerReference w:type="default" r:id="rId14"/>
           <w:pgSz w:w="16838" w:h="11906" w:orient="landscape"/>
           <w:pgMar w:top="1134" w:right="1134" w:bottom="1134" w:left="1134" w:header="708" w:footer="708" w:gutter="0"/>
           <w:pgNumType/>
@@ -6978,7 +7427,7 @@
           <w:sz w:val="16"/>
           <w:szCs w:val="16"/>
         </w:rPr>
-        <w:t xml:space="preserve">5b. Sequence — Processor Restart</w:t>
+        <w:t xml:space="preserve">4. Job State Machine</w:t>
       </w:r>
       <w:r>
         <w:rPr>
@@ -6994,23 +7443,62 @@
     </w:p>
     <w:p>
       <w:pPr>
+        <w:spacing w:after="120"/>
+      </w:pPr>
+      <w:r>
+        <w:rPr>
+          <w:rFonts w:ascii="Calibri" w:cs="Calibri" w:eastAsia="Calibri" w:hAnsi="Calibri"/>
+        </w:rPr>
+        <w:t xml:space="preserve">Terminal states accept nothing, so duplicates, replays and late events are no-ops. Every write goes through optimistic concurrency (load → mutate → replace if </w:t>
+      </w:r>
+      <w:r>
+        <w:rPr>
+          <w:rFonts w:ascii="Consolas" w:cs="Consolas" w:eastAsia="Consolas" w:hAnsi="Consolas"/>
+          <w:color w:val="5B2C6F"/>
+          <w:sz w:val="19"/>
+          <w:szCs w:val="19"/>
+        </w:rPr>
+        <w:t xml:space="preserve">version</w:t>
+      </w:r>
+      <w:r>
+        <w:rPr>
+          <w:rFonts w:ascii="Calibri" w:cs="Calibri" w:eastAsia="Calibri" w:hAnsi="Calibri"/>
+        </w:rPr>
+        <w:t xml:space="preserve"> is unchanged → retry), so the WS handler, dispatcher, reconciler and cancel requests never overwrite each other.</w:t>
+      </w:r>
+    </w:p>
+    <w:p>
+      <w:pPr>
+        <w:pStyle w:val="Heading1"/>
+      </w:pPr>
+      <w:bookmarkStart w:name="_Toc13" w:id="13"/>
+      <w:r>
+        <w:rPr>
+          <w:rFonts w:ascii="Calibri" w:cs="Calibri" w:eastAsia="Calibri" w:hAnsi="Calibri"/>
+        </w:rPr>
+        <w:t xml:space="preserve">8. Sequence diagrams</w:t>
+      </w:r>
+      <w:bookmarkEnd w:id="13"/>
+    </w:p>
+    <w:p>
+      <w:pPr>
         <w:pStyle w:val="Heading2"/>
         <w:sectPr>
-          <w:footerReference w:type="default" r:id="rId19"/>
+          <w:footerReference w:type="default" r:id="rId15"/>
           <w:pgSz w:w="11906" w:h="16838" w:orient="portrait"/>
           <w:pgMar w:top="1134" w:right="1134" w:bottom="1134" w:left="1134" w:header="708" w:footer="708" w:gutter="0"/>
           <w:pgNumType/>
           <w:docGrid w:linePitch="360"/>
         </w:sectPr>
       </w:pPr>
-      <w:bookmarkStart w:name="_Toc16" w:id="16"/>
-      <w:r>
-        <w:rPr>
-          <w:rFonts w:ascii="Calibri" w:cs="Calibri" w:eastAsia="Calibri" w:hAnsi="Calibri"/>
-        </w:rPr>
-        <w:t xml:space="preserve">8.3 WebSocket disconnect, reconnect and replay</w:t>
-      </w:r>
-      <w:bookmarkEnd w:id="16"/>
+      <w:bookmarkStart w:name="_Toc14" w:id="14"/>
+      <w:r>
+        <w:rPr>
+          <w:rFonts w:ascii="Calibri" w:cs="Calibri" w:eastAsia="Calibri" w:hAnsi="Calibri"/>
+        </w:rPr>
+        <w:t xml:space="preserve">8.1 Happy path</w:t>
+      </w:r>
+      <w:bookmarkEnd w:id="14"/>
     </w:p>
     <w:p>
       <w:pPr>
@@ -7025,7 +7513,7 @@
           <w:sz w:val="26"/>
           <w:szCs w:val="26"/>
         </w:rPr>
-        <w:t xml:space="preserve">Sequence — WebSocket reconnect</w:t>
+        <w:t xml:space="preserve">Sequence — happy path</w:t>
       </w:r>
     </w:p>
     <w:p>
@@ -7035,9 +7523,9 @@
       <w:r>
         <w:drawing>
           <wp:inline distT="0" distB="0" distL="0" distR="0">
-            <wp:extent cx="7029450" cy="5229225"/>
+            <wp:extent cx="6438900" cy="5229225"/>
             <wp:effectExtent t="0" r="0" b="0" l="0"/>
-            <wp:docPr id="8" name="Sequence — WebSocket reconnect" descr="Sequence — WebSocket reconnect" title="Sequence — WebSocket reconnect"/>
+            <wp:docPr id="6" name="Sequence — happy path" descr="Sequence — happy path" title="Sequence — happy path"/>
             <wp:cNvGraphicFramePr>
               <a:graphicFrameLocks xmlns:a="http://schemas.openxmlformats.org/drawingml/2006/main" noChangeAspect="1"/>
             </wp:cNvGraphicFramePr>
@@ -7060,6 +7548,264 @@
                   <pic:spPr bwMode="auto">
                     <a:xfrm>
                       <a:off x="0" y="0"/>
+                      <a:ext cx="6438900" cy="5229225"/>
+                    </a:xfrm>
+                    <a:prstGeom prst="rect">
+                      <a:avLst/>
+                    </a:prstGeom>
+                  </pic:spPr>
+                </pic:pic>
+              </a:graphicData>
+            </a:graphic>
+          </wp:inline>
+        </w:drawing>
+      </w:r>
+    </w:p>
+    <w:p>
+      <w:pPr>
+        <w:spacing w:before="80"/>
+        <w:jc w:val="center"/>
+        <w:sectPr>
+          <w:footerReference w:type="default" r:id="rId16"/>
+          <w:pgSz w:w="16838" w:h="11906" w:orient="landscape"/>
+          <w:pgMar w:top="1134" w:right="1134" w:bottom="1134" w:left="1134" w:header="708" w:footer="708" w:gutter="0"/>
+          <w:pgNumType/>
+          <w:docGrid w:linePitch="360"/>
+        </w:sectPr>
+      </w:pPr>
+      <w:r>
+        <w:rPr>
+          <w:rFonts w:ascii="Calibri" w:cs="Calibri" w:eastAsia="Calibri" w:hAnsi="Calibri"/>
+          <w:i/>
+          <w:iCs/>
+          <w:color w:val="808080"/>
+          <w:sz w:val="16"/>
+          <w:szCs w:val="16"/>
+        </w:rPr>
+        <w:t xml:space="preserve">draw.io page </w:t>
+      </w:r>
+      <w:r>
+        <w:rPr>
+          <w:rFonts w:ascii="Calibri" w:cs="Calibri" w:eastAsia="Calibri" w:hAnsi="Calibri"/>
+          <w:b/>
+          <w:bCs/>
+          <w:i/>
+          <w:iCs/>
+          <w:color w:val="808080"/>
+          <w:sz w:val="16"/>
+          <w:szCs w:val="16"/>
+        </w:rPr>
+        <w:t xml:space="preserve">5a. Sequence — Happy Path</w:t>
+      </w:r>
+      <w:r>
+        <w:rPr>
+          <w:rFonts w:ascii="Calibri" w:cs="Calibri" w:eastAsia="Calibri" w:hAnsi="Calibri"/>
+          <w:i/>
+          <w:iCs/>
+          <w:color w:val="808080"/>
+          <w:sz w:val="16"/>
+          <w:szCs w:val="16"/>
+        </w:rPr>
+        <w:t xml:space="preserve"> (30 numbered messages, including SSE and audit) · editable source: docs/hld/diagrams/ta9-hld.drawio</w:t>
+      </w:r>
+    </w:p>
+    <w:p>
+      <w:pPr>
+        <w:pStyle w:val="Heading2"/>
+        <w:sectPr>
+          <w:footerReference w:type="default" r:id="rId17"/>
+          <w:pgSz w:w="11906" w:h="16838" w:orient="portrait"/>
+          <w:pgMar w:top="1134" w:right="1134" w:bottom="1134" w:left="1134" w:header="708" w:footer="708" w:gutter="0"/>
+          <w:pgNumType/>
+          <w:docGrid w:linePitch="360"/>
+        </w:sectPr>
+      </w:pPr>
+      <w:bookmarkStart w:name="_Toc15" w:id="15"/>
+      <w:r>
+        <w:rPr>
+          <w:rFonts w:ascii="Calibri" w:cs="Calibri" w:eastAsia="Calibri" w:hAnsi="Calibri"/>
+        </w:rPr>
+        <w:t xml:space="preserve">8.2 Processor restart mid-job</w:t>
+      </w:r>
+      <w:bookmarkEnd w:id="15"/>
+    </w:p>
+    <w:p>
+      <w:pPr>
+        <w:spacing w:after="120"/>
+      </w:pPr>
+      <w:r>
+        <w:rPr>
+          <w:rFonts w:ascii="Calibri" w:cs="Calibri" w:eastAsia="Calibri" w:hAnsi="Calibri"/>
+          <w:b/>
+          <w:bCs/>
+          <w:color w:val="1F4E79"/>
+          <w:sz w:val="26"/>
+          <w:szCs w:val="26"/>
+        </w:rPr>
+        <w:t xml:space="preserve">Sequence — processor restart</w:t>
+      </w:r>
+    </w:p>
+    <w:p>
+      <w:pPr>
+        <w:jc w:val="center"/>
+      </w:pPr>
+      <w:r>
+        <w:drawing>
+          <wp:inline distT="0" distB="0" distL="0" distR="0">
+            <wp:extent cx="7867650" cy="5229225"/>
+            <wp:effectExtent t="0" r="0" b="0" l="0"/>
+            <wp:docPr id="7" name="Sequence — processor restart" descr="Sequence — processor restart" title="Sequence — processor restart"/>
+            <wp:cNvGraphicFramePr>
+              <a:graphicFrameLocks xmlns:a="http://schemas.openxmlformats.org/drawingml/2006/main" noChangeAspect="1"/>
+            </wp:cNvGraphicFramePr>
+            <a:graphic xmlns:a="http://schemas.openxmlformats.org/drawingml/2006/main">
+              <a:graphicData uri="http://schemas.openxmlformats.org/drawingml/2006/picture">
+                <pic:pic xmlns:pic="http://schemas.openxmlformats.org/drawingml/2006/picture">
+                  <pic:nvPicPr>
+                    <pic:cNvPr id="0" name="" descr=""/>
+                    <pic:cNvPicPr>
+                      <a:picLocks noChangeAspect="1" noChangeArrowheads="1"/>
+                    </pic:cNvPicPr>
+                  </pic:nvPicPr>
+                  <pic:blipFill>
+                    <a:blip r:embed="rId34" cstate="none"/>
+                    <a:srcRect/>
+                    <a:stretch>
+                      <a:fillRect/>
+                    </a:stretch>
+                  </pic:blipFill>
+                  <pic:spPr bwMode="auto">
+                    <a:xfrm>
+                      <a:off x="0" y="0"/>
+                      <a:ext cx="7867650" cy="5229225"/>
+                    </a:xfrm>
+                    <a:prstGeom prst="rect">
+                      <a:avLst/>
+                    </a:prstGeom>
+                  </pic:spPr>
+                </pic:pic>
+              </a:graphicData>
+            </a:graphic>
+          </wp:inline>
+        </w:drawing>
+      </w:r>
+    </w:p>
+    <w:p>
+      <w:pPr>
+        <w:spacing w:before="80"/>
+        <w:jc w:val="center"/>
+        <w:sectPr>
+          <w:footerReference w:type="default" r:id="rId18"/>
+          <w:pgSz w:w="16838" w:h="11906" w:orient="landscape"/>
+          <w:pgMar w:top="1134" w:right="1134" w:bottom="1134" w:left="1134" w:header="708" w:footer="708" w:gutter="0"/>
+          <w:pgNumType/>
+          <w:docGrid w:linePitch="360"/>
+        </w:sectPr>
+      </w:pPr>
+      <w:r>
+        <w:rPr>
+          <w:rFonts w:ascii="Calibri" w:cs="Calibri" w:eastAsia="Calibri" w:hAnsi="Calibri"/>
+          <w:i/>
+          <w:iCs/>
+          <w:color w:val="808080"/>
+          <w:sz w:val="16"/>
+          <w:szCs w:val="16"/>
+        </w:rPr>
+        <w:t xml:space="preserve">draw.io page </w:t>
+      </w:r>
+      <w:r>
+        <w:rPr>
+          <w:rFonts w:ascii="Calibri" w:cs="Calibri" w:eastAsia="Calibri" w:hAnsi="Calibri"/>
+          <w:b/>
+          <w:bCs/>
+          <w:i/>
+          <w:iCs/>
+          <w:color w:val="808080"/>
+          <w:sz w:val="16"/>
+          <w:szCs w:val="16"/>
+        </w:rPr>
+        <w:t xml:space="preserve">5b. Sequence — Processor Restart</w:t>
+      </w:r>
+      <w:r>
+        <w:rPr>
+          <w:rFonts w:ascii="Calibri" w:cs="Calibri" w:eastAsia="Calibri" w:hAnsi="Calibri"/>
+          <w:i/>
+          <w:iCs/>
+          <w:color w:val="808080"/>
+          <w:sz w:val="16"/>
+          <w:szCs w:val="16"/>
+        </w:rPr>
+        <w:t xml:space="preserve"> · editable source: docs/hld/diagrams/ta9-hld.drawio</w:t>
+      </w:r>
+    </w:p>
+    <w:p>
+      <w:pPr>
+        <w:pStyle w:val="Heading2"/>
+        <w:sectPr>
+          <w:footerReference w:type="default" r:id="rId19"/>
+          <w:pgSz w:w="11906" w:h="16838" w:orient="portrait"/>
+          <w:pgMar w:top="1134" w:right="1134" w:bottom="1134" w:left="1134" w:header="708" w:footer="708" w:gutter="0"/>
+          <w:pgNumType/>
+          <w:docGrid w:linePitch="360"/>
+        </w:sectPr>
+      </w:pPr>
+      <w:bookmarkStart w:name="_Toc16" w:id="16"/>
+      <w:r>
+        <w:rPr>
+          <w:rFonts w:ascii="Calibri" w:cs="Calibri" w:eastAsia="Calibri" w:hAnsi="Calibri"/>
+        </w:rPr>
+        <w:t xml:space="preserve">8.3 WebSocket disconnect, reconnect and replay</w:t>
+      </w:r>
+      <w:bookmarkEnd w:id="16"/>
+    </w:p>
+    <w:p>
+      <w:pPr>
+        <w:spacing w:after="120"/>
+      </w:pPr>
+      <w:r>
+        <w:rPr>
+          <w:rFonts w:ascii="Calibri" w:cs="Calibri" w:eastAsia="Calibri" w:hAnsi="Calibri"/>
+          <w:b/>
+          <w:bCs/>
+          <w:color w:val="1F4E79"/>
+          <w:sz w:val="26"/>
+          <w:szCs w:val="26"/>
+        </w:rPr>
+        <w:t xml:space="preserve">Sequence — WebSocket reconnect</w:t>
+      </w:r>
+    </w:p>
+    <w:p>
+      <w:pPr>
+        <w:jc w:val="center"/>
+      </w:pPr>
+      <w:r>
+        <w:drawing>
+          <wp:inline distT="0" distB="0" distL="0" distR="0">
+            <wp:extent cx="7029450" cy="5229225"/>
+            <wp:effectExtent t="0" r="0" b="0" l="0"/>
+            <wp:docPr id="8" name="Sequence — WebSocket reconnect" descr="Sequence — WebSocket reconnect" title="Sequence — WebSocket reconnect"/>
+            <wp:cNvGraphicFramePr>
+              <a:graphicFrameLocks xmlns:a="http://schemas.openxmlformats.org/drawingml/2006/main" noChangeAspect="1"/>
+            </wp:cNvGraphicFramePr>
+            <a:graphic xmlns:a="http://schemas.openxmlformats.org/drawingml/2006/main">
+              <a:graphicData uri="http://schemas.openxmlformats.org/drawingml/2006/picture">
+                <pic:pic xmlns:pic="http://schemas.openxmlformats.org/drawingml/2006/picture">
+                  <pic:nvPicPr>
+                    <pic:cNvPr id="0" name="" descr=""/>
+                    <pic:cNvPicPr>
+                      <a:picLocks noChangeAspect="1" noChangeArrowheads="1"/>
+                    </pic:cNvPicPr>
+                  </pic:nvPicPr>
+                  <pic:blipFill>
+                    <a:blip r:embed="rId35" cstate="none"/>
+                    <a:srcRect/>
+                    <a:stretch>
+                      <a:fillRect/>
+                    </a:stretch>
+                  </pic:blipFill>
+                  <pic:spPr bwMode="auto">
+                    <a:xfrm>
+                      <a:off x="0" y="0"/>
                       <a:ext cx="7029450" cy="5229225"/>
                     </a:xfrm>
                     <a:prstGeom prst="rect">
@@ -7948,244 +8694,6 @@
     <w:p>
       <w:pPr>
         <w:pStyle w:val="Heading2"/>
-      </w:pPr>
-      <w:bookmarkStart w:name="_Toc21" w:id="21"/>
-      <w:r>
-        <w:rPr>
-          <w:rFonts w:ascii="Calibri" w:cs="Calibri" w:eastAsia="Calibri" w:hAnsi="Calibri"/>
-        </w:rPr>
-        <w:t xml:space="preserve">9.4 Observability</w:t>
-      </w:r>
-      <w:bookmarkEnd w:id="21"/>
-    </w:p>
-    <w:p>
-      <w:pPr>
-        <w:pStyle w:val="ListParagraph"/>
-        <w:numPr>
-          <w:ilvl w:val="0"/>
-          <w:numId w:val="2"/>
-        </w:numPr>
-      </w:pPr>
-      <w:r>
-        <w:rPr>
-          <w:rFonts w:ascii="Calibri" w:cs="Calibri" w:eastAsia="Calibri" w:hAnsi="Calibri"/>
-          <w:b/>
-          <w:bCs/>
-        </w:rPr>
-        <w:t xml:space="preserve">Logging:</w:t>
-      </w:r>
-      <w:r>
-        <w:rPr>
-          <w:rFonts w:ascii="Calibri" w:cs="Calibri" w:eastAsia="Calibri" w:hAnsi="Calibri"/>
-        </w:rPr>
-        <w:t xml:space="preserve"> Serilog JSON logs enriched with </w:t>
-      </w:r>
-      <w:r>
-        <w:rPr>
-          <w:rFonts w:ascii="Consolas" w:cs="Consolas" w:eastAsia="Consolas" w:hAnsi="Consolas"/>
-          <w:color w:val="5B2C6F"/>
-          <w:sz w:val="19"/>
-          <w:szCs w:val="19"/>
-        </w:rPr>
-        <w:t xml:space="preserve">Service</w:t>
-      </w:r>
-      <w:r>
-        <w:rPr>
-          <w:rFonts w:ascii="Calibri" w:cs="Calibri" w:eastAsia="Calibri" w:hAnsi="Calibri"/>
-        </w:rPr>
-        <w:t xml:space="preserve">, </w:t>
-      </w:r>
-      <w:r>
-        <w:rPr>
-          <w:rFonts w:ascii="Consolas" w:cs="Consolas" w:eastAsia="Consolas" w:hAnsi="Consolas"/>
-          <w:color w:val="5B2C6F"/>
-          <w:sz w:val="19"/>
-          <w:szCs w:val="19"/>
-        </w:rPr>
-        <w:t xml:space="preserve">CorrelationId</w:t>
-      </w:r>
-      <w:r>
-        <w:rPr>
-          <w:rFonts w:ascii="Calibri" w:cs="Calibri" w:eastAsia="Calibri" w:hAnsi="Calibri"/>
-        </w:rPr>
-        <w:t xml:space="preserve"> and </w:t>
-      </w:r>
-      <w:r>
-        <w:rPr>
-          <w:rFonts w:ascii="Consolas" w:cs="Consolas" w:eastAsia="Consolas" w:hAnsi="Consolas"/>
-          <w:color w:val="5B2C6F"/>
-          <w:sz w:val="19"/>
-          <w:szCs w:val="19"/>
-        </w:rPr>
-        <w:t xml:space="preserve">JobId</w:t>
-      </w:r>
-      <w:r>
-        <w:rPr>
-          <w:rFonts w:ascii="Calibri" w:cs="Calibri" w:eastAsia="Calibri" w:hAnsi="Calibri"/>
-        </w:rPr>
-        <w:t xml:space="preserve">.</w:t>
-      </w:r>
-    </w:p>
-    <w:p>
-      <w:pPr>
-        <w:pStyle w:val="ListParagraph"/>
-        <w:numPr>
-          <w:ilvl w:val="0"/>
-          <w:numId w:val="2"/>
-        </w:numPr>
-      </w:pPr>
-      <w:r>
-        <w:rPr>
-          <w:rFonts w:ascii="Calibri" w:cs="Calibri" w:eastAsia="Calibri" w:hAnsi="Calibri"/>
-          <w:b/>
-          <w:bCs/>
-        </w:rPr>
-        <w:t xml:space="preserve">Correlation id:</w:t>
-      </w:r>
-      <w:r>
-        <w:rPr>
-          <w:rFonts w:ascii="Calibri" w:cs="Calibri" w:eastAsia="Calibri" w:hAnsi="Calibri"/>
-        </w:rPr>
-        <w:t xml:space="preserve"> propagated over HTTP headers and inside WS envelopes.</w:t>
-      </w:r>
-    </w:p>
-    <w:p>
-      <w:pPr>
-        <w:pStyle w:val="ListParagraph"/>
-        <w:numPr>
-          <w:ilvl w:val="0"/>
-          <w:numId w:val="2"/>
-        </w:numPr>
-      </w:pPr>
-      <w:r>
-        <w:rPr>
-          <w:rFonts w:ascii="Calibri" w:cs="Calibri" w:eastAsia="Calibri" w:hAnsi="Calibri"/>
-          <w:b/>
-          <w:bCs/>
-        </w:rPr>
-        <w:t xml:space="preserve">Health:</w:t>
-      </w:r>
-      <w:r>
-        <w:rPr>
-          <w:rFonts w:ascii="Calibri" w:cs="Calibri" w:eastAsia="Calibri" w:hAnsi="Calibri"/>
-        </w:rPr>
-        <w:t xml:space="preserve"> </w:t>
-      </w:r>
-      <w:r>
-        <w:rPr>
-          <w:rFonts w:ascii="Consolas" w:cs="Consolas" w:eastAsia="Consolas" w:hAnsi="Consolas"/>
-          <w:color w:val="5B2C6F"/>
-          <w:sz w:val="19"/>
-          <w:szCs w:val="19"/>
-        </w:rPr>
-        <w:t xml:space="preserve">/health/live</w:t>
-      </w:r>
-      <w:r>
-        <w:rPr>
-          <w:rFonts w:ascii="Calibri" w:cs="Calibri" w:eastAsia="Calibri" w:hAnsi="Calibri"/>
-        </w:rPr>
-        <w:t xml:space="preserve"> and </w:t>
-      </w:r>
-      <w:r>
-        <w:rPr>
-          <w:rFonts w:ascii="Consolas" w:cs="Consolas" w:eastAsia="Consolas" w:hAnsi="Consolas"/>
-          <w:color w:val="5B2C6F"/>
-          <w:sz w:val="19"/>
-          <w:szCs w:val="19"/>
-        </w:rPr>
-        <w:t xml:space="preserve">/health/ready</w:t>
-      </w:r>
-      <w:r>
-        <w:rPr>
-          <w:rFonts w:ascii="Calibri" w:cs="Calibri" w:eastAsia="Calibri" w:hAnsi="Calibri"/>
-        </w:rPr>
-        <w:t xml:space="preserve">, used by the compose health checks.</w:t>
-      </w:r>
-    </w:p>
-    <w:p>
-      <w:pPr>
-        <w:pStyle w:val="ListParagraph"/>
-        <w:numPr>
-          <w:ilvl w:val="0"/>
-          <w:numId w:val="2"/>
-        </w:numPr>
-      </w:pPr>
-      <w:r>
-        <w:rPr>
-          <w:rFonts w:ascii="Calibri" w:cs="Calibri" w:eastAsia="Calibri" w:hAnsi="Calibri"/>
-          <w:b/>
-          <w:bCs/>
-        </w:rPr>
-        <w:t xml:space="preserve">Next step:</w:t>
-      </w:r>
-      <w:r>
-        <w:rPr>
-          <w:rFonts w:ascii="Calibri" w:cs="Calibri" w:eastAsia="Calibri" w:hAnsi="Calibri"/>
-        </w:rPr>
-        <w:t xml:space="preserve"> OpenTelemetry traces and metrics (queue depth, dispatch latency, outbox size).</w:t>
-      </w:r>
-    </w:p>
-    <w:p>
-      <w:pPr>
-        <w:pStyle w:val="Heading2"/>
-      </w:pPr>
-      <w:bookmarkStart w:name="_Toc22" w:id="22"/>
-      <w:r>
-        <w:rPr>
-          <w:rFonts w:ascii="Calibri" w:cs="Calibri" w:eastAsia="Calibri" w:hAnsi="Calibri"/>
-        </w:rPr>
-        <w:t xml:space="preserve">9.5 Security (POC scope)</w:t>
-      </w:r>
-      <w:bookmarkEnd w:id="22"/>
-    </w:p>
-    <w:p>
-      <w:pPr>
-        <w:pStyle w:val="ListParagraph"/>
-        <w:numPr>
-          <w:ilvl w:val="0"/>
-          <w:numId w:val="2"/>
-        </w:numPr>
-      </w:pPr>
-      <w:r>
-        <w:rPr>
-          <w:rFonts w:ascii="Calibri" w:cs="Calibri" w:eastAsia="Calibri" w:hAnsi="Calibri"/>
-        </w:rPr>
-        <w:t xml:space="preserve">No authentication, by assignment. Production would add JWT on the public API and mTLS or a shared secret between services.</w:t>
-      </w:r>
-    </w:p>
-    <w:p>
-      <w:pPr>
-        <w:pStyle w:val="ListParagraph"/>
-        <w:numPr>
-          <w:ilvl w:val="0"/>
-          <w:numId w:val="2"/>
-        </w:numPr>
-      </w:pPr>
-      <w:r>
-        <w:rPr>
-          <w:rFonts w:ascii="Calibri" w:cs="Calibri" w:eastAsia="Calibri" w:hAnsi="Calibri"/>
-        </w:rPr>
-        <w:t xml:space="preserve">Input limits protect the services: 1,000 docs, 100 KB per document, 10 MB per body, 16 MB per WS message.</w:t>
-      </w:r>
-    </w:p>
-    <w:p>
-      <w:pPr>
-        <w:pStyle w:val="ListParagraph"/>
-        <w:numPr>
-          <w:ilvl w:val="0"/>
-          <w:numId w:val="2"/>
-        </w:numPr>
-      </w:pPr>
-      <w:r>
-        <w:rPr>
-          <w:rFonts w:ascii="Calibri" w:cs="Calibri" w:eastAsia="Calibri" w:hAnsi="Calibri"/>
-        </w:rPr>
-        <w:t xml:space="preserve">Correlation ids are sanitized to prevent log injection.</w:t>
-      </w:r>
-    </w:p>
-    <w:p>
-      <w:pPr>
-        <w:pStyle w:val="Heading1"/>
         <w:sectPr>
           <w:footerReference w:type="default" r:id="rId21"/>
           <w:pgSz w:w="11906" w:h="16838" w:orient="portrait"/>
@@ -8194,14 +8702,14 @@
           <w:docGrid w:linePitch="360"/>
         </w:sectPr>
       </w:pPr>
-      <w:bookmarkStart w:name="_Toc23" w:id="23"/>
-      <w:r>
-        <w:rPr>
-          <w:rFonts w:ascii="Calibri" w:cs="Calibri" w:eastAsia="Calibri" w:hAnsi="Calibri"/>
-        </w:rPr>
-        <w:t xml:space="preserve">10. Deployment</w:t>
-      </w:r>
-      <w:bookmarkEnd w:id="23"/>
+      <w:bookmarkStart w:name="_Toc21" w:id="21"/>
+      <w:r>
+        <w:rPr>
+          <w:rFonts w:ascii="Calibri" w:cs="Calibri" w:eastAsia="Calibri" w:hAnsi="Calibri"/>
+        </w:rPr>
+        <w:t xml:space="preserve">9.4 Observability</w:t>
+      </w:r>
+      <w:bookmarkEnd w:id="21"/>
     </w:p>
     <w:p>
       <w:pPr>
@@ -8216,7 +8724,7 @@
           <w:sz w:val="26"/>
           <w:szCs w:val="26"/>
         </w:rPr>
-        <w:t xml:space="preserve">Deployment</w:t>
+        <w:t xml:space="preserve">Logging &amp; observability</w:t>
       </w:r>
     </w:p>
     <w:p>
@@ -8226,9 +8734,9 @@
       <w:r>
         <w:drawing>
           <wp:inline distT="0" distB="0" distL="0" distR="0">
-            <wp:extent cx="9248775" cy="4810125"/>
+            <wp:extent cx="9248775" cy="5095875"/>
             <wp:effectExtent t="0" r="0" b="0" l="0"/>
-            <wp:docPr id="9" name="Deployment" descr="Deployment" title="Deployment"/>
+            <wp:docPr id="9" name="Logging &amp; observability" descr="Logging &amp; observability" title="Logging &amp; observability"/>
             <wp:cNvGraphicFramePr>
               <a:graphicFrameLocks xmlns:a="http://schemas.openxmlformats.org/drawingml/2006/main" noChangeAspect="1"/>
             </wp:cNvGraphicFramePr>
@@ -8242,7 +8750,874 @@
                     </pic:cNvPicPr>
                   </pic:nvPicPr>
                   <pic:blipFill>
-                    <a:blip r:embed="rId34" cstate="none"/>
+                    <a:blip r:embed="rId36" cstate="none"/>
+                    <a:srcRect/>
+                    <a:stretch>
+                      <a:fillRect/>
+                    </a:stretch>
+                  </pic:blipFill>
+                  <pic:spPr bwMode="auto">
+                    <a:xfrm>
+                      <a:off x="0" y="0"/>
+                      <a:ext cx="9248775" cy="5095875"/>
+                    </a:xfrm>
+                    <a:prstGeom prst="rect">
+                      <a:avLst/>
+                    </a:prstGeom>
+                  </pic:spPr>
+                </pic:pic>
+              </a:graphicData>
+            </a:graphic>
+          </wp:inline>
+        </w:drawing>
+      </w:r>
+    </w:p>
+    <w:p>
+      <w:pPr>
+        <w:spacing w:before="80"/>
+        <w:jc w:val="center"/>
+        <w:sectPr>
+          <w:footerReference w:type="default" r:id="rId22"/>
+          <w:pgSz w:w="16838" w:h="11906" w:orient="landscape"/>
+          <w:pgMar w:top="1134" w:right="1134" w:bottom="1134" w:left="1134" w:header="708" w:footer="708" w:gutter="0"/>
+          <w:pgNumType/>
+          <w:docGrid w:linePitch="360"/>
+        </w:sectPr>
+      </w:pPr>
+      <w:r>
+        <w:rPr>
+          <w:rFonts w:ascii="Calibri" w:cs="Calibri" w:eastAsia="Calibri" w:hAnsi="Calibri"/>
+          <w:i/>
+          <w:iCs/>
+          <w:color w:val="808080"/>
+          <w:sz w:val="16"/>
+          <w:szCs w:val="16"/>
+        </w:rPr>
+        <w:t xml:space="preserve">draw.io page </w:t>
+      </w:r>
+      <w:r>
+        <w:rPr>
+          <w:rFonts w:ascii="Calibri" w:cs="Calibri" w:eastAsia="Calibri" w:hAnsi="Calibri"/>
+          <w:b/>
+          <w:bCs/>
+          <w:i/>
+          <w:iCs/>
+          <w:color w:val="808080"/>
+          <w:sz w:val="16"/>
+          <w:szCs w:val="16"/>
+        </w:rPr>
+        <w:t xml:space="preserve">11. Logging</w:t>
+      </w:r>
+      <w:r>
+        <w:rPr>
+          <w:rFonts w:ascii="Calibri" w:cs="Calibri" w:eastAsia="Calibri" w:hAnsi="Calibri"/>
+          <w:i/>
+          <w:iCs/>
+          <w:color w:val="808080"/>
+          <w:sz w:val="16"/>
+          <w:szCs w:val="16"/>
+        </w:rPr>
+        <w:t xml:space="preserve">*. Full description, alternatives, limitations and tests: </w:t>
+      </w:r>
+      <w:r>
+        <w:rPr>
+          <w:rFonts w:ascii="Consolas" w:cs="Consolas" w:eastAsia="Consolas" w:hAnsi="Consolas"/>
+          <w:i/>
+          <w:iCs/>
+          <w:color w:val="5B2C6F"/>
+          <w:sz w:val="14"/>
+          <w:szCs w:val="14"/>
+          <w:u w:val="single"/>
+        </w:rPr>
+        <w:t xml:space="preserve">../logging/LOGGING.md</w:t>
+      </w:r>
+      <w:r>
+        <w:rPr>
+          <w:rFonts w:ascii="Calibri" w:cs="Calibri" w:eastAsia="Calibri" w:hAnsi="Calibri"/>
+          <w:i/>
+          <w:iCs/>
+          <w:color w:val="808080"/>
+          <w:sz w:val="16"/>
+          <w:szCs w:val="16"/>
+        </w:rPr>
+        <w:t xml:space="preserve">. Where to look when something fails: Installation Guide §5. · editable source: docs/hld/diagrams/ta9-hld.drawio</w:t>
+      </w:r>
+    </w:p>
+    <w:p>
+      <w:pPr>
+        <w:spacing w:after="120"/>
+      </w:pPr>
+      <w:r>
+        <w:rPr>
+          <w:rFonts w:ascii="Calibri" w:cs="Calibri" w:eastAsia="Calibri" w:hAnsi="Calibri"/>
+          <w:b/>
+          <w:bCs/>
+        </w:rPr>
+        <w:t xml:space="preserve">One pipeline, two destinations.</w:t>
+      </w:r>
+      <w:r>
+        <w:rPr>
+          <w:rFonts w:ascii="Calibri" w:cs="Calibri" w:eastAsia="Calibri" w:hAnsi="Calibri"/>
+        </w:rPr>
+        <w:t xml:space="preserve"> </w:t>
+      </w:r>
+      <w:r>
+        <w:rPr>
+          <w:rFonts w:ascii="Consolas" w:cs="Consolas" w:eastAsia="Consolas" w:hAnsi="Consolas"/>
+          <w:color w:val="5B2C6F"/>
+          <w:sz w:val="19"/>
+          <w:szCs w:val="19"/>
+        </w:rPr>
+        <w:t xml:space="preserve">AddServiceDefaults</w:t>
+      </w:r>
+      <w:r>
+        <w:rPr>
+          <w:rFonts w:ascii="Calibri" w:cs="Calibri" w:eastAsia="Calibri" w:hAnsi="Calibri"/>
+        </w:rPr>
+        <w:t xml:space="preserve"> configures Serilog identically in the three services:</w:t>
+      </w:r>
+    </w:p>
+    <w:tbl>
+      <w:tblPr>
+        <w:tblW w:type="dxa" w:w="9638"/>
+        <w:tblBorders>
+          <w:top w:val="single" w:color="auto" w:sz="4"/>
+          <w:left w:val="single" w:color="auto" w:sz="4"/>
+          <w:bottom w:val="single" w:color="auto" w:sz="4"/>
+          <w:right w:val="single" w:color="auto" w:sz="4"/>
+          <w:insideH w:val="single" w:color="auto" w:sz="4"/>
+          <w:insideV w:val="single" w:color="auto" w:sz="4"/>
+        </w:tblBorders>
+      </w:tblPr>
+      <w:tblGrid>
+        <w:gridCol w:w="2200"/>
+        <w:gridCol w:w="1366"/>
+        <w:gridCol w:w="3035"/>
+        <w:gridCol w:w="3037"/>
+      </w:tblGrid>
+      <w:tr>
+        <w:trPr>
+          <w:tblHeader/>
+        </w:trPr>
+        <w:tc>
+          <w:tcPr>
+            <w:tcW w:type="dxa" w:w="2200"/>
+            <w:tcBorders>
+              <w:top w:val="single" w:color="BFBFBF" w:sz="4"/>
+              <w:left w:val="single" w:color="BFBFBF" w:sz="4"/>
+              <w:bottom w:val="single" w:color="BFBFBF" w:sz="4"/>
+              <w:right w:val="single" w:color="BFBFBF" w:sz="4"/>
+            </w:tcBorders>
+            <w:shd w:fill="DCE6F2" w:color="auto" w:val="clear"/>
+            <w:tcMar>
+              <w:top w:type="dxa" w:w="60"/>
+              <w:left w:type="dxa" w:w="100"/>
+              <w:bottom w:type="dxa" w:w="60"/>
+              <w:right w:type="dxa" w:w="100"/>
+            </w:tcMar>
+          </w:tcPr>
+          <w:p>
+            <w:r>
+              <w:rPr>
+                <w:rFonts w:ascii="Calibri" w:cs="Calibri" w:eastAsia="Calibri" w:hAnsi="Calibri"/>
+                <w:b/>
+                <w:bCs/>
+                <w:sz w:val="18"/>
+                <w:szCs w:val="18"/>
+              </w:rPr>
+              <w:t xml:space="preserve">Destination</w:t>
+            </w:r>
+          </w:p>
+        </w:tc>
+        <w:tc>
+          <w:tcPr>
+            <w:tcW w:type="dxa" w:w="1366"/>
+            <w:tcBorders>
+              <w:top w:val="single" w:color="BFBFBF" w:sz="4"/>
+              <w:left w:val="single" w:color="BFBFBF" w:sz="4"/>
+              <w:bottom w:val="single" w:color="BFBFBF" w:sz="4"/>
+              <w:right w:val="single" w:color="BFBFBF" w:sz="4"/>
+            </w:tcBorders>
+            <w:shd w:fill="DCE6F2" w:color="auto" w:val="clear"/>
+            <w:tcMar>
+              <w:top w:type="dxa" w:w="60"/>
+              <w:left w:type="dxa" w:w="100"/>
+              <w:bottom w:type="dxa" w:w="60"/>
+              <w:right w:type="dxa" w:w="100"/>
+            </w:tcMar>
+          </w:tcPr>
+          <w:p>
+            <w:r>
+              <w:rPr>
+                <w:rFonts w:ascii="Calibri" w:cs="Calibri" w:eastAsia="Calibri" w:hAnsi="Calibri"/>
+                <w:b/>
+                <w:bCs/>
+                <w:sz w:val="18"/>
+                <w:szCs w:val="18"/>
+              </w:rPr>
+              <w:t xml:space="preserve">Levels</w:t>
+            </w:r>
+          </w:p>
+        </w:tc>
+        <w:tc>
+          <w:tcPr>
+            <w:tcW w:type="dxa" w:w="3035"/>
+            <w:tcBorders>
+              <w:top w:val="single" w:color="BFBFBF" w:sz="4"/>
+              <w:left w:val="single" w:color="BFBFBF" w:sz="4"/>
+              <w:bottom w:val="single" w:color="BFBFBF" w:sz="4"/>
+              <w:right w:val="single" w:color="BFBFBF" w:sz="4"/>
+            </w:tcBorders>
+            <w:shd w:fill="DCE6F2" w:color="auto" w:val="clear"/>
+            <w:tcMar>
+              <w:top w:type="dxa" w:w="60"/>
+              <w:left w:type="dxa" w:w="100"/>
+              <w:bottom w:type="dxa" w:w="60"/>
+              <w:right w:type="dxa" w:w="100"/>
+            </w:tcMar>
+          </w:tcPr>
+          <w:p>
+            <w:r>
+              <w:rPr>
+                <w:rFonts w:ascii="Calibri" w:cs="Calibri" w:eastAsia="Calibri" w:hAnsi="Calibri"/>
+                <w:b/>
+                <w:bCs/>
+                <w:sz w:val="18"/>
+                <w:szCs w:val="18"/>
+              </w:rPr>
+              <w:t xml:space="preserve">Role</w:t>
+            </w:r>
+          </w:p>
+        </w:tc>
+        <w:tc>
+          <w:tcPr>
+            <w:tcW w:type="dxa" w:w="3037"/>
+            <w:tcBorders>
+              <w:top w:val="single" w:color="BFBFBF" w:sz="4"/>
+              <w:left w:val="single" w:color="BFBFBF" w:sz="4"/>
+              <w:bottom w:val="single" w:color="BFBFBF" w:sz="4"/>
+              <w:right w:val="single" w:color="BFBFBF" w:sz="4"/>
+            </w:tcBorders>
+            <w:shd w:fill="DCE6F2" w:color="auto" w:val="clear"/>
+            <w:tcMar>
+              <w:top w:type="dxa" w:w="60"/>
+              <w:left w:type="dxa" w:w="100"/>
+              <w:bottom w:type="dxa" w:w="60"/>
+              <w:right w:type="dxa" w:w="100"/>
+            </w:tcMar>
+          </w:tcPr>
+          <w:p>
+            <w:r>
+              <w:rPr>
+                <w:rFonts w:ascii="Calibri" w:cs="Calibri" w:eastAsia="Calibri" w:hAnsi="Calibri"/>
+                <w:b/>
+                <w:bCs/>
+                <w:sz w:val="18"/>
+                <w:szCs w:val="18"/>
+              </w:rPr>
+              <w:t xml:space="preserve">Properties</w:t>
+            </w:r>
+          </w:p>
+        </w:tc>
+      </w:tr>
+      <w:tr>
+        <w:tc>
+          <w:tcPr>
+            <w:tcW w:type="dxa" w:w="2200"/>
+            <w:tcBorders>
+              <w:top w:val="single" w:color="BFBFBF" w:sz="4"/>
+              <w:left w:val="single" w:color="BFBFBF" w:sz="4"/>
+              <w:bottom w:val="single" w:color="BFBFBF" w:sz="4"/>
+              <w:right w:val="single" w:color="BFBFBF" w:sz="4"/>
+            </w:tcBorders>
+            <w:tcMar>
+              <w:top w:type="dxa" w:w="60"/>
+              <w:left w:type="dxa" w:w="100"/>
+              <w:bottom w:type="dxa" w:w="60"/>
+              <w:right w:type="dxa" w:w="100"/>
+            </w:tcMar>
+          </w:tcPr>
+          <w:p>
+            <w:r>
+              <w:rPr>
+                <w:rFonts w:ascii="Calibri" w:cs="Calibri" w:eastAsia="Calibri" w:hAnsi="Calibri"/>
+                <w:sz w:val="18"/>
+                <w:szCs w:val="18"/>
+              </w:rPr>
+              <w:t xml:space="preserve">Console (</w:t>
+            </w:r>
+            <w:r>
+              <w:rPr>
+                <w:rFonts w:ascii="Consolas" w:cs="Consolas" w:eastAsia="Consolas" w:hAnsi="Consolas"/>
+                <w:color w:val="5B2C6F"/>
+                <w:sz w:val="16"/>
+                <w:szCs w:val="16"/>
+              </w:rPr>
+              <w:t xml:space="preserve">docker compose logs</w:t>
+            </w:r>
+            <w:r>
+              <w:rPr>
+                <w:rFonts w:ascii="Calibri" w:cs="Calibri" w:eastAsia="Calibri" w:hAnsi="Calibri"/>
+                <w:sz w:val="18"/>
+                <w:szCs w:val="18"/>
+              </w:rPr>
+              <w:t xml:space="preserve">)</w:t>
+            </w:r>
+          </w:p>
+        </w:tc>
+        <w:tc>
+          <w:tcPr>
+            <w:tcW w:type="dxa" w:w="1366"/>
+            <w:tcBorders>
+              <w:top w:val="single" w:color="BFBFBF" w:sz="4"/>
+              <w:left w:val="single" w:color="BFBFBF" w:sz="4"/>
+              <w:bottom w:val="single" w:color="BFBFBF" w:sz="4"/>
+              <w:right w:val="single" w:color="BFBFBF" w:sz="4"/>
+            </w:tcBorders>
+            <w:tcMar>
+              <w:top w:type="dxa" w:w="60"/>
+              <w:left w:type="dxa" w:w="100"/>
+              <w:bottom w:type="dxa" w:w="60"/>
+              <w:right w:type="dxa" w:w="100"/>
+            </w:tcMar>
+          </w:tcPr>
+          <w:p>
+            <w:r>
+              <w:rPr>
+                <w:rFonts w:ascii="Calibri" w:cs="Calibri" w:eastAsia="Calibri" w:hAnsi="Calibri"/>
+                <w:b/>
+                <w:bCs/>
+                <w:sz w:val="18"/>
+                <w:szCs w:val="18"/>
+              </w:rPr>
+              <w:t xml:space="preserve">Information</w:t>
+            </w:r>
+            <w:r>
+              <w:rPr>
+                <w:rFonts w:ascii="Calibri" w:cs="Calibri" w:eastAsia="Calibri" w:hAnsi="Calibri"/>
+                <w:sz w:val="18"/>
+                <w:szCs w:val="18"/>
+              </w:rPr>
+              <w:t xml:space="preserve"> and up</w:t>
+            </w:r>
+          </w:p>
+        </w:tc>
+        <w:tc>
+          <w:tcPr>
+            <w:tcW w:type="dxa" w:w="3035"/>
+            <w:tcBorders>
+              <w:top w:val="single" w:color="BFBFBF" w:sz="4"/>
+              <w:left w:val="single" w:color="BFBFBF" w:sz="4"/>
+              <w:bottom w:val="single" w:color="BFBFBF" w:sz="4"/>
+              <w:right w:val="single" w:color="BFBFBF" w:sz="4"/>
+            </w:tcBorders>
+            <w:tcMar>
+              <w:top w:type="dxa" w:w="60"/>
+              <w:left w:type="dxa" w:w="100"/>
+              <w:bottom w:type="dxa" w:w="60"/>
+              <w:right w:type="dxa" w:w="100"/>
+            </w:tcMar>
+          </w:tcPr>
+          <w:p>
+            <w:r>
+              <w:rPr>
+                <w:rFonts w:ascii="Calibri" w:cs="Calibri" w:eastAsia="Calibri" w:hAnsi="Calibri"/>
+                <w:sz w:val="18"/>
+                <w:szCs w:val="18"/>
+              </w:rPr>
+              <w:t xml:space="preserve">Live flow, warnings, errors</w:t>
+            </w:r>
+          </w:p>
+        </w:tc>
+        <w:tc>
+          <w:tcPr>
+            <w:tcW w:type="dxa" w:w="3037"/>
+            <w:tcBorders>
+              <w:top w:val="single" w:color="BFBFBF" w:sz="4"/>
+              <w:left w:val="single" w:color="BFBFBF" w:sz="4"/>
+              <w:bottom w:val="single" w:color="BFBFBF" w:sz="4"/>
+              <w:right w:val="single" w:color="BFBFBF" w:sz="4"/>
+            </w:tcBorders>
+            <w:tcMar>
+              <w:top w:type="dxa" w:w="60"/>
+              <w:left w:type="dxa" w:w="100"/>
+              <w:bottom w:type="dxa" w:w="60"/>
+              <w:right w:type="dxa" w:w="100"/>
+            </w:tcMar>
+          </w:tcPr>
+          <w:p>
+            <w:r>
+              <w:rPr>
+                <w:rFonts w:ascii="Calibri" w:cs="Calibri" w:eastAsia="Calibri" w:hAnsi="Calibri"/>
+                <w:sz w:val="18"/>
+                <w:szCs w:val="18"/>
+              </w:rPr>
+              <w:t xml:space="preserve">Synchronous: the last lines before a crash are always there. JSON in Docker</w:t>
+            </w:r>
+          </w:p>
+        </w:tc>
+      </w:tr>
+      <w:tr>
+        <w:tc>
+          <w:tcPr>
+            <w:tcW w:type="dxa" w:w="2200"/>
+            <w:tcBorders>
+              <w:top w:val="single" w:color="BFBFBF" w:sz="4"/>
+              <w:left w:val="single" w:color="BFBFBF" w:sz="4"/>
+              <w:bottom w:val="single" w:color="BFBFBF" w:sz="4"/>
+              <w:right w:val="single" w:color="BFBFBF" w:sz="4"/>
+            </w:tcBorders>
+            <w:tcMar>
+              <w:top w:type="dxa" w:w="60"/>
+              <w:left w:type="dxa" w:w="100"/>
+              <w:bottom w:type="dxa" w:w="60"/>
+              <w:right w:type="dxa" w:w="100"/>
+            </w:tcMar>
+          </w:tcPr>
+          <w:p>
+            <w:r>
+              <w:rPr>
+                <w:rFonts w:ascii="Calibri" w:cs="Calibri" w:eastAsia="Calibri" w:hAnsi="Calibri"/>
+                <w:sz w:val="18"/>
+                <w:szCs w:val="18"/>
+              </w:rPr>
+              <w:t xml:space="preserve">MongoDB </w:t>
+            </w:r>
+            <w:r>
+              <w:rPr>
+                <w:rFonts w:ascii="Consolas" w:cs="Consolas" w:eastAsia="Consolas" w:hAnsi="Consolas"/>
+                <w:color w:val="5B2C6F"/>
+                <w:sz w:val="16"/>
+                <w:szCs w:val="16"/>
+              </w:rPr>
+              <w:t xml:space="preserve">ta9_logs.logs</w:t>
+            </w:r>
+          </w:p>
+        </w:tc>
+        <w:tc>
+          <w:tcPr>
+            <w:tcW w:type="dxa" w:w="1366"/>
+            <w:tcBorders>
+              <w:top w:val="single" w:color="BFBFBF" w:sz="4"/>
+              <w:left w:val="single" w:color="BFBFBF" w:sz="4"/>
+              <w:bottom w:val="single" w:color="BFBFBF" w:sz="4"/>
+              <w:right w:val="single" w:color="BFBFBF" w:sz="4"/>
+            </w:tcBorders>
+            <w:tcMar>
+              <w:top w:type="dxa" w:w="60"/>
+              <w:left w:type="dxa" w:w="100"/>
+              <w:bottom w:type="dxa" w:w="60"/>
+              <w:right w:type="dxa" w:w="100"/>
+            </w:tcMar>
+          </w:tcPr>
+          <w:p>
+            <w:r>
+              <w:rPr>
+                <w:rFonts w:ascii="Calibri" w:cs="Calibri" w:eastAsia="Calibri" w:hAnsi="Calibri"/>
+                <w:b/>
+                <w:bCs/>
+                <w:sz w:val="18"/>
+                <w:szCs w:val="18"/>
+              </w:rPr>
+              <w:t xml:space="preserve">Debug</w:t>
+            </w:r>
+            <w:r>
+              <w:rPr>
+                <w:rFonts w:ascii="Calibri" w:cs="Calibri" w:eastAsia="Calibri" w:hAnsi="Calibri"/>
+                <w:sz w:val="18"/>
+                <w:szCs w:val="18"/>
+              </w:rPr>
+              <w:t xml:space="preserve"> and up</w:t>
+            </w:r>
+          </w:p>
+        </w:tc>
+        <w:tc>
+          <w:tcPr>
+            <w:tcW w:type="dxa" w:w="3035"/>
+            <w:tcBorders>
+              <w:top w:val="single" w:color="BFBFBF" w:sz="4"/>
+              <w:left w:val="single" w:color="BFBFBF" w:sz="4"/>
+              <w:bottom w:val="single" w:color="BFBFBF" w:sz="4"/>
+              <w:right w:val="single" w:color="BFBFBF" w:sz="4"/>
+            </w:tcBorders>
+            <w:tcMar>
+              <w:top w:type="dxa" w:w="60"/>
+              <w:left w:type="dxa" w:w="100"/>
+              <w:bottom w:type="dxa" w:w="60"/>
+              <w:right w:type="dxa" w:w="100"/>
+            </w:tcMar>
+          </w:tcPr>
+          <w:p>
+            <w:r>
+              <w:rPr>
+                <w:rFonts w:ascii="Calibri" w:cs="Calibri" w:eastAsia="Calibri" w:hAnsi="Calibri"/>
+                <w:sz w:val="18"/>
+                <w:szCs w:val="18"/>
+              </w:rPr>
+              <w:t xml:space="preserve">History for investigating failures, searchable across services</w:t>
+            </w:r>
+          </w:p>
+        </w:tc>
+        <w:tc>
+          <w:tcPr>
+            <w:tcW w:type="dxa" w:w="3037"/>
+            <w:tcBorders>
+              <w:top w:val="single" w:color="BFBFBF" w:sz="4"/>
+              <w:left w:val="single" w:color="BFBFBF" w:sz="4"/>
+              <w:bottom w:val="single" w:color="BFBFBF" w:sz="4"/>
+              <w:right w:val="single" w:color="BFBFBF" w:sz="4"/>
+            </w:tcBorders>
+            <w:tcMar>
+              <w:top w:type="dxa" w:w="60"/>
+              <w:left w:type="dxa" w:w="100"/>
+              <w:bottom w:type="dxa" w:w="60"/>
+              <w:right w:type="dxa" w:w="100"/>
+            </w:tcMar>
+          </w:tcPr>
+          <w:p>
+            <w:r>
+              <w:rPr>
+                <w:rFonts w:ascii="Consolas" w:cs="Consolas" w:eastAsia="Consolas" w:hAnsi="Consolas"/>
+                <w:color w:val="5B2C6F"/>
+                <w:sz w:val="16"/>
+                <w:szCs w:val="16"/>
+              </w:rPr>
+              <w:t xml:space="preserve">BatchingLogSink</w:t>
+            </w:r>
+            <w:r>
+              <w:rPr>
+                <w:rFonts w:ascii="Calibri" w:cs="Calibri" w:eastAsia="Calibri" w:hAnsi="Calibri"/>
+                <w:sz w:val="18"/>
+                <w:szCs w:val="18"/>
+              </w:rPr>
+              <w:t xml:space="preserve">: bounded queue (10,000), never blocks, batches of 100 / 1 s, drops counted and reported, flushed on shutdown and crash; 3 s fail-fast writer; 7-day TTL</w:t>
+            </w:r>
+          </w:p>
+        </w:tc>
+      </w:tr>
+    </w:tbl>
+    <w:p>
+      <w:pPr>
+        <w:spacing w:after="120"/>
+      </w:pPr>
+    </w:p>
+    <w:p>
+      <w:pPr>
+        <w:spacing w:after="120"/>
+      </w:pPr>
+      <w:r>
+        <w:rPr>
+          <w:rFonts w:ascii="Calibri" w:cs="Calibri" w:eastAsia="Calibri" w:hAnsi="Calibri"/>
+          <w:b/>
+          <w:bCs/>
+        </w:rPr>
+        <w:t xml:space="preserve">Levels.</w:t>
+      </w:r>
+      <w:r>
+        <w:rPr>
+          <w:rFonts w:ascii="Calibri" w:cs="Calibri" w:eastAsia="Calibri" w:hAnsi="Calibri"/>
+        </w:rPr>
+        <w:t xml:space="preserve"> Debug = detail (claims, HTTP results, progress, acks); Information = the job flow (created → dispatched → started → completed → applied → audited) and one line per HTTP request; Warning = handled problems (retry, one failed document, WS reconnect); Error = failed operations with the stack trace (giving up, rejected, storage down, all documents failed); Critical = unhandled exception, process terminating. Client errors (4xx) are not Errors.</w:t>
+      </w:r>
+    </w:p>
+    <w:p>
+      <w:pPr>
+        <w:spacing w:after="120"/>
+      </w:pPr>
+      <w:r>
+        <w:rPr>
+          <w:rFonts w:ascii="Calibri" w:cs="Calibri" w:eastAsia="Calibri" w:hAnsi="Calibri"/>
+          <w:b/>
+          <w:bCs/>
+        </w:rPr>
+        <w:t xml:space="preserve">Correlation.</w:t>
+      </w:r>
+      <w:r>
+        <w:rPr>
+          <w:rFonts w:ascii="Calibri" w:cs="Calibri" w:eastAsia="Calibri" w:hAnsi="Calibri"/>
+        </w:rPr>
+        <w:t xml:space="preserve"> </w:t>
+      </w:r>
+      <w:r>
+        <w:rPr>
+          <w:rFonts w:ascii="Consolas" w:cs="Consolas" w:eastAsia="Consolas" w:hAnsi="Consolas"/>
+          <w:color w:val="5B2C6F"/>
+          <w:sz w:val="19"/>
+          <w:szCs w:val="19"/>
+        </w:rPr>
+        <w:t xml:space="preserve">X-Correlation-Id</w:t>
+      </w:r>
+      <w:r>
+        <w:rPr>
+          <w:rFonts w:ascii="Calibri" w:cs="Calibri" w:eastAsia="Calibri" w:hAnsi="Calibri"/>
+        </w:rPr>
+        <w:t xml:space="preserve"> (or a generated id) is stored with the job and restored by every background step. It travels in HTTP headers and in WebSocket envelopes, and a scope adds </w:t>
+      </w:r>
+      <w:r>
+        <w:rPr>
+          <w:rFonts w:ascii="Consolas" w:cs="Consolas" w:eastAsia="Consolas" w:hAnsi="Consolas"/>
+          <w:color w:val="5B2C6F"/>
+          <w:sz w:val="19"/>
+          <w:szCs w:val="19"/>
+        </w:rPr>
+        <w:t xml:space="preserve">JobId</w:t>
+      </w:r>
+      <w:r>
+        <w:rPr>
+          <w:rFonts w:ascii="Calibri" w:cs="Calibri" w:eastAsia="Calibri" w:hAnsi="Calibri"/>
+        </w:rPr>
+        <w:t xml:space="preserve"> to every line of job processing. One query, </w:t>
+      </w:r>
+      <w:r>
+        <w:rPr>
+          <w:rFonts w:ascii="Consolas" w:cs="Consolas" w:eastAsia="Consolas" w:hAnsi="Consolas"/>
+          <w:color w:val="5B2C6F"/>
+          <w:sz w:val="19"/>
+          <w:szCs w:val="19"/>
+        </w:rPr>
+        <w:t xml:space="preserve">db.logs.find({ jobId })</w:t>
+      </w:r>
+      <w:r>
+        <w:rPr>
+          <w:rFonts w:ascii="Calibri" w:cs="Calibri" w:eastAsia="Calibri" w:hAnsi="Calibri"/>
+        </w:rPr>
+        <w:t xml:space="preserve">, shows a job's path through all three services.</w:t>
+      </w:r>
+    </w:p>
+    <w:p>
+      <w:pPr>
+        <w:spacing w:after="120"/>
+      </w:pPr>
+      <w:r>
+        <w:rPr>
+          <w:rFonts w:ascii="Calibri" w:cs="Calibri" w:eastAsia="Calibri" w:hAnsi="Calibri"/>
+          <w:b/>
+          <w:bCs/>
+        </w:rPr>
+        <w:t xml:space="preserve">Health and lifecycle.</w:t>
+      </w:r>
+      <w:r>
+        <w:rPr>
+          <w:rFonts w:ascii="Calibri" w:cs="Calibri" w:eastAsia="Calibri" w:hAnsi="Calibri"/>
+        </w:rPr>
+        <w:t xml:space="preserve"> </w:t>
+      </w:r>
+      <w:r>
+        <w:rPr>
+          <w:rFonts w:ascii="Consolas" w:cs="Consolas" w:eastAsia="Consolas" w:hAnsi="Consolas"/>
+          <w:color w:val="5B2C6F"/>
+          <w:sz w:val="19"/>
+          <w:szCs w:val="19"/>
+        </w:rPr>
+        <w:t xml:space="preserve">/health/live</w:t>
+      </w:r>
+      <w:r>
+        <w:rPr>
+          <w:rFonts w:ascii="Calibri" w:cs="Calibri" w:eastAsia="Calibri" w:hAnsi="Calibri"/>
+        </w:rPr>
+        <w:t xml:space="preserve"> and </w:t>
+      </w:r>
+      <w:r>
+        <w:rPr>
+          <w:rFonts w:ascii="Consolas" w:cs="Consolas" w:eastAsia="Consolas" w:hAnsi="Consolas"/>
+          <w:color w:val="5B2C6F"/>
+          <w:sz w:val="19"/>
+          <w:szCs w:val="19"/>
+        </w:rPr>
+        <w:t xml:space="preserve">/health/ready</w:t>
+      </w:r>
+      <w:r>
+        <w:rPr>
+          <w:rFonts w:ascii="Calibri" w:cs="Calibri" w:eastAsia="Calibri" w:hAnsi="Calibri"/>
+        </w:rPr>
+        <w:t xml:space="preserve"> (MongoDB; the processor WebSocket link reports Degraded). At startup each service logs where its logs go and </w:t>
+      </w:r>
+      <w:r>
+        <w:rPr>
+          <w:rFonts w:ascii="Calibri" w:cs="Calibri" w:eastAsia="Calibri" w:hAnsi="Calibri"/>
+          <w:i/>
+          <w:iCs/>
+        </w:rPr>
+        <w:t xml:space="preserve">Service started … listening on …</w:t>
+      </w:r>
+      <w:r>
+        <w:rPr>
+          <w:rFonts w:ascii="Calibri" w:cs="Calibri" w:eastAsia="Calibri" w:hAnsi="Calibri"/>
+        </w:rPr>
+        <w:t xml:space="preserve">. Unhandled exceptions are logged as Critical.</w:t>
+      </w:r>
+    </w:p>
+    <w:p>
+      <w:pPr>
+        <w:spacing w:after="120"/>
+      </w:pPr>
+      <w:r>
+        <w:rPr>
+          <w:rFonts w:ascii="Calibri" w:cs="Calibri" w:eastAsia="Calibri" w:hAnsi="Calibri"/>
+          <w:b/>
+          <w:bCs/>
+        </w:rPr>
+        <w:t xml:space="preserve">Logging never hurts the service.</w:t>
+      </w:r>
+      <w:r>
+        <w:rPr>
+          <w:rFonts w:ascii="Calibri" w:cs="Calibri" w:eastAsia="Calibri" w:hAnsi="Calibri"/>
+        </w:rPr>
+        <w:t xml:space="preserve"> If MongoDB is down, records are dropped and counted, </w:t>
+      </w:r>
+      <w:r>
+        <w:rPr>
+          <w:rFonts w:ascii="Consolas" w:cs="Consolas" w:eastAsia="Consolas" w:hAnsi="Consolas"/>
+          <w:color w:val="5B2C6F"/>
+          <w:sz w:val="19"/>
+          <w:szCs w:val="19"/>
+        </w:rPr>
+        <w:t xml:space="preserve">[ta9-log-sink]</w:t>
+      </w:r>
+      <w:r>
+        <w:rPr>
+          <w:rFonts w:ascii="Calibri" w:cs="Calibri" w:eastAsia="Calibri" w:hAnsi="Calibri"/>
+        </w:rPr>
+        <w:t xml:space="preserve"> lines go to stderr (at most one per 30 s), and the console keeps everything.</w:t>
+      </w:r>
+    </w:p>
+    <w:p>
+      <w:pPr>
+        <w:spacing w:after="120"/>
+      </w:pPr>
+      <w:r>
+        <w:rPr>
+          <w:rFonts w:ascii="Calibri" w:cs="Calibri" w:eastAsia="Calibri" w:hAnsi="Calibri"/>
+          <w:b/>
+          <w:bCs/>
+        </w:rPr>
+        <w:t xml:space="preserve">Next step:</w:t>
+      </w:r>
+      <w:r>
+        <w:rPr>
+          <w:rFonts w:ascii="Calibri" w:cs="Calibri" w:eastAsia="Calibri" w:hAnsi="Calibri"/>
+        </w:rPr>
+        <w:t xml:space="preserve"> OpenTelemetry traces and metrics (queue depth, dispatch latency, outbox size), and a dedicated log platform fed by the console JSON.</w:t>
+      </w:r>
+    </w:p>
+    <w:p>
+      <w:pPr>
+        <w:pStyle w:val="Heading2"/>
+      </w:pPr>
+      <w:bookmarkStart w:name="_Toc22" w:id="22"/>
+      <w:r>
+        <w:rPr>
+          <w:rFonts w:ascii="Calibri" w:cs="Calibri" w:eastAsia="Calibri" w:hAnsi="Calibri"/>
+        </w:rPr>
+        <w:t xml:space="preserve">9.5 Security (POC scope)</w:t>
+      </w:r>
+      <w:bookmarkEnd w:id="22"/>
+    </w:p>
+    <w:p>
+      <w:pPr>
+        <w:pStyle w:val="ListParagraph"/>
+        <w:numPr>
+          <w:ilvl w:val="0"/>
+          <w:numId w:val="2"/>
+        </w:numPr>
+      </w:pPr>
+      <w:r>
+        <w:rPr>
+          <w:rFonts w:ascii="Calibri" w:cs="Calibri" w:eastAsia="Calibri" w:hAnsi="Calibri"/>
+        </w:rPr>
+        <w:t xml:space="preserve">No authentication, by assignment. Production would add JWT on the public API and mTLS or a shared secret between services.</w:t>
+      </w:r>
+    </w:p>
+    <w:p>
+      <w:pPr>
+        <w:pStyle w:val="ListParagraph"/>
+        <w:numPr>
+          <w:ilvl w:val="0"/>
+          <w:numId w:val="2"/>
+        </w:numPr>
+      </w:pPr>
+      <w:r>
+        <w:rPr>
+          <w:rFonts w:ascii="Calibri" w:cs="Calibri" w:eastAsia="Calibri" w:hAnsi="Calibri"/>
+        </w:rPr>
+        <w:t xml:space="preserve">Input limits protect the services: 1,000 docs, 100 KB per document, 10 MB per body, 16 MB per WS message.</w:t>
+      </w:r>
+    </w:p>
+    <w:p>
+      <w:pPr>
+        <w:pStyle w:val="ListParagraph"/>
+        <w:numPr>
+          <w:ilvl w:val="0"/>
+          <w:numId w:val="2"/>
+        </w:numPr>
+      </w:pPr>
+      <w:r>
+        <w:rPr>
+          <w:rFonts w:ascii="Calibri" w:cs="Calibri" w:eastAsia="Calibri" w:hAnsi="Calibri"/>
+        </w:rPr>
+        <w:t xml:space="preserve">Correlation ids are sanitized to prevent log injection.</w:t>
+      </w:r>
+    </w:p>
+    <w:p>
+      <w:pPr>
+        <w:pStyle w:val="Heading1"/>
+        <w:sectPr>
+          <w:footerReference w:type="default" r:id="rId23"/>
+          <w:pgSz w:w="11906" w:h="16838" w:orient="portrait"/>
+          <w:pgMar w:top="1134" w:right="1134" w:bottom="1134" w:left="1134" w:header="708" w:footer="708" w:gutter="0"/>
+          <w:pgNumType/>
+          <w:docGrid w:linePitch="360"/>
+        </w:sectPr>
+      </w:pPr>
+      <w:bookmarkStart w:name="_Toc23" w:id="23"/>
+      <w:r>
+        <w:rPr>
+          <w:rFonts w:ascii="Calibri" w:cs="Calibri" w:eastAsia="Calibri" w:hAnsi="Calibri"/>
+        </w:rPr>
+        <w:t xml:space="preserve">10. Deployment</w:t>
+      </w:r>
+      <w:bookmarkEnd w:id="23"/>
+    </w:p>
+    <w:p>
+      <w:pPr>
+        <w:spacing w:after="120"/>
+      </w:pPr>
+      <w:r>
+        <w:rPr>
+          <w:rFonts w:ascii="Calibri" w:cs="Calibri" w:eastAsia="Calibri" w:hAnsi="Calibri"/>
+          <w:b/>
+          <w:bCs/>
+          <w:color w:val="1F4E79"/>
+          <w:sz w:val="26"/>
+          <w:szCs w:val="26"/>
+        </w:rPr>
+        <w:t xml:space="preserve">Deployment</w:t>
+      </w:r>
+    </w:p>
+    <w:p>
+      <w:pPr>
+        <w:jc w:val="center"/>
+      </w:pPr>
+      <w:r>
+        <w:drawing>
+          <wp:inline distT="0" distB="0" distL="0" distR="0">
+            <wp:extent cx="9248775" cy="4810125"/>
+            <wp:effectExtent t="0" r="0" b="0" l="0"/>
+            <wp:docPr id="10" name="Deployment" descr="Deployment" title="Deployment"/>
+            <wp:cNvGraphicFramePr>
+              <a:graphicFrameLocks xmlns:a="http://schemas.openxmlformats.org/drawingml/2006/main" noChangeAspect="1"/>
+            </wp:cNvGraphicFramePr>
+            <a:graphic xmlns:a="http://schemas.openxmlformats.org/drawingml/2006/main">
+              <a:graphicData uri="http://schemas.openxmlformats.org/drawingml/2006/picture">
+                <pic:pic xmlns:pic="http://schemas.openxmlformats.org/drawingml/2006/picture">
+                  <pic:nvPicPr>
+                    <pic:cNvPr id="0" name="" descr=""/>
+                    <pic:cNvPicPr>
+                      <a:picLocks noChangeAspect="1" noChangeArrowheads="1"/>
+                    </pic:cNvPicPr>
+                  </pic:nvPicPr>
+                  <pic:blipFill>
+                    <a:blip r:embed="rId37" cstate="none"/>
                     <a:srcRect/>
                     <a:stretch>
                       <a:fillRect/>
@@ -8269,7 +9644,7 @@
         <w:spacing w:before="80"/>
         <w:jc w:val="center"/>
         <w:sectPr>
-          <w:footerReference w:type="default" r:id="rId22"/>
+          <w:footerReference w:type="default" r:id="rId24"/>
           <w:pgSz w:w="16838" w:h="11906" w:orient="landscape"/>
           <w:pgMar w:top="1134" w:right="1134" w:bottom="1134" w:left="1134" w:header="708" w:footer="708" w:gutter="0"/>
           <w:pgNumType/>
@@ -8498,7 +9873,150 @@
         <w:rPr>
           <w:rFonts w:ascii="Calibri" w:cs="Calibri" w:eastAsia="Calibri" w:hAnsi="Calibri"/>
         </w:rPr>
+        <w:t xml:space="preserve">, </w:t>
+      </w:r>
+      <w:r>
+        <w:rPr>
+          <w:rFonts w:ascii="Consolas" w:cs="Consolas" w:eastAsia="Consolas" w:hAnsi="Consolas"/>
+          <w:color w:val="5B2C6F"/>
+          <w:sz w:val="19"/>
+          <w:szCs w:val="19"/>
+        </w:rPr>
+        <w:t xml:space="preserve">Logging__Mongo__MinimumLevel</w:t>
+      </w:r>
+      <w:r>
+        <w:rPr>
+          <w:rFonts w:ascii="Calibri" w:cs="Calibri" w:eastAsia="Calibri" w:hAnsi="Calibri"/>
+        </w:rPr>
         <w:t xml:space="preserve">).</w:t>
+      </w:r>
+    </w:p>
+    <w:p>
+      <w:pPr>
+        <w:pStyle w:val="ListParagraph"/>
+        <w:numPr>
+          <w:ilvl w:val="0"/>
+          <w:numId w:val="2"/>
+        </w:numPr>
+      </w:pPr>
+      <w:r>
+        <w:rPr>
+          <w:rFonts w:ascii="Calibri" w:cs="Calibri" w:eastAsia="Calibri" w:hAnsi="Calibri"/>
+          <w:b/>
+          <w:bCs/>
+        </w:rPr>
+        <w:t xml:space="preserve">Logs:</w:t>
+      </w:r>
+      <w:r>
+        <w:rPr>
+          <w:rFonts w:ascii="Calibri" w:cs="Calibri" w:eastAsia="Calibri" w:hAnsi="Calibri"/>
+        </w:rPr>
+        <w:t xml:space="preserve"> console → </w:t>
+      </w:r>
+      <w:r>
+        <w:rPr>
+          <w:rFonts w:ascii="Consolas" w:cs="Consolas" w:eastAsia="Consolas" w:hAnsi="Consolas"/>
+          <w:color w:val="5B2C6F"/>
+          <w:sz w:val="19"/>
+          <w:szCs w:val="19"/>
+        </w:rPr>
+        <w:t xml:space="preserve">docker compose logs</w:t>
+      </w:r>
+      <w:r>
+        <w:rPr>
+          <w:rFonts w:ascii="Calibri" w:cs="Calibri" w:eastAsia="Calibri" w:hAnsi="Calibri"/>
+        </w:rPr>
+        <w:t xml:space="preserve">; all services → MongoDB </w:t>
+      </w:r>
+      <w:r>
+        <w:rPr>
+          <w:rFonts w:ascii="Consolas" w:cs="Consolas" w:eastAsia="Consolas" w:hAnsi="Consolas"/>
+          <w:color w:val="5B2C6F"/>
+          <w:sz w:val="19"/>
+          <w:szCs w:val="19"/>
+        </w:rPr>
+        <w:t xml:space="preserve">ta9_logs.logs</w:t>
+      </w:r>
+      <w:r>
+        <w:rPr>
+          <w:rFonts w:ascii="Calibri" w:cs="Calibri" w:eastAsia="Calibri" w:hAnsi="Calibri"/>
+        </w:rPr>
+        <w:t xml:space="preserve"> (</w:t>
+      </w:r>
+      <w:r>
+        <w:rPr>
+          <w:rFonts w:ascii="Consolas" w:cs="Consolas" w:eastAsia="Consolas" w:hAnsi="Consolas"/>
+          <w:color w:val="5B2C6F"/>
+          <w:sz w:val="19"/>
+          <w:szCs w:val="19"/>
+        </w:rPr>
+        <w:t xml:space="preserve">Logging__Mongo__ConnectionString: mongodb://mongo:27017</w:t>
+      </w:r>
+      <w:r>
+        <w:rPr>
+          <w:rFonts w:ascii="Calibri" w:cs="Calibri" w:eastAsia="Calibri" w:hAnsi="Calibri"/>
+        </w:rPr>
+        <w:t xml:space="preserve">). Troubleshooting order: </w:t>
+      </w:r>
+      <w:r>
+        <w:rPr>
+          <w:rFonts w:ascii="Consolas" w:cs="Consolas" w:eastAsia="Consolas" w:hAnsi="Consolas"/>
+          <w:color w:val="5B2C6F"/>
+          <w:sz w:val="19"/>
+          <w:szCs w:val="19"/>
+        </w:rPr>
+        <w:t xml:space="preserve">docker compose ps</w:t>
+      </w:r>
+      <w:r>
+        <w:rPr>
+          <w:rFonts w:ascii="Calibri" w:cs="Calibri" w:eastAsia="Calibri" w:hAnsi="Calibri"/>
+        </w:rPr>
+        <w:t xml:space="preserve"> → </w:t>
+      </w:r>
+      <w:r>
+        <w:rPr>
+          <w:rFonts w:ascii="Consolas" w:cs="Consolas" w:eastAsia="Consolas" w:hAnsi="Consolas"/>
+          <w:color w:val="5B2C6F"/>
+          <w:sz w:val="19"/>
+          <w:szCs w:val="19"/>
+        </w:rPr>
+        <w:t xml:space="preserve">docker compose logs</w:t>
+      </w:r>
+      <w:r>
+        <w:rPr>
+          <w:rFonts w:ascii="Calibri" w:cs="Calibri" w:eastAsia="Calibri" w:hAnsi="Calibri"/>
+        </w:rPr>
+        <w:t xml:space="preserve"> → </w:t>
+      </w:r>
+      <w:r>
+        <w:rPr>
+          <w:rFonts w:ascii="Consolas" w:cs="Consolas" w:eastAsia="Consolas" w:hAnsi="Consolas"/>
+          <w:color w:val="5B2C6F"/>
+          <w:sz w:val="19"/>
+          <w:szCs w:val="19"/>
+        </w:rPr>
+        <w:t xml:space="preserve">ta9_logs.logs</w:t>
+      </w:r>
+      <w:r>
+        <w:rPr>
+          <w:rFonts w:ascii="Calibri" w:cs="Calibri" w:eastAsia="Calibri" w:hAnsi="Calibri"/>
+        </w:rPr>
+        <w:t xml:space="preserve"> → </w:t>
+      </w:r>
+      <w:r>
+        <w:rPr>
+          <w:rFonts w:ascii="Consolas" w:cs="Consolas" w:eastAsia="Consolas" w:hAnsi="Consolas"/>
+          <w:color w:val="5B2C6F"/>
+          <w:sz w:val="19"/>
+          <w:szCs w:val="19"/>
+        </w:rPr>
+        <w:t xml:space="preserve">/health/ready</w:t>
+      </w:r>
+      <w:r>
+        <w:rPr>
+          <w:rFonts w:ascii="Calibri" w:cs="Calibri" w:eastAsia="Calibri" w:hAnsi="Calibri"/>
+        </w:rPr>
+        <w:t xml:space="preserve"> (Installation Guide §5).</w:t>
       </w:r>
     </w:p>
     <w:p>
@@ -9141,6 +10659,89 @@
           </w:p>
         </w:tc>
       </w:tr>
+      <w:tr>
+        <w:tc>
+          <w:tcPr>
+            <w:tcW w:type="dxa" w:w="3323"/>
+            <w:tcBorders>
+              <w:top w:val="single" w:color="BFBFBF" w:sz="4"/>
+              <w:left w:val="single" w:color="BFBFBF" w:sz="4"/>
+              <w:bottom w:val="single" w:color="BFBFBF" w:sz="4"/>
+              <w:right w:val="single" w:color="BFBFBF" w:sz="4"/>
+            </w:tcBorders>
+            <w:tcMar>
+              <w:top w:type="dxa" w:w="60"/>
+              <w:left w:type="dxa" w:w="100"/>
+              <w:bottom w:type="dxa" w:w="60"/>
+              <w:right w:type="dxa" w:w="100"/>
+            </w:tcMar>
+          </w:tcPr>
+          <w:p>
+            <w:r>
+              <w:rPr>
+                <w:rFonts w:ascii="Calibri" w:cs="Calibri" w:eastAsia="Calibri" w:hAnsi="Calibri"/>
+                <w:sz w:val="18"/>
+                <w:szCs w:val="18"/>
+              </w:rPr>
+              <w:t xml:space="preserve">Logs share the MongoDB server with the data</w:t>
+            </w:r>
+          </w:p>
+        </w:tc>
+        <w:tc>
+          <w:tcPr>
+            <w:tcW w:type="dxa" w:w="3323"/>
+            <w:tcBorders>
+              <w:top w:val="single" w:color="BFBFBF" w:sz="4"/>
+              <w:left w:val="single" w:color="BFBFBF" w:sz="4"/>
+              <w:bottom w:val="single" w:color="BFBFBF" w:sz="4"/>
+              <w:right w:val="single" w:color="BFBFBF" w:sz="4"/>
+            </w:tcBorders>
+            <w:tcMar>
+              <w:top w:type="dxa" w:w="60"/>
+              <w:left w:type="dxa" w:w="100"/>
+              <w:bottom w:type="dxa" w:w="60"/>
+              <w:right w:type="dxa" w:w="100"/>
+            </w:tcMar>
+          </w:tcPr>
+          <w:p>
+            <w:r>
+              <w:rPr>
+                <w:rFonts w:ascii="Calibri" w:cs="Calibri" w:eastAsia="Calibri" w:hAnsi="Calibri"/>
+                <w:sz w:val="18"/>
+                <w:szCs w:val="18"/>
+              </w:rPr>
+              <w:t xml:space="preserve">Console keeps everything; losses are counted and reported</w:t>
+            </w:r>
+          </w:p>
+        </w:tc>
+        <w:tc>
+          <w:tcPr>
+            <w:tcW w:type="dxa" w:w="2992"/>
+            <w:tcBorders>
+              <w:top w:val="single" w:color="BFBFBF" w:sz="4"/>
+              <w:left w:val="single" w:color="BFBFBF" w:sz="4"/>
+              <w:bottom w:val="single" w:color="BFBFBF" w:sz="4"/>
+              <w:right w:val="single" w:color="BFBFBF" w:sz="4"/>
+            </w:tcBorders>
+            <w:tcMar>
+              <w:top w:type="dxa" w:w="60"/>
+              <w:left w:type="dxa" w:w="100"/>
+              <w:bottom w:type="dxa" w:w="60"/>
+              <w:right w:type="dxa" w:w="100"/>
+            </w:tcMar>
+          </w:tcPr>
+          <w:p>
+            <w:r>
+              <w:rPr>
+                <w:rFonts w:ascii="Calibri" w:cs="Calibri" w:eastAsia="Calibri" w:hAnsi="Calibri"/>
+                <w:sz w:val="18"/>
+                <w:szCs w:val="18"/>
+              </w:rPr>
+              <w:t xml:space="preserve">Separate log platform, OpenTelemetry</w:t>
+            </w:r>
+          </w:p>
+        </w:tc>
+      </w:tr>
     </w:tbl>
     <w:p>
       <w:pPr>
@@ -9148,7 +10749,7 @@
       </w:pPr>
     </w:p>
     <w:sectPr>
-      <w:footerReference w:type="default" r:id="rId23"/>
+      <w:footerReference w:type="default" r:id="rId25"/>
       <w:pgSz w:w="11906" w:h="16838" w:orient="portrait"/>
       <w:pgMar w:top="1134" w:right="1134" w:bottom="1134" w:left="1134" w:header="708" w:footer="708" w:gutter="0"/>
       <w:pgNumType/>
@@ -10195,7 +11796,207 @@
 </w:ftr>
 </file>
 
+<file path=word/footer19.xml><?xml version="1.0" encoding="utf-8"?>
+<w:ftr xmlns:wpc="http://schemas.microsoft.com/office/word/2010/wordprocessingCanvas" xmlns:mc="http://schemas.openxmlformats.org/markup-compatibility/2006" xmlns:o="urn:schemas-microsoft-com:office:office" xmlns:r="http://schemas.openxmlformats.org/officeDocument/2006/relationships" xmlns:m="http://schemas.openxmlformats.org/officeDocument/2006/math" xmlns:v="urn:schemas-microsoft-com:vml" xmlns:wp14="http://schemas.microsoft.com/office/word/2010/wordprocessingDrawing" xmlns:wp="http://schemas.openxmlformats.org/drawingml/2006/wordprocessingDrawing" xmlns:w10="urn:schemas-microsoft-com:office:word" xmlns:w="http://schemas.openxmlformats.org/wordprocessingml/2006/main" xmlns:w14="http://schemas.microsoft.com/office/word/2010/wordml" xmlns:w15="http://schemas.microsoft.com/office/word/2012/wordml" xmlns:wpg="http://schemas.microsoft.com/office/word/2010/wordprocessingGroup" xmlns:wpi="http://schemas.microsoft.com/office/word/2010/wordprocessingInk" xmlns:wne="http://schemas.microsoft.com/office/word/2006/wordml" xmlns:wps="http://schemas.microsoft.com/office/word/2010/wordprocessingShape">
+  <w:p>
+    <w:pPr>
+      <w:jc w:val="center"/>
+    </w:pPr>
+    <w:r>
+      <w:rPr>
+        <w:rFonts w:ascii="Calibri" w:cs="Calibri" w:eastAsia="Calibri" w:hAnsi="Calibri"/>
+        <w:color w:val="808080"/>
+        <w:sz w:val="16"/>
+        <w:szCs w:val="16"/>
+      </w:rPr>
+      <w:t xml:space="preserve">TA9 Document Processing — High-Level Design   ·   Page </w:t>
+    </w:r>
+    <w:r>
+      <w:rPr>
+        <w:rFonts w:ascii="Calibri" w:cs="Calibri" w:eastAsia="Calibri" w:hAnsi="Calibri"/>
+        <w:color w:val="808080"/>
+        <w:sz w:val="16"/>
+        <w:szCs w:val="16"/>
+      </w:rPr>
+      <w:fldChar w:fldCharType="begin"/>
+    </w:r>
+    <w:r>
+      <w:rPr>
+        <w:rFonts w:ascii="Calibri" w:cs="Calibri" w:eastAsia="Calibri" w:hAnsi="Calibri"/>
+        <w:color w:val="808080"/>
+        <w:sz w:val="16"/>
+        <w:szCs w:val="16"/>
+      </w:rPr>
+      <w:instrText xml:space="preserve">PAGE</w:instrText>
+    </w:r>
+    <w:r>
+      <w:rPr>
+        <w:rFonts w:ascii="Calibri" w:cs="Calibri" w:eastAsia="Calibri" w:hAnsi="Calibri"/>
+        <w:color w:val="808080"/>
+        <w:sz w:val="16"/>
+        <w:szCs w:val="16"/>
+      </w:rPr>
+      <w:fldChar w:fldCharType="separate"/>
+    </w:r>
+    <w:r>
+      <w:rPr>
+        <w:rFonts w:ascii="Calibri" w:cs="Calibri" w:eastAsia="Calibri" w:hAnsi="Calibri"/>
+        <w:color w:val="808080"/>
+        <w:sz w:val="16"/>
+        <w:szCs w:val="16"/>
+      </w:rPr>
+      <w:fldChar w:fldCharType="end"/>
+    </w:r>
+    <w:r>
+      <w:rPr>
+        <w:rFonts w:ascii="Calibri" w:cs="Calibri" w:eastAsia="Calibri" w:hAnsi="Calibri"/>
+        <w:color w:val="808080"/>
+        <w:sz w:val="16"/>
+        <w:szCs w:val="16"/>
+      </w:rPr>
+      <w:t xml:space="preserve"> of </w:t>
+    </w:r>
+    <w:r>
+      <w:rPr>
+        <w:rFonts w:ascii="Calibri" w:cs="Calibri" w:eastAsia="Calibri" w:hAnsi="Calibri"/>
+        <w:color w:val="808080"/>
+        <w:sz w:val="16"/>
+        <w:szCs w:val="16"/>
+      </w:rPr>
+      <w:fldChar w:fldCharType="begin"/>
+    </w:r>
+    <w:r>
+      <w:rPr>
+        <w:rFonts w:ascii="Calibri" w:cs="Calibri" w:eastAsia="Calibri" w:hAnsi="Calibri"/>
+        <w:color w:val="808080"/>
+        <w:sz w:val="16"/>
+        <w:szCs w:val="16"/>
+      </w:rPr>
+      <w:instrText xml:space="preserve">NUMPAGES</w:instrText>
+    </w:r>
+    <w:r>
+      <w:rPr>
+        <w:rFonts w:ascii="Calibri" w:cs="Calibri" w:eastAsia="Calibri" w:hAnsi="Calibri"/>
+        <w:color w:val="808080"/>
+        <w:sz w:val="16"/>
+        <w:szCs w:val="16"/>
+      </w:rPr>
+      <w:fldChar w:fldCharType="separate"/>
+    </w:r>
+    <w:r>
+      <w:rPr>
+        <w:rFonts w:ascii="Calibri" w:cs="Calibri" w:eastAsia="Calibri" w:hAnsi="Calibri"/>
+        <w:color w:val="808080"/>
+        <w:sz w:val="16"/>
+        <w:szCs w:val="16"/>
+      </w:rPr>
+      <w:fldChar w:fldCharType="end"/>
+    </w:r>
+  </w:p>
+</w:ftr>
+</file>
+
 <file path=word/footer2.xml><?xml version="1.0" encoding="utf-8"?>
+<w:ftr xmlns:wpc="http://schemas.microsoft.com/office/word/2010/wordprocessingCanvas" xmlns:mc="http://schemas.openxmlformats.org/markup-compatibility/2006" xmlns:o="urn:schemas-microsoft-com:office:office" xmlns:r="http://schemas.openxmlformats.org/officeDocument/2006/relationships" xmlns:m="http://schemas.openxmlformats.org/officeDocument/2006/math" xmlns:v="urn:schemas-microsoft-com:vml" xmlns:wp14="http://schemas.microsoft.com/office/word/2010/wordprocessingDrawing" xmlns:wp="http://schemas.openxmlformats.org/drawingml/2006/wordprocessingDrawing" xmlns:w10="urn:schemas-microsoft-com:office:word" xmlns:w="http://schemas.openxmlformats.org/wordprocessingml/2006/main" xmlns:w14="http://schemas.microsoft.com/office/word/2010/wordml" xmlns:w15="http://schemas.microsoft.com/office/word/2012/wordml" xmlns:wpg="http://schemas.microsoft.com/office/word/2010/wordprocessingGroup" xmlns:wpi="http://schemas.microsoft.com/office/word/2010/wordprocessingInk" xmlns:wne="http://schemas.microsoft.com/office/word/2006/wordml" xmlns:wps="http://schemas.microsoft.com/office/word/2010/wordprocessingShape">
+  <w:p>
+    <w:pPr>
+      <w:jc w:val="center"/>
+    </w:pPr>
+    <w:r>
+      <w:rPr>
+        <w:rFonts w:ascii="Calibri" w:cs="Calibri" w:eastAsia="Calibri" w:hAnsi="Calibri"/>
+        <w:color w:val="808080"/>
+        <w:sz w:val="16"/>
+        <w:szCs w:val="16"/>
+      </w:rPr>
+      <w:t xml:space="preserve">TA9 Document Processing — High-Level Design   ·   Page </w:t>
+    </w:r>
+    <w:r>
+      <w:rPr>
+        <w:rFonts w:ascii="Calibri" w:cs="Calibri" w:eastAsia="Calibri" w:hAnsi="Calibri"/>
+        <w:color w:val="808080"/>
+        <w:sz w:val="16"/>
+        <w:szCs w:val="16"/>
+      </w:rPr>
+      <w:fldChar w:fldCharType="begin"/>
+    </w:r>
+    <w:r>
+      <w:rPr>
+        <w:rFonts w:ascii="Calibri" w:cs="Calibri" w:eastAsia="Calibri" w:hAnsi="Calibri"/>
+        <w:color w:val="808080"/>
+        <w:sz w:val="16"/>
+        <w:szCs w:val="16"/>
+      </w:rPr>
+      <w:instrText xml:space="preserve">PAGE</w:instrText>
+    </w:r>
+    <w:r>
+      <w:rPr>
+        <w:rFonts w:ascii="Calibri" w:cs="Calibri" w:eastAsia="Calibri" w:hAnsi="Calibri"/>
+        <w:color w:val="808080"/>
+        <w:sz w:val="16"/>
+        <w:szCs w:val="16"/>
+      </w:rPr>
+      <w:fldChar w:fldCharType="separate"/>
+    </w:r>
+    <w:r>
+      <w:rPr>
+        <w:rFonts w:ascii="Calibri" w:cs="Calibri" w:eastAsia="Calibri" w:hAnsi="Calibri"/>
+        <w:color w:val="808080"/>
+        <w:sz w:val="16"/>
+        <w:szCs w:val="16"/>
+      </w:rPr>
+      <w:fldChar w:fldCharType="end"/>
+    </w:r>
+    <w:r>
+      <w:rPr>
+        <w:rFonts w:ascii="Calibri" w:cs="Calibri" w:eastAsia="Calibri" w:hAnsi="Calibri"/>
+        <w:color w:val="808080"/>
+        <w:sz w:val="16"/>
+        <w:szCs w:val="16"/>
+      </w:rPr>
+      <w:t xml:space="preserve"> of </w:t>
+    </w:r>
+    <w:r>
+      <w:rPr>
+        <w:rFonts w:ascii="Calibri" w:cs="Calibri" w:eastAsia="Calibri" w:hAnsi="Calibri"/>
+        <w:color w:val="808080"/>
+        <w:sz w:val="16"/>
+        <w:szCs w:val="16"/>
+      </w:rPr>
+      <w:fldChar w:fldCharType="begin"/>
+    </w:r>
+    <w:r>
+      <w:rPr>
+        <w:rFonts w:ascii="Calibri" w:cs="Calibri" w:eastAsia="Calibri" w:hAnsi="Calibri"/>
+        <w:color w:val="808080"/>
+        <w:sz w:val="16"/>
+        <w:szCs w:val="16"/>
+      </w:rPr>
+      <w:instrText xml:space="preserve">NUMPAGES</w:instrText>
+    </w:r>
+    <w:r>
+      <w:rPr>
+        <w:rFonts w:ascii="Calibri" w:cs="Calibri" w:eastAsia="Calibri" w:hAnsi="Calibri"/>
+        <w:color w:val="808080"/>
+        <w:sz w:val="16"/>
+        <w:szCs w:val="16"/>
+      </w:rPr>
+      <w:fldChar w:fldCharType="separate"/>
+    </w:r>
+    <w:r>
+      <w:rPr>
+        <w:rFonts w:ascii="Calibri" w:cs="Calibri" w:eastAsia="Calibri" w:hAnsi="Calibri"/>
+        <w:color w:val="808080"/>
+        <w:sz w:val="16"/>
+        <w:szCs w:val="16"/>
+      </w:rPr>
+      <w:fldChar w:fldCharType="end"/>
+    </w:r>
+  </w:p>
+</w:ftr>
+</file>
+
+<file path=word/footer20.xml><?xml version="1.0" encoding="utf-8"?>
 <w:ftr xmlns:wpc="http://schemas.microsoft.com/office/word/2010/wordprocessingCanvas" xmlns:mc="http://schemas.openxmlformats.org/markup-compatibility/2006" xmlns:o="urn:schemas-microsoft-com:office:office" xmlns:r="http://schemas.openxmlformats.org/officeDocument/2006/relationships" xmlns:m="http://schemas.openxmlformats.org/officeDocument/2006/math" xmlns:v="urn:schemas-microsoft-com:vml" xmlns:wp14="http://schemas.microsoft.com/office/word/2010/wordprocessingDrawing" xmlns:wp="http://schemas.openxmlformats.org/drawingml/2006/wordprocessingDrawing" xmlns:w10="urn:schemas-microsoft-com:office:word" xmlns:w="http://schemas.openxmlformats.org/wordprocessingml/2006/main" xmlns:w14="http://schemas.microsoft.com/office/word/2010/wordml" xmlns:w15="http://schemas.microsoft.com/office/word/2012/wordml" xmlns:wpg="http://schemas.microsoft.com/office/word/2010/wordprocessingGroup" xmlns:wpi="http://schemas.microsoft.com/office/word/2010/wordprocessingInk" xmlns:wne="http://schemas.microsoft.com/office/word/2006/wordml" xmlns:wps="http://schemas.microsoft.com/office/word/2010/wordprocessingShape">
   <w:p>
     <w:pPr>

</xml_diff>

<commit_message>
docs: known limitations & production roadmap, AI usage disclosure
- Limitations document: 39 limitations by area with IDs, impact, mitigation and production fix;
  P1/P2/P3 roadmap; draw.io page 12 (today vs proposed architecture); STD-linked tests
- AI usage document: tools, workflow, generated parts, verification, 15 prompts,
  14 changed/rejected/corrected AI outputs, lessons, integrity notes
- README sections 9 and 11, HLD section 11

Co-Authored-By: Claude Opus 5.5 <noreply@anthropic.com>
</commit_message>
<xml_diff>
--- a/docs/hld/TA9-HLD.docx
+++ b/docs/hld/TA9-HLD.docx
@@ -302,7 +302,7 @@
               </w:rPr>
               <w:t xml:space="preserve"> (one page per diagram). Open with </w:t>
             </w:r>
-            <w:hyperlink w:history="1" r:id="rIdvw7v24jx5eq9xsu0hnya9">
+            <w:hyperlink w:history="1" r:id="rIdwhlfukyy2qo6mayzowxd7">
               <w:r>
                 <w:rPr>
                   <w:rFonts w:ascii="Calibri" w:cs="Calibri" w:eastAsia="Calibri" w:hAnsi="Calibri"/>
@@ -553,6 +553,41 @@
                 <w:szCs w:val="16"/>
               </w:rPr>
               <w:t xml:space="preserve">../logging</w:t>
+            </w:r>
+            <w:r>
+              <w:rPr>
+                <w:rFonts w:ascii="Calibri" w:cs="Calibri" w:eastAsia="Calibri" w:hAnsi="Calibri"/>
+                <w:sz w:val="18"/>
+                <w:szCs w:val="18"/>
+              </w:rPr>
+              <w:t xml:space="preserve">), </w:t>
+            </w:r>
+            <w:r>
+              <w:rPr>
+                <w:rFonts w:ascii="Calibri" w:cs="Calibri" w:eastAsia="Calibri" w:hAnsi="Calibri"/>
+                <w:b/>
+                <w:bCs/>
+                <w:sz w:val="18"/>
+                <w:szCs w:val="18"/>
+              </w:rPr>
+              <w:t xml:space="preserve">Limitations &amp; production roadmap</w:t>
+            </w:r>
+            <w:r>
+              <w:rPr>
+                <w:rFonts w:ascii="Calibri" w:cs="Calibri" w:eastAsia="Calibri" w:hAnsi="Calibri"/>
+                <w:sz w:val="18"/>
+                <w:szCs w:val="18"/>
+              </w:rPr>
+              <w:t xml:space="preserve"> (</w:t>
+            </w:r>
+            <w:r>
+              <w:rPr>
+                <w:rFonts w:ascii="Consolas" w:cs="Consolas" w:eastAsia="Consolas" w:hAnsi="Consolas"/>
+                <w:color w:val="5B2C6F"/>
+                <w:sz w:val="16"/>
+                <w:szCs w:val="16"/>
+              </w:rPr>
+              <w:t xml:space="preserve">../limitations</w:t>
             </w:r>
             <w:r>
               <w:rPr>
@@ -584,8 +619,8 @@
         </w:tblBorders>
       </w:tblPr>
       <w:tblGrid>
-        <w:gridCol w:w="4965"/>
-        <w:gridCol w:w="4673"/>
+        <w:gridCol w:w="4551"/>
+        <w:gridCol w:w="5087"/>
       </w:tblGrid>
       <w:tr>
         <w:trPr>
@@ -593,7 +628,7 @@
         </w:trPr>
         <w:tc>
           <w:tcPr>
-            <w:tcW w:type="dxa" w:w="4965"/>
+            <w:tcW w:type="dxa" w:w="4551"/>
             <w:tcBorders>
               <w:top w:val="single" w:color="BFBFBF" w:sz="4"/>
               <w:left w:val="single" w:color="BFBFBF" w:sz="4"/>
@@ -623,7 +658,7 @@
         </w:tc>
         <w:tc>
           <w:tcPr>
-            <w:tcW w:type="dxa" w:w="4673"/>
+            <w:tcW w:type="dxa" w:w="5087"/>
             <w:tcBorders>
               <w:top w:val="single" w:color="BFBFBF" w:sz="4"/>
               <w:left w:val="single" w:color="BFBFBF" w:sz="4"/>
@@ -655,7 +690,7 @@
       <w:tr>
         <w:tc>
           <w:tcPr>
-            <w:tcW w:type="dxa" w:w="4965"/>
+            <w:tcW w:type="dxa" w:w="4551"/>
             <w:tcBorders>
               <w:top w:val="single" w:color="BFBFBF" w:sz="4"/>
               <w:left w:val="single" w:color="BFBFBF" w:sz="4"/>
@@ -682,7 +717,7 @@
         </w:tc>
         <w:tc>
           <w:tcPr>
-            <w:tcW w:type="dxa" w:w="4673"/>
+            <w:tcW w:type="dxa" w:w="5087"/>
             <w:tcBorders>
               <w:top w:val="single" w:color="BFBFBF" w:sz="4"/>
               <w:left w:val="single" w:color="BFBFBF" w:sz="4"/>
@@ -713,7 +748,7 @@
       <w:tr>
         <w:tc>
           <w:tcPr>
-            <w:tcW w:type="dxa" w:w="4965"/>
+            <w:tcW w:type="dxa" w:w="4551"/>
             <w:tcBorders>
               <w:top w:val="single" w:color="BFBFBF" w:sz="4"/>
               <w:left w:val="single" w:color="BFBFBF" w:sz="4"/>
@@ -740,7 +775,7 @@
         </w:tc>
         <w:tc>
           <w:tcPr>
-            <w:tcW w:type="dxa" w:w="4673"/>
+            <w:tcW w:type="dxa" w:w="5087"/>
             <w:tcBorders>
               <w:top w:val="single" w:color="BFBFBF" w:sz="4"/>
               <w:left w:val="single" w:color="BFBFBF" w:sz="4"/>
@@ -771,7 +806,7 @@
       <w:tr>
         <w:tc>
           <w:tcPr>
-            <w:tcW w:type="dxa" w:w="4965"/>
+            <w:tcW w:type="dxa" w:w="4551"/>
             <w:tcBorders>
               <w:top w:val="single" w:color="BFBFBF" w:sz="4"/>
               <w:left w:val="single" w:color="BFBFBF" w:sz="4"/>
@@ -798,7 +833,7 @@
         </w:tc>
         <w:tc>
           <w:tcPr>
-            <w:tcW w:type="dxa" w:w="4673"/>
+            <w:tcW w:type="dxa" w:w="5087"/>
             <w:tcBorders>
               <w:top w:val="single" w:color="BFBFBF" w:sz="4"/>
               <w:left w:val="single" w:color="BFBFBF" w:sz="4"/>
@@ -829,7 +864,7 @@
       <w:tr>
         <w:tc>
           <w:tcPr>
-            <w:tcW w:type="dxa" w:w="4965"/>
+            <w:tcW w:type="dxa" w:w="4551"/>
             <w:tcBorders>
               <w:top w:val="single" w:color="BFBFBF" w:sz="4"/>
               <w:left w:val="single" w:color="BFBFBF" w:sz="4"/>
@@ -856,7 +891,7 @@
         </w:tc>
         <w:tc>
           <w:tcPr>
-            <w:tcW w:type="dxa" w:w="4673"/>
+            <w:tcW w:type="dxa" w:w="5087"/>
             <w:tcBorders>
               <w:top w:val="single" w:color="BFBFBF" w:sz="4"/>
               <w:left w:val="single" w:color="BFBFBF" w:sz="4"/>
@@ -887,7 +922,7 @@
       <w:tr>
         <w:tc>
           <w:tcPr>
-            <w:tcW w:type="dxa" w:w="4965"/>
+            <w:tcW w:type="dxa" w:w="4551"/>
             <w:tcBorders>
               <w:top w:val="single" w:color="BFBFBF" w:sz="4"/>
               <w:left w:val="single" w:color="BFBFBF" w:sz="4"/>
@@ -914,7 +949,7 @@
         </w:tc>
         <w:tc>
           <w:tcPr>
-            <w:tcW w:type="dxa" w:w="4673"/>
+            <w:tcW w:type="dxa" w:w="5087"/>
             <w:tcBorders>
               <w:top w:val="single" w:color="BFBFBF" w:sz="4"/>
               <w:left w:val="single" w:color="BFBFBF" w:sz="4"/>
@@ -945,7 +980,7 @@
       <w:tr>
         <w:tc>
           <w:tcPr>
-            <w:tcW w:type="dxa" w:w="4965"/>
+            <w:tcW w:type="dxa" w:w="4551"/>
             <w:tcBorders>
               <w:top w:val="single" w:color="BFBFBF" w:sz="4"/>
               <w:left w:val="single" w:color="BFBFBF" w:sz="4"/>
@@ -972,7 +1007,7 @@
         </w:tc>
         <w:tc>
           <w:tcPr>
-            <w:tcW w:type="dxa" w:w="4673"/>
+            <w:tcW w:type="dxa" w:w="5087"/>
             <w:tcBorders>
               <w:top w:val="single" w:color="BFBFBF" w:sz="4"/>
               <w:left w:val="single" w:color="BFBFBF" w:sz="4"/>
@@ -1003,7 +1038,7 @@
       <w:tr>
         <w:tc>
           <w:tcPr>
-            <w:tcW w:type="dxa" w:w="4965"/>
+            <w:tcW w:type="dxa" w:w="4551"/>
             <w:tcBorders>
               <w:top w:val="single" w:color="BFBFBF" w:sz="4"/>
               <w:left w:val="single" w:color="BFBFBF" w:sz="4"/>
@@ -1030,7 +1065,7 @@
         </w:tc>
         <w:tc>
           <w:tcPr>
-            <w:tcW w:type="dxa" w:w="4673"/>
+            <w:tcW w:type="dxa" w:w="5087"/>
             <w:tcBorders>
               <w:top w:val="single" w:color="BFBFBF" w:sz="4"/>
               <w:left w:val="single" w:color="BFBFBF" w:sz="4"/>
@@ -1061,7 +1096,7 @@
       <w:tr>
         <w:tc>
           <w:tcPr>
-            <w:tcW w:type="dxa" w:w="4965"/>
+            <w:tcW w:type="dxa" w:w="4551"/>
             <w:tcBorders>
               <w:top w:val="single" w:color="BFBFBF" w:sz="4"/>
               <w:left w:val="single" w:color="BFBFBF" w:sz="4"/>
@@ -1088,7 +1123,7 @@
         </w:tc>
         <w:tc>
           <w:tcPr>
-            <w:tcW w:type="dxa" w:w="4673"/>
+            <w:tcW w:type="dxa" w:w="5087"/>
             <w:tcBorders>
               <w:top w:val="single" w:color="BFBFBF" w:sz="4"/>
               <w:left w:val="single" w:color="BFBFBF" w:sz="4"/>
@@ -1119,7 +1154,7 @@
       <w:tr>
         <w:tc>
           <w:tcPr>
-            <w:tcW w:type="dxa" w:w="4965"/>
+            <w:tcW w:type="dxa" w:w="4551"/>
             <w:tcBorders>
               <w:top w:val="single" w:color="BFBFBF" w:sz="4"/>
               <w:left w:val="single" w:color="BFBFBF" w:sz="4"/>
@@ -1146,7 +1181,7 @@
         </w:tc>
         <w:tc>
           <w:tcPr>
-            <w:tcW w:type="dxa" w:w="4673"/>
+            <w:tcW w:type="dxa" w:w="5087"/>
             <w:tcBorders>
               <w:top w:val="single" w:color="BFBFBF" w:sz="4"/>
               <w:left w:val="single" w:color="BFBFBF" w:sz="4"/>
@@ -1177,7 +1212,7 @@
       <w:tr>
         <w:tc>
           <w:tcPr>
-            <w:tcW w:type="dxa" w:w="4965"/>
+            <w:tcW w:type="dxa" w:w="4551"/>
             <w:tcBorders>
               <w:top w:val="single" w:color="BFBFBF" w:sz="4"/>
               <w:left w:val="single" w:color="BFBFBF" w:sz="4"/>
@@ -1204,7 +1239,7 @@
         </w:tc>
         <w:tc>
           <w:tcPr>
-            <w:tcW w:type="dxa" w:w="4673"/>
+            <w:tcW w:type="dxa" w:w="5087"/>
             <w:tcBorders>
               <w:top w:val="single" w:color="BFBFBF" w:sz="4"/>
               <w:left w:val="single" w:color="BFBFBF" w:sz="4"/>
@@ -1228,6 +1263,64 @@
                 <w:u w:val="single"/>
               </w:rPr>
               <w:t xml:space="preserve">§9.4 Observability</w:t>
+            </w:r>
+          </w:p>
+        </w:tc>
+      </w:tr>
+      <w:tr>
+        <w:tc>
+          <w:tcPr>
+            <w:tcW w:type="dxa" w:w="4551"/>
+            <w:tcBorders>
+              <w:top w:val="single" w:color="BFBFBF" w:sz="4"/>
+              <w:left w:val="single" w:color="BFBFBF" w:sz="4"/>
+              <w:bottom w:val="single" w:color="BFBFBF" w:sz="4"/>
+              <w:right w:val="single" w:color="BFBFBF" w:sz="4"/>
+            </w:tcBorders>
+            <w:tcMar>
+              <w:top w:type="dxa" w:w="60"/>
+              <w:left w:type="dxa" w:w="100"/>
+              <w:bottom w:type="dxa" w:w="60"/>
+              <w:right w:type="dxa" w:w="100"/>
+            </w:tcMar>
+          </w:tcPr>
+          <w:p>
+            <w:r>
+              <w:rPr>
+                <w:rFonts w:ascii="Calibri" w:cs="Calibri" w:eastAsia="Calibri" w:hAnsi="Calibri"/>
+                <w:sz w:val="18"/>
+                <w:szCs w:val="18"/>
+              </w:rPr>
+              <w:t xml:space="preserve">12. Production Architecture</w:t>
+            </w:r>
+          </w:p>
+        </w:tc>
+        <w:tc>
+          <w:tcPr>
+            <w:tcW w:type="dxa" w:w="5087"/>
+            <w:tcBorders>
+              <w:top w:val="single" w:color="BFBFBF" w:sz="4"/>
+              <w:left w:val="single" w:color="BFBFBF" w:sz="4"/>
+              <w:bottom w:val="single" w:color="BFBFBF" w:sz="4"/>
+              <w:right w:val="single" w:color="BFBFBF" w:sz="4"/>
+            </w:tcBorders>
+            <w:tcMar>
+              <w:top w:type="dxa" w:w="60"/>
+              <w:left w:type="dxa" w:w="100"/>
+              <w:bottom w:type="dxa" w:w="60"/>
+              <w:right w:type="dxa" w:w="100"/>
+            </w:tcMar>
+          </w:tcPr>
+          <w:p>
+            <w:r>
+              <w:rPr>
+                <w:rFonts w:ascii="Calibri" w:cs="Calibri" w:eastAsia="Calibri" w:hAnsi="Calibri"/>
+                <w:color w:val="0563C1"/>
+                <w:sz w:val="18"/>
+                <w:szCs w:val="18"/>
+                <w:u w:val="single"/>
+              </w:rPr>
+              <w:t xml:space="preserve">§11 Risks, limitations and future work</w:t>
             </w:r>
           </w:p>
         </w:tc>
@@ -2791,7 +2884,7 @@
                     </pic:cNvPicPr>
                   </pic:nvPicPr>
                   <pic:blipFill>
-                    <a:blip r:embed="rId28" cstate="none"/>
+                    <a:blip r:embed="rId30" cstate="none"/>
                     <a:srcRect/>
                     <a:stretch>
                       <a:fillRect/>
@@ -5950,7 +6043,7 @@
                     </pic:cNvPicPr>
                   </pic:nvPicPr>
                   <pic:blipFill>
-                    <a:blip r:embed="rId29" cstate="none"/>
+                    <a:blip r:embed="rId31" cstate="none"/>
                     <a:srcRect/>
                     <a:stretch>
                       <a:fillRect/>
@@ -6083,7 +6176,7 @@
                     </pic:cNvPicPr>
                   </pic:nvPicPr>
                   <pic:blipFill>
-                    <a:blip r:embed="rId30" cstate="none"/>
+                    <a:blip r:embed="rId32" cstate="none"/>
                     <a:srcRect/>
                     <a:stretch>
                       <a:fillRect/>
@@ -7134,7 +7227,7 @@
                     </pic:cNvPicPr>
                   </pic:nvPicPr>
                   <pic:blipFill>
-                    <a:blip r:embed="rId31" cstate="none"/>
+                    <a:blip r:embed="rId33" cstate="none"/>
                     <a:srcRect/>
                     <a:stretch>
                       <a:fillRect/>
@@ -7358,303 +7451,6 @@
             <wp:extent cx="8486775" cy="5229225"/>
             <wp:effectExtent t="0" r="0" b="0" l="0"/>
             <wp:docPr id="5" name="Job state machine" descr="Job state machine" title="Job state machine"/>
-            <wp:cNvGraphicFramePr>
-              <a:graphicFrameLocks xmlns:a="http://schemas.openxmlformats.org/drawingml/2006/main" noChangeAspect="1"/>
-            </wp:cNvGraphicFramePr>
-            <a:graphic xmlns:a="http://schemas.openxmlformats.org/drawingml/2006/main">
-              <a:graphicData uri="http://schemas.openxmlformats.org/drawingml/2006/picture">
-                <pic:pic xmlns:pic="http://schemas.openxmlformats.org/drawingml/2006/picture">
-                  <pic:nvPicPr>
-                    <pic:cNvPr id="0" name="" descr=""/>
-                    <pic:cNvPicPr>
-                      <a:picLocks noChangeAspect="1" noChangeArrowheads="1"/>
-                    </pic:cNvPicPr>
-                  </pic:nvPicPr>
-                  <pic:blipFill>
-                    <a:blip r:embed="rId32" cstate="none"/>
-                    <a:srcRect/>
-                    <a:stretch>
-                      <a:fillRect/>
-                    </a:stretch>
-                  </pic:blipFill>
-                  <pic:spPr bwMode="auto">
-                    <a:xfrm>
-                      <a:off x="0" y="0"/>
-                      <a:ext cx="8486775" cy="5229225"/>
-                    </a:xfrm>
-                    <a:prstGeom prst="rect">
-                      <a:avLst/>
-                    </a:prstGeom>
-                  </pic:spPr>
-                </pic:pic>
-              </a:graphicData>
-            </a:graphic>
-          </wp:inline>
-        </w:drawing>
-      </w:r>
-    </w:p>
-    <w:p>
-      <w:pPr>
-        <w:spacing w:before="80"/>
-        <w:jc w:val="center"/>
-        <w:sectPr>
-          <w:footerReference w:type="default" r:id="rId14"/>
-          <w:pgSz w:w="16838" w:h="11906" w:orient="landscape"/>
-          <w:pgMar w:top="1134" w:right="1134" w:bottom="1134" w:left="1134" w:header="708" w:footer="708" w:gutter="0"/>
-          <w:pgNumType/>
-          <w:docGrid w:linePitch="360"/>
-        </w:sectPr>
-      </w:pPr>
-      <w:r>
-        <w:rPr>
-          <w:rFonts w:ascii="Calibri" w:cs="Calibri" w:eastAsia="Calibri" w:hAnsi="Calibri"/>
-          <w:i/>
-          <w:iCs/>
-          <w:color w:val="808080"/>
-          <w:sz w:val="16"/>
-          <w:szCs w:val="16"/>
-        </w:rPr>
-        <w:t xml:space="preserve">draw.io page </w:t>
-      </w:r>
-      <w:r>
-        <w:rPr>
-          <w:rFonts w:ascii="Calibri" w:cs="Calibri" w:eastAsia="Calibri" w:hAnsi="Calibri"/>
-          <w:b/>
-          <w:bCs/>
-          <w:i/>
-          <w:iCs/>
-          <w:color w:val="808080"/>
-          <w:sz w:val="16"/>
-          <w:szCs w:val="16"/>
-        </w:rPr>
-        <w:t xml:space="preserve">4. Job State Machine</w:t>
-      </w:r>
-      <w:r>
-        <w:rPr>
-          <w:rFonts w:ascii="Calibri" w:cs="Calibri" w:eastAsia="Calibri" w:hAnsi="Calibri"/>
-          <w:i/>
-          <w:iCs/>
-          <w:color w:val="808080"/>
-          <w:sz w:val="16"/>
-          <w:szCs w:val="16"/>
-        </w:rPr>
-        <w:t xml:space="preserve"> · editable source: docs/hld/diagrams/ta9-hld.drawio</w:t>
-      </w:r>
-    </w:p>
-    <w:p>
-      <w:pPr>
-        <w:spacing w:after="120"/>
-      </w:pPr>
-      <w:r>
-        <w:rPr>
-          <w:rFonts w:ascii="Calibri" w:cs="Calibri" w:eastAsia="Calibri" w:hAnsi="Calibri"/>
-        </w:rPr>
-        <w:t xml:space="preserve">Terminal states accept nothing, so duplicates, replays and late events are no-ops. Every write goes through optimistic concurrency (load → mutate → replace if </w:t>
-      </w:r>
-      <w:r>
-        <w:rPr>
-          <w:rFonts w:ascii="Consolas" w:cs="Consolas" w:eastAsia="Consolas" w:hAnsi="Consolas"/>
-          <w:color w:val="5B2C6F"/>
-          <w:sz w:val="19"/>
-          <w:szCs w:val="19"/>
-        </w:rPr>
-        <w:t xml:space="preserve">version</w:t>
-      </w:r>
-      <w:r>
-        <w:rPr>
-          <w:rFonts w:ascii="Calibri" w:cs="Calibri" w:eastAsia="Calibri" w:hAnsi="Calibri"/>
-        </w:rPr>
-        <w:t xml:space="preserve"> is unchanged → retry), so the WS handler, dispatcher, reconciler and cancel requests never overwrite each other.</w:t>
-      </w:r>
-    </w:p>
-    <w:p>
-      <w:pPr>
-        <w:pStyle w:val="Heading1"/>
-      </w:pPr>
-      <w:bookmarkStart w:name="_Toc13" w:id="13"/>
-      <w:r>
-        <w:rPr>
-          <w:rFonts w:ascii="Calibri" w:cs="Calibri" w:eastAsia="Calibri" w:hAnsi="Calibri"/>
-        </w:rPr>
-        <w:t xml:space="preserve">8. Sequence diagrams</w:t>
-      </w:r>
-      <w:bookmarkEnd w:id="13"/>
-    </w:p>
-    <w:p>
-      <w:pPr>
-        <w:pStyle w:val="Heading2"/>
-        <w:sectPr>
-          <w:footerReference w:type="default" r:id="rId15"/>
-          <w:pgSz w:w="11906" w:h="16838" w:orient="portrait"/>
-          <w:pgMar w:top="1134" w:right="1134" w:bottom="1134" w:left="1134" w:header="708" w:footer="708" w:gutter="0"/>
-          <w:pgNumType/>
-          <w:docGrid w:linePitch="360"/>
-        </w:sectPr>
-      </w:pPr>
-      <w:bookmarkStart w:name="_Toc14" w:id="14"/>
-      <w:r>
-        <w:rPr>
-          <w:rFonts w:ascii="Calibri" w:cs="Calibri" w:eastAsia="Calibri" w:hAnsi="Calibri"/>
-        </w:rPr>
-        <w:t xml:space="preserve">8.1 Happy path</w:t>
-      </w:r>
-      <w:bookmarkEnd w:id="14"/>
-    </w:p>
-    <w:p>
-      <w:pPr>
-        <w:spacing w:after="120"/>
-      </w:pPr>
-      <w:r>
-        <w:rPr>
-          <w:rFonts w:ascii="Calibri" w:cs="Calibri" w:eastAsia="Calibri" w:hAnsi="Calibri"/>
-          <w:b/>
-          <w:bCs/>
-          <w:color w:val="1F4E79"/>
-          <w:sz w:val="26"/>
-          <w:szCs w:val="26"/>
-        </w:rPr>
-        <w:t xml:space="preserve">Sequence — happy path</w:t>
-      </w:r>
-    </w:p>
-    <w:p>
-      <w:pPr>
-        <w:jc w:val="center"/>
-      </w:pPr>
-      <w:r>
-        <w:drawing>
-          <wp:inline distT="0" distB="0" distL="0" distR="0">
-            <wp:extent cx="6438900" cy="5229225"/>
-            <wp:effectExtent t="0" r="0" b="0" l="0"/>
-            <wp:docPr id="6" name="Sequence — happy path" descr="Sequence — happy path" title="Sequence — happy path"/>
-            <wp:cNvGraphicFramePr>
-              <a:graphicFrameLocks xmlns:a="http://schemas.openxmlformats.org/drawingml/2006/main" noChangeAspect="1"/>
-            </wp:cNvGraphicFramePr>
-            <a:graphic xmlns:a="http://schemas.openxmlformats.org/drawingml/2006/main">
-              <a:graphicData uri="http://schemas.openxmlformats.org/drawingml/2006/picture">
-                <pic:pic xmlns:pic="http://schemas.openxmlformats.org/drawingml/2006/picture">
-                  <pic:nvPicPr>
-                    <pic:cNvPr id="0" name="" descr=""/>
-                    <pic:cNvPicPr>
-                      <a:picLocks noChangeAspect="1" noChangeArrowheads="1"/>
-                    </pic:cNvPicPr>
-                  </pic:nvPicPr>
-                  <pic:blipFill>
-                    <a:blip r:embed="rId33" cstate="none"/>
-                    <a:srcRect/>
-                    <a:stretch>
-                      <a:fillRect/>
-                    </a:stretch>
-                  </pic:blipFill>
-                  <pic:spPr bwMode="auto">
-                    <a:xfrm>
-                      <a:off x="0" y="0"/>
-                      <a:ext cx="6438900" cy="5229225"/>
-                    </a:xfrm>
-                    <a:prstGeom prst="rect">
-                      <a:avLst/>
-                    </a:prstGeom>
-                  </pic:spPr>
-                </pic:pic>
-              </a:graphicData>
-            </a:graphic>
-          </wp:inline>
-        </w:drawing>
-      </w:r>
-    </w:p>
-    <w:p>
-      <w:pPr>
-        <w:spacing w:before="80"/>
-        <w:jc w:val="center"/>
-        <w:sectPr>
-          <w:footerReference w:type="default" r:id="rId16"/>
-          <w:pgSz w:w="16838" w:h="11906" w:orient="landscape"/>
-          <w:pgMar w:top="1134" w:right="1134" w:bottom="1134" w:left="1134" w:header="708" w:footer="708" w:gutter="0"/>
-          <w:pgNumType/>
-          <w:docGrid w:linePitch="360"/>
-        </w:sectPr>
-      </w:pPr>
-      <w:r>
-        <w:rPr>
-          <w:rFonts w:ascii="Calibri" w:cs="Calibri" w:eastAsia="Calibri" w:hAnsi="Calibri"/>
-          <w:i/>
-          <w:iCs/>
-          <w:color w:val="808080"/>
-          <w:sz w:val="16"/>
-          <w:szCs w:val="16"/>
-        </w:rPr>
-        <w:t xml:space="preserve">draw.io page </w:t>
-      </w:r>
-      <w:r>
-        <w:rPr>
-          <w:rFonts w:ascii="Calibri" w:cs="Calibri" w:eastAsia="Calibri" w:hAnsi="Calibri"/>
-          <w:b/>
-          <w:bCs/>
-          <w:i/>
-          <w:iCs/>
-          <w:color w:val="808080"/>
-          <w:sz w:val="16"/>
-          <w:szCs w:val="16"/>
-        </w:rPr>
-        <w:t xml:space="preserve">5a. Sequence — Happy Path</w:t>
-      </w:r>
-      <w:r>
-        <w:rPr>
-          <w:rFonts w:ascii="Calibri" w:cs="Calibri" w:eastAsia="Calibri" w:hAnsi="Calibri"/>
-          <w:i/>
-          <w:iCs/>
-          <w:color w:val="808080"/>
-          <w:sz w:val="16"/>
-          <w:szCs w:val="16"/>
-        </w:rPr>
-        <w:t xml:space="preserve"> (30 numbered messages, including SSE and audit) · editable source: docs/hld/diagrams/ta9-hld.drawio</w:t>
-      </w:r>
-    </w:p>
-    <w:p>
-      <w:pPr>
-        <w:pStyle w:val="Heading2"/>
-        <w:sectPr>
-          <w:footerReference w:type="default" r:id="rId17"/>
-          <w:pgSz w:w="11906" w:h="16838" w:orient="portrait"/>
-          <w:pgMar w:top="1134" w:right="1134" w:bottom="1134" w:left="1134" w:header="708" w:footer="708" w:gutter="0"/>
-          <w:pgNumType/>
-          <w:docGrid w:linePitch="360"/>
-        </w:sectPr>
-      </w:pPr>
-      <w:bookmarkStart w:name="_Toc15" w:id="15"/>
-      <w:r>
-        <w:rPr>
-          <w:rFonts w:ascii="Calibri" w:cs="Calibri" w:eastAsia="Calibri" w:hAnsi="Calibri"/>
-        </w:rPr>
-        <w:t xml:space="preserve">8.2 Processor restart mid-job</w:t>
-      </w:r>
-      <w:bookmarkEnd w:id="15"/>
-    </w:p>
-    <w:p>
-      <w:pPr>
-        <w:spacing w:after="120"/>
-      </w:pPr>
-      <w:r>
-        <w:rPr>
-          <w:rFonts w:ascii="Calibri" w:cs="Calibri" w:eastAsia="Calibri" w:hAnsi="Calibri"/>
-          <w:b/>
-          <w:bCs/>
-          <w:color w:val="1F4E79"/>
-          <w:sz w:val="26"/>
-          <w:szCs w:val="26"/>
-        </w:rPr>
-        <w:t xml:space="preserve">Sequence — processor restart</w:t>
-      </w:r>
-    </w:p>
-    <w:p>
-      <w:pPr>
-        <w:jc w:val="center"/>
-      </w:pPr>
-      <w:r>
-        <w:drawing>
-          <wp:inline distT="0" distB="0" distL="0" distR="0">
-            <wp:extent cx="7867650" cy="5229225"/>
-            <wp:effectExtent t="0" r="0" b="0" l="0"/>
-            <wp:docPr id="7" name="Sequence — processor restart" descr="Sequence — processor restart" title="Sequence — processor restart"/>
             <wp:cNvGraphicFramePr>
               <a:graphicFrameLocks xmlns:a="http://schemas.openxmlformats.org/drawingml/2006/main" noChangeAspect="1"/>
             </wp:cNvGraphicFramePr>
@@ -7677,7 +7473,7 @@
                   <pic:spPr bwMode="auto">
                     <a:xfrm>
                       <a:off x="0" y="0"/>
-                      <a:ext cx="7867650" cy="5229225"/>
+                      <a:ext cx="8486775" cy="5229225"/>
                     </a:xfrm>
                     <a:prstGeom prst="rect">
                       <a:avLst/>
@@ -7695,7 +7491,7 @@
         <w:spacing w:before="80"/>
         <w:jc w:val="center"/>
         <w:sectPr>
-          <w:footerReference w:type="default" r:id="rId18"/>
+          <w:footerReference w:type="default" r:id="rId14"/>
           <w:pgSz w:w="16838" w:h="11906" w:orient="landscape"/>
           <w:pgMar w:top="1134" w:right="1134" w:bottom="1134" w:left="1134" w:header="708" w:footer="708" w:gutter="0"/>
           <w:pgNumType/>
@@ -7724,7 +7520,7 @@
           <w:sz w:val="16"/>
           <w:szCs w:val="16"/>
         </w:rPr>
-        <w:t xml:space="preserve">5b. Sequence — Processor Restart</w:t>
+        <w:t xml:space="preserve">4. Job State Machine</w:t>
       </w:r>
       <w:r>
         <w:rPr>
@@ -7740,23 +7536,62 @@
     </w:p>
     <w:p>
       <w:pPr>
+        <w:spacing w:after="120"/>
+      </w:pPr>
+      <w:r>
+        <w:rPr>
+          <w:rFonts w:ascii="Calibri" w:cs="Calibri" w:eastAsia="Calibri" w:hAnsi="Calibri"/>
+        </w:rPr>
+        <w:t xml:space="preserve">Terminal states accept nothing, so duplicates, replays and late events are no-ops. Every write goes through optimistic concurrency (load → mutate → replace if </w:t>
+      </w:r>
+      <w:r>
+        <w:rPr>
+          <w:rFonts w:ascii="Consolas" w:cs="Consolas" w:eastAsia="Consolas" w:hAnsi="Consolas"/>
+          <w:color w:val="5B2C6F"/>
+          <w:sz w:val="19"/>
+          <w:szCs w:val="19"/>
+        </w:rPr>
+        <w:t xml:space="preserve">version</w:t>
+      </w:r>
+      <w:r>
+        <w:rPr>
+          <w:rFonts w:ascii="Calibri" w:cs="Calibri" w:eastAsia="Calibri" w:hAnsi="Calibri"/>
+        </w:rPr>
+        <w:t xml:space="preserve"> is unchanged → retry), so the WS handler, dispatcher, reconciler and cancel requests never overwrite each other.</w:t>
+      </w:r>
+    </w:p>
+    <w:p>
+      <w:pPr>
+        <w:pStyle w:val="Heading1"/>
+      </w:pPr>
+      <w:bookmarkStart w:name="_Toc13" w:id="13"/>
+      <w:r>
+        <w:rPr>
+          <w:rFonts w:ascii="Calibri" w:cs="Calibri" w:eastAsia="Calibri" w:hAnsi="Calibri"/>
+        </w:rPr>
+        <w:t xml:space="preserve">8. Sequence diagrams</w:t>
+      </w:r>
+      <w:bookmarkEnd w:id="13"/>
+    </w:p>
+    <w:p>
+      <w:pPr>
         <w:pStyle w:val="Heading2"/>
         <w:sectPr>
-          <w:footerReference w:type="default" r:id="rId19"/>
+          <w:footerReference w:type="default" r:id="rId15"/>
           <w:pgSz w:w="11906" w:h="16838" w:orient="portrait"/>
           <w:pgMar w:top="1134" w:right="1134" w:bottom="1134" w:left="1134" w:header="708" w:footer="708" w:gutter="0"/>
           <w:pgNumType/>
           <w:docGrid w:linePitch="360"/>
         </w:sectPr>
       </w:pPr>
-      <w:bookmarkStart w:name="_Toc16" w:id="16"/>
-      <w:r>
-        <w:rPr>
-          <w:rFonts w:ascii="Calibri" w:cs="Calibri" w:eastAsia="Calibri" w:hAnsi="Calibri"/>
-        </w:rPr>
-        <w:t xml:space="preserve">8.3 WebSocket disconnect, reconnect and replay</w:t>
-      </w:r>
-      <w:bookmarkEnd w:id="16"/>
+      <w:bookmarkStart w:name="_Toc14" w:id="14"/>
+      <w:r>
+        <w:rPr>
+          <w:rFonts w:ascii="Calibri" w:cs="Calibri" w:eastAsia="Calibri" w:hAnsi="Calibri"/>
+        </w:rPr>
+        <w:t xml:space="preserve">8.1 Happy path</w:t>
+      </w:r>
+      <w:bookmarkEnd w:id="14"/>
     </w:p>
     <w:p>
       <w:pPr>
@@ -7771,7 +7606,7 @@
           <w:sz w:val="26"/>
           <w:szCs w:val="26"/>
         </w:rPr>
-        <w:t xml:space="preserve">Sequence — WebSocket reconnect</w:t>
+        <w:t xml:space="preserve">Sequence — happy path</w:t>
       </w:r>
     </w:p>
     <w:p>
@@ -7781,9 +7616,9 @@
       <w:r>
         <w:drawing>
           <wp:inline distT="0" distB="0" distL="0" distR="0">
-            <wp:extent cx="7029450" cy="5229225"/>
+            <wp:extent cx="6438900" cy="5229225"/>
             <wp:effectExtent t="0" r="0" b="0" l="0"/>
-            <wp:docPr id="8" name="Sequence — WebSocket reconnect" descr="Sequence — WebSocket reconnect" title="Sequence — WebSocket reconnect"/>
+            <wp:docPr id="6" name="Sequence — happy path" descr="Sequence — happy path" title="Sequence — happy path"/>
             <wp:cNvGraphicFramePr>
               <a:graphicFrameLocks xmlns:a="http://schemas.openxmlformats.org/drawingml/2006/main" noChangeAspect="1"/>
             </wp:cNvGraphicFramePr>
@@ -7806,6 +7641,264 @@
                   <pic:spPr bwMode="auto">
                     <a:xfrm>
                       <a:off x="0" y="0"/>
+                      <a:ext cx="6438900" cy="5229225"/>
+                    </a:xfrm>
+                    <a:prstGeom prst="rect">
+                      <a:avLst/>
+                    </a:prstGeom>
+                  </pic:spPr>
+                </pic:pic>
+              </a:graphicData>
+            </a:graphic>
+          </wp:inline>
+        </w:drawing>
+      </w:r>
+    </w:p>
+    <w:p>
+      <w:pPr>
+        <w:spacing w:before="80"/>
+        <w:jc w:val="center"/>
+        <w:sectPr>
+          <w:footerReference w:type="default" r:id="rId16"/>
+          <w:pgSz w:w="16838" w:h="11906" w:orient="landscape"/>
+          <w:pgMar w:top="1134" w:right="1134" w:bottom="1134" w:left="1134" w:header="708" w:footer="708" w:gutter="0"/>
+          <w:pgNumType/>
+          <w:docGrid w:linePitch="360"/>
+        </w:sectPr>
+      </w:pPr>
+      <w:r>
+        <w:rPr>
+          <w:rFonts w:ascii="Calibri" w:cs="Calibri" w:eastAsia="Calibri" w:hAnsi="Calibri"/>
+          <w:i/>
+          <w:iCs/>
+          <w:color w:val="808080"/>
+          <w:sz w:val="16"/>
+          <w:szCs w:val="16"/>
+        </w:rPr>
+        <w:t xml:space="preserve">draw.io page </w:t>
+      </w:r>
+      <w:r>
+        <w:rPr>
+          <w:rFonts w:ascii="Calibri" w:cs="Calibri" w:eastAsia="Calibri" w:hAnsi="Calibri"/>
+          <w:b/>
+          <w:bCs/>
+          <w:i/>
+          <w:iCs/>
+          <w:color w:val="808080"/>
+          <w:sz w:val="16"/>
+          <w:szCs w:val="16"/>
+        </w:rPr>
+        <w:t xml:space="preserve">5a. Sequence — Happy Path</w:t>
+      </w:r>
+      <w:r>
+        <w:rPr>
+          <w:rFonts w:ascii="Calibri" w:cs="Calibri" w:eastAsia="Calibri" w:hAnsi="Calibri"/>
+          <w:i/>
+          <w:iCs/>
+          <w:color w:val="808080"/>
+          <w:sz w:val="16"/>
+          <w:szCs w:val="16"/>
+        </w:rPr>
+        <w:t xml:space="preserve"> (30 numbered messages, including SSE and audit) · editable source: docs/hld/diagrams/ta9-hld.drawio</w:t>
+      </w:r>
+    </w:p>
+    <w:p>
+      <w:pPr>
+        <w:pStyle w:val="Heading2"/>
+        <w:sectPr>
+          <w:footerReference w:type="default" r:id="rId17"/>
+          <w:pgSz w:w="11906" w:h="16838" w:orient="portrait"/>
+          <w:pgMar w:top="1134" w:right="1134" w:bottom="1134" w:left="1134" w:header="708" w:footer="708" w:gutter="0"/>
+          <w:pgNumType/>
+          <w:docGrid w:linePitch="360"/>
+        </w:sectPr>
+      </w:pPr>
+      <w:bookmarkStart w:name="_Toc15" w:id="15"/>
+      <w:r>
+        <w:rPr>
+          <w:rFonts w:ascii="Calibri" w:cs="Calibri" w:eastAsia="Calibri" w:hAnsi="Calibri"/>
+        </w:rPr>
+        <w:t xml:space="preserve">8.2 Processor restart mid-job</w:t>
+      </w:r>
+      <w:bookmarkEnd w:id="15"/>
+    </w:p>
+    <w:p>
+      <w:pPr>
+        <w:spacing w:after="120"/>
+      </w:pPr>
+      <w:r>
+        <w:rPr>
+          <w:rFonts w:ascii="Calibri" w:cs="Calibri" w:eastAsia="Calibri" w:hAnsi="Calibri"/>
+          <w:b/>
+          <w:bCs/>
+          <w:color w:val="1F4E79"/>
+          <w:sz w:val="26"/>
+          <w:szCs w:val="26"/>
+        </w:rPr>
+        <w:t xml:space="preserve">Sequence — processor restart</w:t>
+      </w:r>
+    </w:p>
+    <w:p>
+      <w:pPr>
+        <w:jc w:val="center"/>
+      </w:pPr>
+      <w:r>
+        <w:drawing>
+          <wp:inline distT="0" distB="0" distL="0" distR="0">
+            <wp:extent cx="7867650" cy="5229225"/>
+            <wp:effectExtent t="0" r="0" b="0" l="0"/>
+            <wp:docPr id="7" name="Sequence — processor restart" descr="Sequence — processor restart" title="Sequence — processor restart"/>
+            <wp:cNvGraphicFramePr>
+              <a:graphicFrameLocks xmlns:a="http://schemas.openxmlformats.org/drawingml/2006/main" noChangeAspect="1"/>
+            </wp:cNvGraphicFramePr>
+            <a:graphic xmlns:a="http://schemas.openxmlformats.org/drawingml/2006/main">
+              <a:graphicData uri="http://schemas.openxmlformats.org/drawingml/2006/picture">
+                <pic:pic xmlns:pic="http://schemas.openxmlformats.org/drawingml/2006/picture">
+                  <pic:nvPicPr>
+                    <pic:cNvPr id="0" name="" descr=""/>
+                    <pic:cNvPicPr>
+                      <a:picLocks noChangeAspect="1" noChangeArrowheads="1"/>
+                    </pic:cNvPicPr>
+                  </pic:nvPicPr>
+                  <pic:blipFill>
+                    <a:blip r:embed="rId36" cstate="none"/>
+                    <a:srcRect/>
+                    <a:stretch>
+                      <a:fillRect/>
+                    </a:stretch>
+                  </pic:blipFill>
+                  <pic:spPr bwMode="auto">
+                    <a:xfrm>
+                      <a:off x="0" y="0"/>
+                      <a:ext cx="7867650" cy="5229225"/>
+                    </a:xfrm>
+                    <a:prstGeom prst="rect">
+                      <a:avLst/>
+                    </a:prstGeom>
+                  </pic:spPr>
+                </pic:pic>
+              </a:graphicData>
+            </a:graphic>
+          </wp:inline>
+        </w:drawing>
+      </w:r>
+    </w:p>
+    <w:p>
+      <w:pPr>
+        <w:spacing w:before="80"/>
+        <w:jc w:val="center"/>
+        <w:sectPr>
+          <w:footerReference w:type="default" r:id="rId18"/>
+          <w:pgSz w:w="16838" w:h="11906" w:orient="landscape"/>
+          <w:pgMar w:top="1134" w:right="1134" w:bottom="1134" w:left="1134" w:header="708" w:footer="708" w:gutter="0"/>
+          <w:pgNumType/>
+          <w:docGrid w:linePitch="360"/>
+        </w:sectPr>
+      </w:pPr>
+      <w:r>
+        <w:rPr>
+          <w:rFonts w:ascii="Calibri" w:cs="Calibri" w:eastAsia="Calibri" w:hAnsi="Calibri"/>
+          <w:i/>
+          <w:iCs/>
+          <w:color w:val="808080"/>
+          <w:sz w:val="16"/>
+          <w:szCs w:val="16"/>
+        </w:rPr>
+        <w:t xml:space="preserve">draw.io page </w:t>
+      </w:r>
+      <w:r>
+        <w:rPr>
+          <w:rFonts w:ascii="Calibri" w:cs="Calibri" w:eastAsia="Calibri" w:hAnsi="Calibri"/>
+          <w:b/>
+          <w:bCs/>
+          <w:i/>
+          <w:iCs/>
+          <w:color w:val="808080"/>
+          <w:sz w:val="16"/>
+          <w:szCs w:val="16"/>
+        </w:rPr>
+        <w:t xml:space="preserve">5b. Sequence — Processor Restart</w:t>
+      </w:r>
+      <w:r>
+        <w:rPr>
+          <w:rFonts w:ascii="Calibri" w:cs="Calibri" w:eastAsia="Calibri" w:hAnsi="Calibri"/>
+          <w:i/>
+          <w:iCs/>
+          <w:color w:val="808080"/>
+          <w:sz w:val="16"/>
+          <w:szCs w:val="16"/>
+        </w:rPr>
+        <w:t xml:space="preserve"> · editable source: docs/hld/diagrams/ta9-hld.drawio</w:t>
+      </w:r>
+    </w:p>
+    <w:p>
+      <w:pPr>
+        <w:pStyle w:val="Heading2"/>
+        <w:sectPr>
+          <w:footerReference w:type="default" r:id="rId19"/>
+          <w:pgSz w:w="11906" w:h="16838" w:orient="portrait"/>
+          <w:pgMar w:top="1134" w:right="1134" w:bottom="1134" w:left="1134" w:header="708" w:footer="708" w:gutter="0"/>
+          <w:pgNumType/>
+          <w:docGrid w:linePitch="360"/>
+        </w:sectPr>
+      </w:pPr>
+      <w:bookmarkStart w:name="_Toc16" w:id="16"/>
+      <w:r>
+        <w:rPr>
+          <w:rFonts w:ascii="Calibri" w:cs="Calibri" w:eastAsia="Calibri" w:hAnsi="Calibri"/>
+        </w:rPr>
+        <w:t xml:space="preserve">8.3 WebSocket disconnect, reconnect and replay</w:t>
+      </w:r>
+      <w:bookmarkEnd w:id="16"/>
+    </w:p>
+    <w:p>
+      <w:pPr>
+        <w:spacing w:after="120"/>
+      </w:pPr>
+      <w:r>
+        <w:rPr>
+          <w:rFonts w:ascii="Calibri" w:cs="Calibri" w:eastAsia="Calibri" w:hAnsi="Calibri"/>
+          <w:b/>
+          <w:bCs/>
+          <w:color w:val="1F4E79"/>
+          <w:sz w:val="26"/>
+          <w:szCs w:val="26"/>
+        </w:rPr>
+        <w:t xml:space="preserve">Sequence — WebSocket reconnect</w:t>
+      </w:r>
+    </w:p>
+    <w:p>
+      <w:pPr>
+        <w:jc w:val="center"/>
+      </w:pPr>
+      <w:r>
+        <w:drawing>
+          <wp:inline distT="0" distB="0" distL="0" distR="0">
+            <wp:extent cx="7029450" cy="5229225"/>
+            <wp:effectExtent t="0" r="0" b="0" l="0"/>
+            <wp:docPr id="8" name="Sequence — WebSocket reconnect" descr="Sequence — WebSocket reconnect" title="Sequence — WebSocket reconnect"/>
+            <wp:cNvGraphicFramePr>
+              <a:graphicFrameLocks xmlns:a="http://schemas.openxmlformats.org/drawingml/2006/main" noChangeAspect="1"/>
+            </wp:cNvGraphicFramePr>
+            <a:graphic xmlns:a="http://schemas.openxmlformats.org/drawingml/2006/main">
+              <a:graphicData uri="http://schemas.openxmlformats.org/drawingml/2006/picture">
+                <pic:pic xmlns:pic="http://schemas.openxmlformats.org/drawingml/2006/picture">
+                  <pic:nvPicPr>
+                    <pic:cNvPr id="0" name="" descr=""/>
+                    <pic:cNvPicPr>
+                      <a:picLocks noChangeAspect="1" noChangeArrowheads="1"/>
+                    </pic:cNvPicPr>
+                  </pic:nvPicPr>
+                  <pic:blipFill>
+                    <a:blip r:embed="rId37" cstate="none"/>
+                    <a:srcRect/>
+                    <a:stretch>
+                      <a:fillRect/>
+                    </a:stretch>
+                  </pic:blipFill>
+                  <pic:spPr bwMode="auto">
+                    <a:xfrm>
+                      <a:off x="0" y="0"/>
                       <a:ext cx="7029450" cy="5229225"/>
                     </a:xfrm>
                     <a:prstGeom prst="rect">
@@ -8750,7 +8843,7 @@
                     </pic:cNvPicPr>
                   </pic:nvPicPr>
                   <pic:blipFill>
-                    <a:blip r:embed="rId36" cstate="none"/>
+                    <a:blip r:embed="rId38" cstate="none"/>
                     <a:srcRect/>
                     <a:stretch>
                       <a:fillRect/>
@@ -9617,7 +9710,7 @@
                     </pic:cNvPicPr>
                   </pic:nvPicPr>
                   <pic:blipFill>
-                    <a:blip r:embed="rId37" cstate="none"/>
+                    <a:blip r:embed="rId39" cstate="none"/>
                     <a:srcRect/>
                     <a:stretch>
                       <a:fillRect/>
@@ -10031,6 +10124,149 @@
         <w:t xml:space="preserve">11. Risks, limitations and future work</w:t>
       </w:r>
       <w:bookmarkEnd w:id="24"/>
+    </w:p>
+    <w:p>
+      <w:pPr>
+        <w:spacing w:after="120"/>
+        <w:sectPr>
+          <w:footerReference w:type="default" r:id="rId25"/>
+          <w:pgSz w:w="11906" w:h="16838" w:orient="portrait"/>
+          <w:pgMar w:top="1134" w:right="1134" w:bottom="1134" w:left="1134" w:header="708" w:footer="708" w:gutter="0"/>
+          <w:pgNumType/>
+          <w:docGrid w:linePitch="360"/>
+        </w:sectPr>
+      </w:pPr>
+      <w:r>
+        <w:rPr>
+          <w:rFonts w:ascii="Calibri" w:cs="Calibri" w:eastAsia="Calibri" w:hAnsi="Calibri"/>
+        </w:rPr>
+        <w:t xml:space="preserve">The complete list, grouped by area with IDs, and a prioritized production roadmap: </w:t>
+      </w:r>
+      <w:r>
+        <w:rPr>
+          <w:rFonts w:ascii="Consolas" w:cs="Consolas" w:eastAsia="Consolas" w:hAnsi="Consolas"/>
+          <w:color w:val="5B2C6F"/>
+          <w:sz w:val="19"/>
+          <w:szCs w:val="19"/>
+          <w:u w:val="single"/>
+        </w:rPr>
+        <w:t xml:space="preserve">../limitations/LIMITATIONS.md</w:t>
+      </w:r>
+      <w:r>
+        <w:rPr>
+          <w:rFonts w:ascii="Calibri" w:cs="Calibri" w:eastAsia="Calibri" w:hAnsi="Calibri"/>
+        </w:rPr>
+        <w:t xml:space="preserve">. The table below keeps the main risks.</w:t>
+      </w:r>
+    </w:p>
+    <w:p>
+      <w:pPr>
+        <w:spacing w:after="120"/>
+      </w:pPr>
+      <w:r>
+        <w:rPr>
+          <w:rFonts w:ascii="Calibri" w:cs="Calibri" w:eastAsia="Calibri" w:hAnsi="Calibri"/>
+          <w:b/>
+          <w:bCs/>
+          <w:color w:val="1F4E79"/>
+          <w:sz w:val="26"/>
+          <w:szCs w:val="26"/>
+        </w:rPr>
+        <w:t xml:space="preserve">Production architecture — today vs proposed</w:t>
+      </w:r>
+    </w:p>
+    <w:p>
+      <w:pPr>
+        <w:jc w:val="center"/>
+      </w:pPr>
+      <w:r>
+        <w:drawing>
+          <wp:inline distT="0" distB="0" distL="0" distR="0">
+            <wp:extent cx="9248775" cy="4286250"/>
+            <wp:effectExtent t="0" r="0" b="0" l="0"/>
+            <wp:docPr id="11" name="Production architecture — today vs proposed" descr="Production architecture — today vs proposed" title="Production architecture — today vs proposed"/>
+            <wp:cNvGraphicFramePr>
+              <a:graphicFrameLocks xmlns:a="http://schemas.openxmlformats.org/drawingml/2006/main" noChangeAspect="1"/>
+            </wp:cNvGraphicFramePr>
+            <a:graphic xmlns:a="http://schemas.openxmlformats.org/drawingml/2006/main">
+              <a:graphicData uri="http://schemas.openxmlformats.org/drawingml/2006/picture">
+                <pic:pic xmlns:pic="http://schemas.openxmlformats.org/drawingml/2006/picture">
+                  <pic:nvPicPr>
+                    <pic:cNvPr id="0" name="" descr=""/>
+                    <pic:cNvPicPr>
+                      <a:picLocks noChangeAspect="1" noChangeArrowheads="1"/>
+                    </pic:cNvPicPr>
+                  </pic:nvPicPr>
+                  <pic:blipFill>
+                    <a:blip r:embed="rId40" cstate="none"/>
+                    <a:srcRect/>
+                    <a:stretch>
+                      <a:fillRect/>
+                    </a:stretch>
+                  </pic:blipFill>
+                  <pic:spPr bwMode="auto">
+                    <a:xfrm>
+                      <a:off x="0" y="0"/>
+                      <a:ext cx="9248775" cy="4286250"/>
+                    </a:xfrm>
+                    <a:prstGeom prst="rect">
+                      <a:avLst/>
+                    </a:prstGeom>
+                  </pic:spPr>
+                </pic:pic>
+              </a:graphicData>
+            </a:graphic>
+          </wp:inline>
+        </w:drawing>
+      </w:r>
+    </w:p>
+    <w:p>
+      <w:pPr>
+        <w:spacing w:before="80"/>
+        <w:jc w:val="center"/>
+        <w:sectPr>
+          <w:footerReference w:type="default" r:id="rId26"/>
+          <w:pgSz w:w="16838" w:h="11906" w:orient="landscape"/>
+          <w:pgMar w:top="1134" w:right="1134" w:bottom="1134" w:left="1134" w:header="708" w:footer="708" w:gutter="0"/>
+          <w:pgNumType/>
+          <w:docGrid w:linePitch="360"/>
+        </w:sectPr>
+      </w:pPr>
+      <w:r>
+        <w:rPr>
+          <w:rFonts w:ascii="Calibri" w:cs="Calibri" w:eastAsia="Calibri" w:hAnsi="Calibri"/>
+          <w:i/>
+          <w:iCs/>
+          <w:color w:val="808080"/>
+          <w:sz w:val="16"/>
+          <w:szCs w:val="16"/>
+        </w:rPr>
+        <w:t xml:space="preserve">draw.io page </w:t>
+      </w:r>
+      <w:r>
+        <w:rPr>
+          <w:rFonts w:ascii="Calibri" w:cs="Calibri" w:eastAsia="Calibri" w:hAnsi="Calibri"/>
+          <w:b/>
+          <w:bCs/>
+          <w:i/>
+          <w:iCs/>
+          <w:color w:val="808080"/>
+          <w:sz w:val="16"/>
+          <w:szCs w:val="16"/>
+        </w:rPr>
+        <w:t xml:space="preserve">12. Production Architecture</w:t>
+      </w:r>
+      <w:r>
+        <w:rPr>
+          <w:rFonts w:ascii="Calibri" w:cs="Calibri" w:eastAsia="Calibri" w:hAnsi="Calibri"/>
+          <w:i/>
+          <w:iCs/>
+          <w:color w:val="808080"/>
+          <w:sz w:val="16"/>
+          <w:szCs w:val="16"/>
+        </w:rPr>
+        <w:t xml:space="preserve"> · editable source: docs/hld/diagrams/ta9-hld.drawio</w:t>
+      </w:r>
     </w:p>
     <w:tbl>
       <w:tblPr>
@@ -10749,7 +10985,7 @@
       </w:pPr>
     </w:p>
     <w:sectPr>
-      <w:footerReference w:type="default" r:id="rId25"/>
+      <w:footerReference w:type="default" r:id="rId27"/>
       <w:pgSz w:w="11906" w:h="16838" w:orient="portrait"/>
       <w:pgMar w:top="1134" w:right="1134" w:bottom="1134" w:left="1134" w:header="708" w:footer="708" w:gutter="0"/>
       <w:pgNumType/>
@@ -11997,6 +12233,206 @@
 </file>
 
 <file path=word/footer20.xml><?xml version="1.0" encoding="utf-8"?>
+<w:ftr xmlns:wpc="http://schemas.microsoft.com/office/word/2010/wordprocessingCanvas" xmlns:mc="http://schemas.openxmlformats.org/markup-compatibility/2006" xmlns:o="urn:schemas-microsoft-com:office:office" xmlns:r="http://schemas.openxmlformats.org/officeDocument/2006/relationships" xmlns:m="http://schemas.openxmlformats.org/officeDocument/2006/math" xmlns:v="urn:schemas-microsoft-com:vml" xmlns:wp14="http://schemas.microsoft.com/office/word/2010/wordprocessingDrawing" xmlns:wp="http://schemas.openxmlformats.org/drawingml/2006/wordprocessingDrawing" xmlns:w10="urn:schemas-microsoft-com:office:word" xmlns:w="http://schemas.openxmlformats.org/wordprocessingml/2006/main" xmlns:w14="http://schemas.microsoft.com/office/word/2010/wordml" xmlns:w15="http://schemas.microsoft.com/office/word/2012/wordml" xmlns:wpg="http://schemas.microsoft.com/office/word/2010/wordprocessingGroup" xmlns:wpi="http://schemas.microsoft.com/office/word/2010/wordprocessingInk" xmlns:wne="http://schemas.microsoft.com/office/word/2006/wordml" xmlns:wps="http://schemas.microsoft.com/office/word/2010/wordprocessingShape">
+  <w:p>
+    <w:pPr>
+      <w:jc w:val="center"/>
+    </w:pPr>
+    <w:r>
+      <w:rPr>
+        <w:rFonts w:ascii="Calibri" w:cs="Calibri" w:eastAsia="Calibri" w:hAnsi="Calibri"/>
+        <w:color w:val="808080"/>
+        <w:sz w:val="16"/>
+        <w:szCs w:val="16"/>
+      </w:rPr>
+      <w:t xml:space="preserve">TA9 Document Processing — High-Level Design   ·   Page </w:t>
+    </w:r>
+    <w:r>
+      <w:rPr>
+        <w:rFonts w:ascii="Calibri" w:cs="Calibri" w:eastAsia="Calibri" w:hAnsi="Calibri"/>
+        <w:color w:val="808080"/>
+        <w:sz w:val="16"/>
+        <w:szCs w:val="16"/>
+      </w:rPr>
+      <w:fldChar w:fldCharType="begin"/>
+    </w:r>
+    <w:r>
+      <w:rPr>
+        <w:rFonts w:ascii="Calibri" w:cs="Calibri" w:eastAsia="Calibri" w:hAnsi="Calibri"/>
+        <w:color w:val="808080"/>
+        <w:sz w:val="16"/>
+        <w:szCs w:val="16"/>
+      </w:rPr>
+      <w:instrText xml:space="preserve">PAGE</w:instrText>
+    </w:r>
+    <w:r>
+      <w:rPr>
+        <w:rFonts w:ascii="Calibri" w:cs="Calibri" w:eastAsia="Calibri" w:hAnsi="Calibri"/>
+        <w:color w:val="808080"/>
+        <w:sz w:val="16"/>
+        <w:szCs w:val="16"/>
+      </w:rPr>
+      <w:fldChar w:fldCharType="separate"/>
+    </w:r>
+    <w:r>
+      <w:rPr>
+        <w:rFonts w:ascii="Calibri" w:cs="Calibri" w:eastAsia="Calibri" w:hAnsi="Calibri"/>
+        <w:color w:val="808080"/>
+        <w:sz w:val="16"/>
+        <w:szCs w:val="16"/>
+      </w:rPr>
+      <w:fldChar w:fldCharType="end"/>
+    </w:r>
+    <w:r>
+      <w:rPr>
+        <w:rFonts w:ascii="Calibri" w:cs="Calibri" w:eastAsia="Calibri" w:hAnsi="Calibri"/>
+        <w:color w:val="808080"/>
+        <w:sz w:val="16"/>
+        <w:szCs w:val="16"/>
+      </w:rPr>
+      <w:t xml:space="preserve"> of </w:t>
+    </w:r>
+    <w:r>
+      <w:rPr>
+        <w:rFonts w:ascii="Calibri" w:cs="Calibri" w:eastAsia="Calibri" w:hAnsi="Calibri"/>
+        <w:color w:val="808080"/>
+        <w:sz w:val="16"/>
+        <w:szCs w:val="16"/>
+      </w:rPr>
+      <w:fldChar w:fldCharType="begin"/>
+    </w:r>
+    <w:r>
+      <w:rPr>
+        <w:rFonts w:ascii="Calibri" w:cs="Calibri" w:eastAsia="Calibri" w:hAnsi="Calibri"/>
+        <w:color w:val="808080"/>
+        <w:sz w:val="16"/>
+        <w:szCs w:val="16"/>
+      </w:rPr>
+      <w:instrText xml:space="preserve">NUMPAGES</w:instrText>
+    </w:r>
+    <w:r>
+      <w:rPr>
+        <w:rFonts w:ascii="Calibri" w:cs="Calibri" w:eastAsia="Calibri" w:hAnsi="Calibri"/>
+        <w:color w:val="808080"/>
+        <w:sz w:val="16"/>
+        <w:szCs w:val="16"/>
+      </w:rPr>
+      <w:fldChar w:fldCharType="separate"/>
+    </w:r>
+    <w:r>
+      <w:rPr>
+        <w:rFonts w:ascii="Calibri" w:cs="Calibri" w:eastAsia="Calibri" w:hAnsi="Calibri"/>
+        <w:color w:val="808080"/>
+        <w:sz w:val="16"/>
+        <w:szCs w:val="16"/>
+      </w:rPr>
+      <w:fldChar w:fldCharType="end"/>
+    </w:r>
+  </w:p>
+</w:ftr>
+</file>
+
+<file path=word/footer21.xml><?xml version="1.0" encoding="utf-8"?>
+<w:ftr xmlns:wpc="http://schemas.microsoft.com/office/word/2010/wordprocessingCanvas" xmlns:mc="http://schemas.openxmlformats.org/markup-compatibility/2006" xmlns:o="urn:schemas-microsoft-com:office:office" xmlns:r="http://schemas.openxmlformats.org/officeDocument/2006/relationships" xmlns:m="http://schemas.openxmlformats.org/officeDocument/2006/math" xmlns:v="urn:schemas-microsoft-com:vml" xmlns:wp14="http://schemas.microsoft.com/office/word/2010/wordprocessingDrawing" xmlns:wp="http://schemas.openxmlformats.org/drawingml/2006/wordprocessingDrawing" xmlns:w10="urn:schemas-microsoft-com:office:word" xmlns:w="http://schemas.openxmlformats.org/wordprocessingml/2006/main" xmlns:w14="http://schemas.microsoft.com/office/word/2010/wordml" xmlns:w15="http://schemas.microsoft.com/office/word/2012/wordml" xmlns:wpg="http://schemas.microsoft.com/office/word/2010/wordprocessingGroup" xmlns:wpi="http://schemas.microsoft.com/office/word/2010/wordprocessingInk" xmlns:wne="http://schemas.microsoft.com/office/word/2006/wordml" xmlns:wps="http://schemas.microsoft.com/office/word/2010/wordprocessingShape">
+  <w:p>
+    <w:pPr>
+      <w:jc w:val="center"/>
+    </w:pPr>
+    <w:r>
+      <w:rPr>
+        <w:rFonts w:ascii="Calibri" w:cs="Calibri" w:eastAsia="Calibri" w:hAnsi="Calibri"/>
+        <w:color w:val="808080"/>
+        <w:sz w:val="16"/>
+        <w:szCs w:val="16"/>
+      </w:rPr>
+      <w:t xml:space="preserve">TA9 Document Processing — High-Level Design   ·   Page </w:t>
+    </w:r>
+    <w:r>
+      <w:rPr>
+        <w:rFonts w:ascii="Calibri" w:cs="Calibri" w:eastAsia="Calibri" w:hAnsi="Calibri"/>
+        <w:color w:val="808080"/>
+        <w:sz w:val="16"/>
+        <w:szCs w:val="16"/>
+      </w:rPr>
+      <w:fldChar w:fldCharType="begin"/>
+    </w:r>
+    <w:r>
+      <w:rPr>
+        <w:rFonts w:ascii="Calibri" w:cs="Calibri" w:eastAsia="Calibri" w:hAnsi="Calibri"/>
+        <w:color w:val="808080"/>
+        <w:sz w:val="16"/>
+        <w:szCs w:val="16"/>
+      </w:rPr>
+      <w:instrText xml:space="preserve">PAGE</w:instrText>
+    </w:r>
+    <w:r>
+      <w:rPr>
+        <w:rFonts w:ascii="Calibri" w:cs="Calibri" w:eastAsia="Calibri" w:hAnsi="Calibri"/>
+        <w:color w:val="808080"/>
+        <w:sz w:val="16"/>
+        <w:szCs w:val="16"/>
+      </w:rPr>
+      <w:fldChar w:fldCharType="separate"/>
+    </w:r>
+    <w:r>
+      <w:rPr>
+        <w:rFonts w:ascii="Calibri" w:cs="Calibri" w:eastAsia="Calibri" w:hAnsi="Calibri"/>
+        <w:color w:val="808080"/>
+        <w:sz w:val="16"/>
+        <w:szCs w:val="16"/>
+      </w:rPr>
+      <w:fldChar w:fldCharType="end"/>
+    </w:r>
+    <w:r>
+      <w:rPr>
+        <w:rFonts w:ascii="Calibri" w:cs="Calibri" w:eastAsia="Calibri" w:hAnsi="Calibri"/>
+        <w:color w:val="808080"/>
+        <w:sz w:val="16"/>
+        <w:szCs w:val="16"/>
+      </w:rPr>
+      <w:t xml:space="preserve"> of </w:t>
+    </w:r>
+    <w:r>
+      <w:rPr>
+        <w:rFonts w:ascii="Calibri" w:cs="Calibri" w:eastAsia="Calibri" w:hAnsi="Calibri"/>
+        <w:color w:val="808080"/>
+        <w:sz w:val="16"/>
+        <w:szCs w:val="16"/>
+      </w:rPr>
+      <w:fldChar w:fldCharType="begin"/>
+    </w:r>
+    <w:r>
+      <w:rPr>
+        <w:rFonts w:ascii="Calibri" w:cs="Calibri" w:eastAsia="Calibri" w:hAnsi="Calibri"/>
+        <w:color w:val="808080"/>
+        <w:sz w:val="16"/>
+        <w:szCs w:val="16"/>
+      </w:rPr>
+      <w:instrText xml:space="preserve">NUMPAGES</w:instrText>
+    </w:r>
+    <w:r>
+      <w:rPr>
+        <w:rFonts w:ascii="Calibri" w:cs="Calibri" w:eastAsia="Calibri" w:hAnsi="Calibri"/>
+        <w:color w:val="808080"/>
+        <w:sz w:val="16"/>
+        <w:szCs w:val="16"/>
+      </w:rPr>
+      <w:fldChar w:fldCharType="separate"/>
+    </w:r>
+    <w:r>
+      <w:rPr>
+        <w:rFonts w:ascii="Calibri" w:cs="Calibri" w:eastAsia="Calibri" w:hAnsi="Calibri"/>
+        <w:color w:val="808080"/>
+        <w:sz w:val="16"/>
+        <w:szCs w:val="16"/>
+      </w:rPr>
+      <w:fldChar w:fldCharType="end"/>
+    </w:r>
+  </w:p>
+</w:ftr>
+</file>
+
+<file path=word/footer22.xml><?xml version="1.0" encoding="utf-8"?>
 <w:ftr xmlns:wpc="http://schemas.microsoft.com/office/word/2010/wordprocessingCanvas" xmlns:mc="http://schemas.openxmlformats.org/markup-compatibility/2006" xmlns:o="urn:schemas-microsoft-com:office:office" xmlns:r="http://schemas.openxmlformats.org/officeDocument/2006/relationships" xmlns:m="http://schemas.openxmlformats.org/officeDocument/2006/math" xmlns:v="urn:schemas-microsoft-com:vml" xmlns:wp14="http://schemas.microsoft.com/office/word/2010/wordprocessingDrawing" xmlns:wp="http://schemas.openxmlformats.org/drawingml/2006/wordprocessingDrawing" xmlns:w10="urn:schemas-microsoft-com:office:word" xmlns:w="http://schemas.openxmlformats.org/wordprocessingml/2006/main" xmlns:w14="http://schemas.microsoft.com/office/word/2010/wordml" xmlns:w15="http://schemas.microsoft.com/office/word/2012/wordml" xmlns:wpg="http://schemas.microsoft.com/office/word/2010/wordprocessingGroup" xmlns:wpi="http://schemas.microsoft.com/office/word/2010/wordprocessingInk" xmlns:wne="http://schemas.microsoft.com/office/word/2006/wordml" xmlns:wps="http://schemas.microsoft.com/office/word/2010/wordprocessingShape">
   <w:p>
     <w:pPr>

</xml_diff>

<commit_message>
docs: User Guide (Web UI, Swagger, Postman) with screenshots
- What the system does, job statuses, limits; choosing between Web UI, Swagger and Postman
- Web UI step by step (create, follow live, results, audit, list); Swagger and Postman walkthroughs;
  error responses; everyday scenarios; FAQ
- Screenshots cropped to the application (no browser chrome); md2docx keeps screenshots inline and
  gives only diagrams their own page
- Linked from README, Installation Guide and HLD

Co-Authored-By: Claude Opus 5.5 <noreply@anthropic.com>
</commit_message>
<xml_diff>
--- a/docs/hld/TA9-HLD.docx
+++ b/docs/hld/TA9-HLD.docx
@@ -302,7 +302,7 @@
               </w:rPr>
               <w:t xml:space="preserve"> (one page per diagram). Open with </w:t>
             </w:r>
-            <w:hyperlink w:history="1" r:id="rId5wmnghepx19wm42filtgf">
+            <w:hyperlink w:history="1" r:id="rIdbsa1kwskmcvchzu4nd02g">
               <w:r>
                 <w:rPr>
                   <w:rFonts w:ascii="Calibri" w:cs="Calibri" w:eastAsia="Calibri" w:hAnsi="Calibri"/>
@@ -588,6 +588,41 @@
                 <w:szCs w:val="16"/>
               </w:rPr>
               <w:t xml:space="preserve">../limitations</w:t>
+            </w:r>
+            <w:r>
+              <w:rPr>
+                <w:rFonts w:ascii="Calibri" w:cs="Calibri" w:eastAsia="Calibri" w:hAnsi="Calibri"/>
+                <w:sz w:val="18"/>
+                <w:szCs w:val="18"/>
+              </w:rPr>
+              <w:t xml:space="preserve">), </w:t>
+            </w:r>
+            <w:r>
+              <w:rPr>
+                <w:rFonts w:ascii="Calibri" w:cs="Calibri" w:eastAsia="Calibri" w:hAnsi="Calibri"/>
+                <w:b/>
+                <w:bCs/>
+                <w:sz w:val="18"/>
+                <w:szCs w:val="18"/>
+              </w:rPr>
+              <w:t xml:space="preserve">User Guide</w:t>
+            </w:r>
+            <w:r>
+              <w:rPr>
+                <w:rFonts w:ascii="Calibri" w:cs="Calibri" w:eastAsia="Calibri" w:hAnsi="Calibri"/>
+                <w:sz w:val="18"/>
+                <w:szCs w:val="18"/>
+              </w:rPr>
+              <w:t xml:space="preserve"> (</w:t>
+            </w:r>
+            <w:r>
+              <w:rPr>
+                <w:rFonts w:ascii="Consolas" w:cs="Consolas" w:eastAsia="Consolas" w:hAnsi="Consolas"/>
+                <w:color w:val="5B2C6F"/>
+                <w:sz w:val="16"/>
+                <w:szCs w:val="16"/>
+              </w:rPr>
+              <w:t xml:space="preserve">../user-guide</w:t>
             </w:r>
             <w:r>
               <w:rPr>

</xml_diff>